<commit_message>
Force GPS Auto-Detect to strictly return English text and reject regional scripts
</commit_message>
<xml_diff>
--- a/src/templates/2. Annexure- I_Proforma-A.docx
+++ b/src/templates/2. Annexure- I_Proforma-A.docx
@@ -159,82 +159,17 @@
         </w:numPr>
         <w:spacing w:after="218" w:line="265" w:lineRule="auto"/>
         <w:ind w:right="1607" w:hanging="360"/>
-      </w:pPr>
-      <w:r>
-        <w:rPr>
-          <w:rFonts w:ascii="Arial" w:eastAsia="Arial" w:hAnsi="Arial" w:cs="Arial"/>
-          <w:color w:val="545454"/>
-          <w:sz w:val="15"/>
-        </w:rPr>
-        <w:t>Name of the Consumer</w:t>
-      </w:r>
-      <w:r>
-        <w:rPr>
-          <w:rFonts w:ascii="Arial" w:eastAsia="Arial" w:hAnsi="Arial" w:cs="Arial"/>
-          <w:sz w:val="15"/>
-        </w:rPr>
-        <w:t xml:space="preserve"> </w:t>
-      </w:r>
-      <w:r>
-        <w:rPr>
-          <w:rFonts w:ascii="Arial" w:eastAsia="Arial" w:hAnsi="Arial" w:cs="Arial"/>
-          <w:sz w:val="15"/>
-        </w:rPr>
-        <w:t xml:space="preserve">            </w:t>
-      </w:r>
-      <w:r>
-        <w:rPr>
-          <w:rFonts w:ascii="Arial" w:eastAsia="Arial" w:hAnsi="Arial" w:cs="Arial"/>
-          <w:sz w:val="15"/>
-        </w:rPr>
-        <w:t xml:space="preserve">                                                       </w:t>
-      </w:r>
-      <w:proofErr w:type="gramStart"/>
-      <w:r>
-        <w:rPr>
-          <w:rFonts w:ascii="Arial" w:eastAsia="Arial" w:hAnsi="Arial" w:cs="Arial"/>
-          <w:sz w:val="15"/>
-        </w:rPr>
-        <w:t xml:space="preserve">   </w:t>
-      </w:r>
-      <w:r>
-        <w:rPr>
-          <w:rFonts w:ascii="Arial" w:eastAsia="Arial" w:hAnsi="Arial" w:cs="Arial"/>
-          <w:sz w:val="15"/>
-        </w:rPr>
-        <w:t>{</w:t>
-      </w:r>
-      <w:proofErr w:type="gramEnd"/>
-      <w:r>
-        <w:rPr>
-          <w:rFonts w:ascii="Arial" w:eastAsia="Arial" w:hAnsi="Arial" w:cs="Arial"/>
-          <w:sz w:val="15"/>
-        </w:rPr>
-        <w:t>{</w:t>
-      </w:r>
-      <w:proofErr w:type="spellStart"/>
-      <w:r>
-        <w:rPr>
-          <w:rFonts w:ascii="Arial" w:eastAsia="Arial" w:hAnsi="Arial" w:cs="Arial"/>
-          <w:sz w:val="15"/>
-        </w:rPr>
-        <w:t>consumer_name</w:t>
-      </w:r>
-      <w:proofErr w:type="spellEnd"/>
-      <w:r>
-        <w:rPr>
-          <w:rFonts w:ascii="Arial" w:eastAsia="Arial" w:hAnsi="Arial" w:cs="Arial"/>
-          <w:sz w:val="15"/>
-        </w:rPr>
-        <w:t>}}</w:t>
-      </w:r>
-      <w:r>
-        <w:rPr>
-          <w:rFonts w:ascii="Arial" w:eastAsia="Arial" w:hAnsi="Arial" w:cs="Arial"/>
-          <w:sz w:val="15"/>
-        </w:rPr>
-        <w:tab/>
-      </w:r>
+        <w:rPr>
+          <w:rFonts w:ascii="Arial" w:eastAsia="Arial" w:hAnsi="Arial" w:cs="Arial"/>
+          <w:color w:val="545454"/>
+          <w:sz w:val="15"/>
+        </w:rPr>
+        <w:sectPr>
+          <w:pgSz w:w="11921" w:h="16860"/>
+          <w:pgMar w:top="567" w:right="1179" w:bottom="391" w:left="1179" w:header="720" w:footer="720" w:gutter="0"/>
+          <w:cols w:space="720"/>
+        </w:sectPr>
+      </w:pPr>
     </w:p>
     <w:p>
       <w:pPr>
@@ -248,85 +183,10 @@
       <w:r>
         <w:rPr>
           <w:rFonts w:ascii="Arial" w:eastAsia="Arial" w:hAnsi="Arial" w:cs="Arial"/>
-          <w:sz w:val="15"/>
-        </w:rPr>
-        <w:t xml:space="preserve"> </w:t>
-      </w:r>
-      <w:r>
-        <w:rPr>
-          <w:rFonts w:ascii="Arial" w:eastAsia="Arial" w:hAnsi="Arial" w:cs="Arial"/>
-          <w:color w:val="545454"/>
-          <w:sz w:val="15"/>
-        </w:rPr>
-        <w:t>Consumer Number</w:t>
-      </w:r>
-      <w:r>
-        <w:rPr>
-          <w:rFonts w:ascii="Arial" w:eastAsia="Arial" w:hAnsi="Arial" w:cs="Arial"/>
-          <w:color w:val="545454"/>
-          <w:sz w:val="15"/>
-        </w:rPr>
-        <w:t xml:space="preserve">                 </w:t>
-      </w:r>
-      <w:r>
-        <w:rPr>
-          <w:rFonts w:ascii="Arial" w:eastAsia="Arial" w:hAnsi="Arial" w:cs="Arial"/>
-          <w:color w:val="545454"/>
-          <w:sz w:val="15"/>
-        </w:rPr>
-        <w:t xml:space="preserve">                                                    </w:t>
-      </w:r>
-      <w:r>
-        <w:rPr>
-          <w:rFonts w:ascii="Arial" w:eastAsia="Arial" w:hAnsi="Arial" w:cs="Arial"/>
-          <w:color w:val="545454"/>
-          <w:sz w:val="15"/>
-        </w:rPr>
-        <w:t xml:space="preserve">    </w:t>
-      </w:r>
-      <w:proofErr w:type="gramStart"/>
-      <w:r>
-        <w:rPr>
-          <w:rFonts w:ascii="Arial" w:eastAsia="Arial" w:hAnsi="Arial" w:cs="Arial"/>
-          <w:color w:val="545454"/>
-          <w:sz w:val="15"/>
-        </w:rPr>
-        <w:t xml:space="preserve">   </w:t>
-      </w:r>
-      <w:r>
-        <w:rPr>
-          <w:rFonts w:ascii="Arial" w:eastAsia="Arial" w:hAnsi="Arial" w:cs="Arial"/>
-          <w:color w:val="000000" w:themeColor="text1"/>
-          <w:sz w:val="15"/>
-        </w:rPr>
-        <w:t>{</w:t>
-      </w:r>
-      <w:proofErr w:type="gramEnd"/>
-      <w:r>
-        <w:rPr>
-          <w:rFonts w:ascii="Arial" w:eastAsia="Arial" w:hAnsi="Arial" w:cs="Arial"/>
-          <w:color w:val="000000" w:themeColor="text1"/>
-          <w:sz w:val="15"/>
-        </w:rPr>
-        <w:t>{</w:t>
-      </w:r>
-      <w:proofErr w:type="spellStart"/>
-      <w:r>
-        <w:rPr>
-          <w:rFonts w:ascii="Arial" w:eastAsia="Arial" w:hAnsi="Arial" w:cs="Arial"/>
-          <w:color w:val="000000" w:themeColor="text1"/>
-          <w:sz w:val="15"/>
-        </w:rPr>
-        <w:t>consumer_number</w:t>
-      </w:r>
-      <w:proofErr w:type="spellEnd"/>
-      <w:r>
-        <w:rPr>
-          <w:rFonts w:ascii="Arial" w:eastAsia="Arial" w:hAnsi="Arial" w:cs="Arial"/>
-          <w:color w:val="000000" w:themeColor="text1"/>
-          <w:sz w:val="15"/>
-        </w:rPr>
-        <w:t>}}</w:t>
+          <w:color w:val="545454"/>
+          <w:sz w:val="15"/>
+        </w:rPr>
+        <w:t>Name of the Consumer</w:t>
       </w:r>
     </w:p>
     <w:p>
@@ -341,85 +201,43 @@
       <w:r>
         <w:rPr>
           <w:rFonts w:ascii="Arial" w:eastAsia="Arial" w:hAnsi="Arial" w:cs="Arial"/>
+          <w:sz w:val="15"/>
+        </w:rPr>
+        <w:t xml:space="preserve"> </w:t>
+      </w:r>
+      <w:r>
+        <w:rPr>
+          <w:rFonts w:ascii="Arial" w:eastAsia="Arial" w:hAnsi="Arial" w:cs="Arial"/>
+          <w:color w:val="545454"/>
+          <w:sz w:val="15"/>
+        </w:rPr>
+        <w:t>Consumer Number</w:t>
+      </w:r>
+      <w:r>
+        <w:rPr>
+          <w:rFonts w:ascii="Arial" w:eastAsia="Arial" w:hAnsi="Arial" w:cs="Arial"/>
+          <w:color w:val="545454"/>
+          <w:sz w:val="15"/>
+        </w:rPr>
+        <w:t xml:space="preserve">    </w:t>
+      </w:r>
+    </w:p>
+    <w:p>
+      <w:pPr>
+        <w:numPr>
+          <w:ilvl w:val="0"/>
+          <w:numId w:val="1"/>
+        </w:numPr>
+        <w:spacing w:after="218" w:line="265" w:lineRule="auto"/>
+        <w:ind w:right="1607" w:hanging="360"/>
+      </w:pPr>
+      <w:r>
+        <w:rPr>
+          <w:rFonts w:ascii="Arial" w:eastAsia="Arial" w:hAnsi="Arial" w:cs="Arial"/>
           <w:color w:val="545454"/>
           <w:sz w:val="15"/>
         </w:rPr>
         <w:t>Mobile Number</w:t>
-      </w:r>
-      <w:r>
-        <w:rPr>
-          <w:rFonts w:ascii="Arial" w:eastAsia="Arial" w:hAnsi="Arial" w:cs="Arial"/>
-          <w:sz w:val="15"/>
-        </w:rPr>
-        <w:t xml:space="preserve"> </w:t>
-      </w:r>
-      <w:r>
-        <w:rPr>
-          <w:rFonts w:ascii="Arial" w:eastAsia="Arial" w:hAnsi="Arial" w:cs="Arial"/>
-          <w:sz w:val="15"/>
-        </w:rPr>
-        <w:tab/>
-        <w:t xml:space="preserve"> </w:t>
-      </w:r>
-      <w:r>
-        <w:rPr>
-          <w:rFonts w:ascii="Arial" w:eastAsia="Arial" w:hAnsi="Arial" w:cs="Arial"/>
-          <w:sz w:val="15"/>
-        </w:rPr>
-        <w:t xml:space="preserve">               </w:t>
-      </w:r>
-      <w:r>
-        <w:rPr>
-          <w:rFonts w:ascii="Arial" w:eastAsia="Arial" w:hAnsi="Arial" w:cs="Arial"/>
-          <w:sz w:val="15"/>
-        </w:rPr>
-        <w:t xml:space="preserve">                                                     </w:t>
-      </w:r>
-      <w:proofErr w:type="gramStart"/>
-      <w:r>
-        <w:rPr>
-          <w:rFonts w:ascii="Arial" w:eastAsia="Arial" w:hAnsi="Arial" w:cs="Arial"/>
-          <w:sz w:val="15"/>
-        </w:rPr>
-        <w:t xml:space="preserve"> </w:t>
-      </w:r>
-      <w:r>
-        <w:rPr>
-          <w:rFonts w:ascii="Arial" w:eastAsia="Arial" w:hAnsi="Arial" w:cs="Arial"/>
-          <w:sz w:val="15"/>
-        </w:rPr>
-        <w:t xml:space="preserve">  </w:t>
-      </w:r>
-      <w:r>
-        <w:rPr>
-          <w:rFonts w:ascii="Arial" w:eastAsia="Arial" w:hAnsi="Arial" w:cs="Arial"/>
-          <w:sz w:val="15"/>
-        </w:rPr>
-        <w:t>{</w:t>
-      </w:r>
-      <w:proofErr w:type="gramEnd"/>
-      <w:r>
-        <w:rPr>
-          <w:rFonts w:ascii="Arial" w:eastAsia="Arial" w:hAnsi="Arial" w:cs="Arial"/>
-          <w:sz w:val="15"/>
-        </w:rPr>
-        <w:t>{</w:t>
-      </w:r>
-      <w:proofErr w:type="spellStart"/>
-      <w:r>
-        <w:rPr>
-          <w:rFonts w:ascii="Arial" w:eastAsia="Arial" w:hAnsi="Arial" w:cs="Arial"/>
-          <w:sz w:val="15"/>
-        </w:rPr>
-        <w:t>mobile_number</w:t>
-      </w:r>
-      <w:proofErr w:type="spellEnd"/>
-      <w:r>
-        <w:rPr>
-          <w:rFonts w:ascii="Arial" w:eastAsia="Arial" w:hAnsi="Arial" w:cs="Arial"/>
-          <w:sz w:val="15"/>
-        </w:rPr>
-        <w:t>}}</w:t>
       </w:r>
     </w:p>
     <w:p>
@@ -437,66 +255,15 @@
           <w:color w:val="545454"/>
           <w:sz w:val="15"/>
         </w:rPr>
-        <w:t>E-mail</w:t>
-      </w:r>
-      <w:r>
-        <w:rPr>
-          <w:rFonts w:ascii="Arial" w:eastAsia="Arial" w:hAnsi="Arial" w:cs="Arial"/>
-          <w:sz w:val="15"/>
-        </w:rPr>
-        <w:t xml:space="preserve"> </w:t>
-      </w:r>
-      <w:r>
-        <w:rPr>
-          <w:rFonts w:ascii="Arial" w:eastAsia="Arial" w:hAnsi="Arial" w:cs="Arial"/>
-          <w:sz w:val="15"/>
-        </w:rPr>
-        <w:tab/>
-        <w:t xml:space="preserve"> </w:t>
-      </w:r>
-      <w:r>
-        <w:rPr>
-          <w:rFonts w:ascii="Arial" w:eastAsia="Arial" w:hAnsi="Arial" w:cs="Arial"/>
-          <w:sz w:val="15"/>
-        </w:rPr>
-        <w:t xml:space="preserve">                               </w:t>
-      </w:r>
-      <w:r>
-        <w:rPr>
-          <w:rFonts w:ascii="Arial" w:eastAsia="Arial" w:hAnsi="Arial" w:cs="Arial"/>
-          <w:sz w:val="15"/>
-        </w:rPr>
-        <w:t xml:space="preserve">                                                      </w:t>
-      </w:r>
-      <w:proofErr w:type="gramStart"/>
-      <w:r>
-        <w:rPr>
-          <w:rFonts w:ascii="Arial" w:eastAsia="Arial" w:hAnsi="Arial" w:cs="Arial"/>
-          <w:sz w:val="15"/>
-        </w:rPr>
-        <w:t xml:space="preserve"> </w:t>
-      </w:r>
-      <w:r>
-        <w:rPr>
-          <w:rFonts w:ascii="Arial" w:eastAsia="Arial" w:hAnsi="Arial" w:cs="Arial"/>
-          <w:sz w:val="15"/>
-        </w:rPr>
-        <w:t xml:space="preserve">  </w:t>
-      </w:r>
-      <w:r>
-        <w:rPr>
-          <w:rFonts w:ascii="Arial" w:eastAsia="Arial" w:hAnsi="Arial" w:cs="Arial"/>
-          <w:sz w:val="15"/>
-        </w:rPr>
-        <w:t>{</w:t>
-      </w:r>
-      <w:proofErr w:type="gramEnd"/>
-      <w:r>
-        <w:rPr>
-          <w:rFonts w:ascii="Arial" w:eastAsia="Arial" w:hAnsi="Arial" w:cs="Arial"/>
-          <w:sz w:val="15"/>
-        </w:rPr>
-        <w:t>{email}}</w:t>
+        <w:t>E-mai</w:t>
+      </w:r>
+      <w:r>
+        <w:rPr>
+          <w:rFonts w:ascii="Arial" w:eastAsia="Arial" w:hAnsi="Arial" w:cs="Arial"/>
+          <w:color w:val="545454"/>
+          <w:sz w:val="15"/>
+        </w:rPr>
+        <w:t>l</w:t>
       </w:r>
     </w:p>
     <w:p>
@@ -514,51 +281,35 @@
           <w:color w:val="545454"/>
           <w:sz w:val="15"/>
         </w:rPr>
-        <w:t>Address of Installation</w:t>
-      </w:r>
-      <w:r>
-        <w:rPr>
-          <w:rFonts w:ascii="Arial" w:eastAsia="Arial" w:hAnsi="Arial" w:cs="Arial"/>
-          <w:sz w:val="15"/>
-        </w:rPr>
-        <w:t xml:space="preserve"> </w:t>
-      </w:r>
-      <w:r>
-        <w:rPr>
-          <w:rFonts w:ascii="Arial" w:eastAsia="Arial" w:hAnsi="Arial" w:cs="Arial"/>
-          <w:sz w:val="15"/>
-        </w:rPr>
-        <w:t xml:space="preserve">               </w:t>
-      </w:r>
-      <w:r>
-        <w:rPr>
-          <w:rFonts w:ascii="Arial" w:eastAsia="Arial" w:hAnsi="Arial" w:cs="Arial"/>
-          <w:sz w:val="15"/>
-        </w:rPr>
-        <w:t xml:space="preserve">                                                    </w:t>
-      </w:r>
-      <w:proofErr w:type="gramStart"/>
-      <w:r>
-        <w:rPr>
-          <w:rFonts w:ascii="Arial" w:eastAsia="Arial" w:hAnsi="Arial" w:cs="Arial"/>
-          <w:sz w:val="15"/>
-        </w:rPr>
-        <w:t xml:space="preserve">   </w:t>
-      </w:r>
-      <w:r>
-        <w:rPr>
-          <w:rFonts w:ascii="Arial" w:eastAsia="Arial" w:hAnsi="Arial" w:cs="Arial"/>
-          <w:sz w:val="15"/>
-        </w:rPr>
-        <w:t>{</w:t>
-      </w:r>
-      <w:proofErr w:type="gramEnd"/>
-      <w:r>
-        <w:rPr>
-          <w:rFonts w:ascii="Arial" w:eastAsia="Arial" w:hAnsi="Arial" w:cs="Arial"/>
-          <w:sz w:val="15"/>
-        </w:rPr>
-        <w:t>{address}}</w:t>
+        <w:t>Address of Installatio</w:t>
+      </w:r>
+      <w:r>
+        <w:rPr>
+          <w:rFonts w:ascii="Arial" w:eastAsia="Arial" w:hAnsi="Arial" w:cs="Arial"/>
+          <w:color w:val="545454"/>
+          <w:sz w:val="15"/>
+        </w:rPr>
+        <w:t>n</w:t>
+      </w:r>
+    </w:p>
+    <w:p>
+      <w:pPr>
+        <w:spacing w:after="75" w:line="265" w:lineRule="auto"/>
+        <w:ind w:left="688" w:right="1607"/>
+      </w:pPr>
+      <w:r>
+        <w:rPr>
+          <w:rFonts w:ascii="Arial" w:eastAsia="Arial" w:hAnsi="Arial" w:cs="Arial"/>
+          <w:sz w:val="15"/>
+        </w:rPr>
+        <w:t xml:space="preserve">          </w:t>
+      </w:r>
+      <w:r>
+        <w:rPr>
+          <w:rFonts w:ascii="Arial" w:eastAsia="Arial" w:hAnsi="Arial" w:cs="Arial"/>
+          <w:sz w:val="15"/>
+        </w:rPr>
+        <w:t xml:space="preserve">                                                       </w:t>
       </w:r>
     </w:p>
     <w:p>
@@ -576,29 +327,15 @@
           <w:color w:val="545454"/>
           <w:sz w:val="15"/>
         </w:rPr>
-        <w:t>RE Arrangement Type</w:t>
-      </w:r>
-      <w:r>
-        <w:rPr>
-          <w:rFonts w:ascii="Arial" w:eastAsia="Arial" w:hAnsi="Arial" w:cs="Arial"/>
-          <w:sz w:val="15"/>
-        </w:rPr>
-        <w:t xml:space="preserve"> </w:t>
-      </w:r>
-      <w:r>
-        <w:rPr>
-          <w:rFonts w:ascii="Arial" w:eastAsia="Arial" w:hAnsi="Arial" w:cs="Arial"/>
-          <w:sz w:val="15"/>
-        </w:rPr>
-        <w:tab/>
-      </w:r>
-      <w:r>
-        <w:rPr>
-          <w:rFonts w:ascii="Arial" w:eastAsia="Arial" w:hAnsi="Arial" w:cs="Arial"/>
-          <w:color w:val="545454"/>
-          <w:sz w:val="15"/>
-        </w:rPr>
-        <w:t>Net Metering Arrangement</w:t>
+        <w:t>RE Arrangement Typ</w:t>
+      </w:r>
+      <w:r>
+        <w:rPr>
+          <w:rFonts w:ascii="Arial" w:eastAsia="Arial" w:hAnsi="Arial" w:cs="Arial"/>
+          <w:color w:val="545454"/>
+          <w:sz w:val="15"/>
+        </w:rPr>
+        <w:t>e</w:t>
       </w:r>
       <w:r>
         <w:rPr>
@@ -625,74 +362,6 @@
         </w:rPr>
         <w:t>RE Source</w:t>
       </w:r>
-      <w:r>
-        <w:rPr>
-          <w:rFonts w:ascii="Arial" w:eastAsia="Arial" w:hAnsi="Arial" w:cs="Arial"/>
-          <w:sz w:val="15"/>
-        </w:rPr>
-        <w:t xml:space="preserve"> </w:t>
-      </w:r>
-      <w:r>
-        <w:rPr>
-          <w:rFonts w:ascii="Arial" w:eastAsia="Arial" w:hAnsi="Arial" w:cs="Arial"/>
-          <w:sz w:val="15"/>
-        </w:rPr>
-        <w:tab/>
-        <w:t xml:space="preserve"> </w:t>
-      </w:r>
-      <w:r>
-        <w:rPr>
-          <w:rFonts w:ascii="Arial" w:eastAsia="Arial" w:hAnsi="Arial" w:cs="Arial"/>
-          <w:sz w:val="15"/>
-        </w:rPr>
-        <w:t xml:space="preserve">                 </w:t>
-      </w:r>
-      <w:r>
-        <w:rPr>
-          <w:rFonts w:ascii="Arial" w:eastAsia="Arial" w:hAnsi="Arial" w:cs="Arial"/>
-          <w:sz w:val="15"/>
-        </w:rPr>
-        <w:t xml:space="preserve">                                                 </w:t>
-      </w:r>
-      <w:proofErr w:type="gramStart"/>
-      <w:r>
-        <w:rPr>
-          <w:rFonts w:ascii="Arial" w:eastAsia="Arial" w:hAnsi="Arial" w:cs="Arial"/>
-          <w:sz w:val="15"/>
-        </w:rPr>
-        <w:t xml:space="preserve">   </w:t>
-      </w:r>
-      <w:r>
-        <w:rPr>
-          <w:rFonts w:ascii="Arial" w:eastAsia="Arial" w:hAnsi="Arial" w:cs="Arial"/>
-          <w:sz w:val="15"/>
-        </w:rPr>
-        <w:t>{</w:t>
-      </w:r>
-      <w:proofErr w:type="gramEnd"/>
-      <w:r>
-        <w:rPr>
-          <w:rFonts w:ascii="Arial" w:eastAsia="Arial" w:hAnsi="Arial" w:cs="Arial"/>
-          <w:sz w:val="15"/>
-        </w:rPr>
-        <w:t>{</w:t>
-      </w:r>
-      <w:proofErr w:type="spellStart"/>
-      <w:r>
-        <w:rPr>
-          <w:rFonts w:ascii="Arial" w:eastAsia="Arial" w:hAnsi="Arial" w:cs="Arial"/>
-          <w:sz w:val="15"/>
-        </w:rPr>
-        <w:t>re_source</w:t>
-      </w:r>
-      <w:proofErr w:type="spellEnd"/>
-      <w:r>
-        <w:rPr>
-          <w:rFonts w:ascii="Arial" w:eastAsia="Arial" w:hAnsi="Arial" w:cs="Arial"/>
-          <w:sz w:val="15"/>
-        </w:rPr>
-        <w:t>}}</w:t>
-      </w:r>
     </w:p>
     <w:p>
       <w:pPr>
@@ -734,67 +403,14 @@
           <w:rFonts w:ascii="Arial" w:eastAsia="Arial" w:hAnsi="Arial" w:cs="Arial"/>
           <w:sz w:val="15"/>
         </w:rPr>
+        <w:t xml:space="preserve">                                         </w:t>
+      </w:r>
+      <w:r>
+        <w:rPr>
+          <w:rFonts w:ascii="Arial" w:eastAsia="Arial" w:hAnsi="Arial" w:cs="Arial"/>
+          <w:sz w:val="15"/>
+        </w:rPr>
         <w:t xml:space="preserve"> </w:t>
-      </w:r>
-      <w:r>
-        <w:rPr>
-          <w:rFonts w:ascii="Arial" w:eastAsia="Arial" w:hAnsi="Arial" w:cs="Arial"/>
-          <w:sz w:val="15"/>
-        </w:rPr>
-        <w:tab/>
-      </w:r>
-      <w:r>
-        <w:rPr>
-          <w:rFonts w:ascii="Arial" w:eastAsia="Arial" w:hAnsi="Arial" w:cs="Arial"/>
-          <w:sz w:val="15"/>
-        </w:rPr>
-        <w:t xml:space="preserve">                                                  </w:t>
-      </w:r>
-      <w:proofErr w:type="gramStart"/>
-      <w:r>
-        <w:rPr>
-          <w:rFonts w:ascii="Arial" w:eastAsia="Arial" w:hAnsi="Arial" w:cs="Arial"/>
-          <w:sz w:val="15"/>
-        </w:rPr>
-        <w:t xml:space="preserve">  </w:t>
-      </w:r>
-      <w:r>
-        <w:rPr>
-          <w:rFonts w:ascii="Arial" w:eastAsia="Arial" w:hAnsi="Arial" w:cs="Arial"/>
-          <w:sz w:val="15"/>
-        </w:rPr>
-        <w:t xml:space="preserve"> </w:t>
-      </w:r>
-      <w:r>
-        <w:rPr>
-          <w:rFonts w:ascii="Arial" w:eastAsia="Arial" w:hAnsi="Arial" w:cs="Arial"/>
-          <w:sz w:val="15"/>
-        </w:rPr>
-        <w:t>{</w:t>
-      </w:r>
-      <w:proofErr w:type="gramEnd"/>
-      <w:r>
-        <w:rPr>
-          <w:rFonts w:ascii="Arial" w:eastAsia="Arial" w:hAnsi="Arial" w:cs="Arial"/>
-          <w:sz w:val="15"/>
-        </w:rPr>
-        <w:t>{</w:t>
-      </w:r>
-      <w:proofErr w:type="spellStart"/>
-      <w:r>
-        <w:rPr>
-          <w:rFonts w:ascii="Arial" w:eastAsia="Arial" w:hAnsi="Arial" w:cs="Arial"/>
-          <w:sz w:val="15"/>
-        </w:rPr>
-        <w:t>sanctioned_capacity</w:t>
-      </w:r>
-      <w:proofErr w:type="spellEnd"/>
-      <w:r>
-        <w:rPr>
-          <w:rFonts w:ascii="Arial" w:eastAsia="Arial" w:hAnsi="Arial" w:cs="Arial"/>
-          <w:sz w:val="15"/>
-        </w:rPr>
-        <w:t>}}</w:t>
       </w:r>
     </w:p>
     <w:p>
@@ -835,13 +451,6 @@
         </w:rPr>
         <w:t xml:space="preserve">                                                                                </w:t>
       </w:r>
-      <w:r>
-        <w:rPr>
-          <w:rFonts w:ascii="Arial" w:eastAsia="Arial" w:hAnsi="Arial" w:cs="Arial"/>
-          <w:sz w:val="15"/>
-        </w:rPr>
-        <w:t>ROOFTOP</w:t>
-      </w:r>
     </w:p>
     <w:p>
       <w:pPr>
@@ -867,74 +476,6 @@
         </w:rPr>
         <w:t xml:space="preserve"> </w:t>
       </w:r>
-      <w:r>
-        <w:rPr>
-          <w:rFonts w:ascii="Arial" w:eastAsia="Arial" w:hAnsi="Arial" w:cs="Arial"/>
-          <w:sz w:val="15"/>
-        </w:rPr>
-        <w:tab/>
-        <w:t xml:space="preserve"> </w:t>
-      </w:r>
-      <w:r>
-        <w:rPr>
-          <w:rFonts w:ascii="Arial" w:eastAsia="Arial" w:hAnsi="Arial" w:cs="Arial"/>
-          <w:sz w:val="15"/>
-        </w:rPr>
-        <w:t xml:space="preserve">  </w:t>
-      </w:r>
-      <w:r>
-        <w:rPr>
-          <w:rFonts w:ascii="Arial" w:eastAsia="Arial" w:hAnsi="Arial" w:cs="Arial"/>
-          <w:sz w:val="15"/>
-        </w:rPr>
-        <w:t xml:space="preserve">                                                </w:t>
-      </w:r>
-      <w:r>
-        <w:rPr>
-          <w:rFonts w:ascii="Arial" w:eastAsia="Arial" w:hAnsi="Arial" w:cs="Arial"/>
-          <w:sz w:val="15"/>
-        </w:rPr>
-        <w:t xml:space="preserve">            </w:t>
-      </w:r>
-      <w:proofErr w:type="gramStart"/>
-      <w:r>
-        <w:rPr>
-          <w:rFonts w:ascii="Arial" w:eastAsia="Arial" w:hAnsi="Arial" w:cs="Arial"/>
-          <w:sz w:val="15"/>
-        </w:rPr>
-        <w:t xml:space="preserve">   </w:t>
-      </w:r>
-      <w:r>
-        <w:rPr>
-          <w:rFonts w:ascii="Arial" w:eastAsia="Arial" w:hAnsi="Arial" w:cs="Arial"/>
-          <w:sz w:val="15"/>
-        </w:rPr>
-        <w:t>{</w:t>
-      </w:r>
-      <w:proofErr w:type="gramEnd"/>
-      <w:r>
-        <w:rPr>
-          <w:rFonts w:ascii="Arial" w:eastAsia="Arial" w:hAnsi="Arial" w:cs="Arial"/>
-          <w:sz w:val="15"/>
-        </w:rPr>
-        <w:t>{</w:t>
-      </w:r>
-      <w:proofErr w:type="spellStart"/>
-      <w:r>
-        <w:rPr>
-          <w:rFonts w:ascii="Arial" w:eastAsia="Arial" w:hAnsi="Arial" w:cs="Arial"/>
-          <w:sz w:val="15"/>
-        </w:rPr>
-        <w:t>project_model</w:t>
-      </w:r>
-      <w:proofErr w:type="spellEnd"/>
-      <w:r>
-        <w:rPr>
-          <w:rFonts w:ascii="Arial" w:eastAsia="Arial" w:hAnsi="Arial" w:cs="Arial"/>
-          <w:sz w:val="15"/>
-        </w:rPr>
-        <w:t>}}</w:t>
-      </w:r>
     </w:p>
     <w:p>
       <w:pPr>
@@ -969,7 +510,25 @@
           <w:color w:val="545454"/>
           <w:sz w:val="15"/>
         </w:rPr>
-        <w:t>Rooftop)(</w:t>
+        <w:t>Rooftop)(KW)</w:t>
+      </w:r>
+    </w:p>
+    <w:p>
+      <w:pPr>
+        <w:numPr>
+          <w:ilvl w:val="0"/>
+          <w:numId w:val="1"/>
+        </w:numPr>
+        <w:spacing w:after="190" w:line="265" w:lineRule="auto"/>
+        <w:ind w:right="1607" w:hanging="360"/>
+      </w:pPr>
+      <w:r>
+        <w:rPr>
+          <w:rFonts w:ascii="Arial" w:eastAsia="Arial" w:hAnsi="Arial" w:cs="Arial"/>
+          <w:color w:val="545454"/>
+          <w:sz w:val="15"/>
+        </w:rPr>
+        <w:t xml:space="preserve">RE installed </w:t>
       </w:r>
       <w:proofErr w:type="gramStart"/>
       <w:r>
@@ -978,67 +537,23 @@
           <w:color w:val="545454"/>
           <w:sz w:val="15"/>
         </w:rPr>
-        <w:t>KW)</w:t>
-      </w:r>
-      <w:r>
-        <w:rPr>
-          <w:rFonts w:ascii="Arial" w:eastAsia="Arial" w:hAnsi="Arial" w:cs="Arial"/>
-          <w:sz w:val="15"/>
-        </w:rPr>
-        <w:t xml:space="preserve"> </w:t>
-      </w:r>
-      <w:r>
-        <w:rPr>
-          <w:rFonts w:ascii="Arial" w:eastAsia="Arial" w:hAnsi="Arial" w:cs="Arial"/>
-          <w:sz w:val="15"/>
-        </w:rPr>
-        <w:t xml:space="preserve">  </w:t>
+        <w:t>Capacity(</w:t>
       </w:r>
       <w:proofErr w:type="gramEnd"/>
       <w:r>
         <w:rPr>
           <w:rFonts w:ascii="Arial" w:eastAsia="Arial" w:hAnsi="Arial" w:cs="Arial"/>
-          <w:sz w:val="15"/>
-        </w:rPr>
-        <w:t xml:space="preserve">                                         </w:t>
-      </w:r>
-      <w:proofErr w:type="gramStart"/>
-      <w:r>
-        <w:rPr>
-          <w:rFonts w:ascii="Arial" w:eastAsia="Arial" w:hAnsi="Arial" w:cs="Arial"/>
-          <w:sz w:val="15"/>
-        </w:rPr>
-        <w:t xml:space="preserve">  </w:t>
-      </w:r>
-      <w:r>
-        <w:rPr>
-          <w:rFonts w:ascii="Arial" w:eastAsia="Arial" w:hAnsi="Arial" w:cs="Arial"/>
-          <w:sz w:val="15"/>
-        </w:rPr>
-        <w:t xml:space="preserve"> </w:t>
-      </w:r>
-      <w:r>
-        <w:rPr>
-          <w:rFonts w:ascii="Arial" w:eastAsia="Arial" w:hAnsi="Arial" w:cs="Arial"/>
-          <w:sz w:val="15"/>
-        </w:rPr>
-        <w:t>{</w:t>
-      </w:r>
-      <w:proofErr w:type="gramEnd"/>
-      <w:r>
-        <w:rPr>
-          <w:rFonts w:ascii="Arial" w:eastAsia="Arial" w:hAnsi="Arial" w:cs="Arial"/>
-          <w:sz w:val="15"/>
-        </w:rPr>
-        <w:t>{capacity}}</w:t>
-      </w:r>
-      <w:r>
-        <w:rPr>
-          <w:rFonts w:ascii="Arial" w:eastAsia="Arial" w:hAnsi="Arial" w:cs="Arial"/>
-          <w:sz w:val="15"/>
-        </w:rPr>
-        <w:tab/>
-        <w:t xml:space="preserve"> </w:t>
+          <w:color w:val="545454"/>
+          <w:sz w:val="15"/>
+        </w:rPr>
+        <w:t>Ground)(KW)</w:t>
+      </w:r>
+      <w:r>
+        <w:rPr>
+          <w:rFonts w:ascii="Arial" w:eastAsia="Arial" w:hAnsi="Arial" w:cs="Arial"/>
+          <w:sz w:val="15"/>
+        </w:rPr>
+        <w:t xml:space="preserve">          </w:t>
       </w:r>
     </w:p>
     <w:p>
@@ -1083,91 +598,12 @@
           <w:color w:val="545454"/>
           <w:sz w:val="15"/>
         </w:rPr>
-        <w:t>Ground)(KW)</w:t>
-      </w:r>
-      <w:r>
-        <w:rPr>
-          <w:rFonts w:ascii="Arial" w:eastAsia="Arial" w:hAnsi="Arial" w:cs="Arial"/>
-          <w:sz w:val="15"/>
-        </w:rPr>
-        <w:t xml:space="preserve"> </w:t>
-      </w:r>
-      <w:r>
-        <w:rPr>
-          <w:rFonts w:ascii="Arial" w:eastAsia="Arial" w:hAnsi="Arial" w:cs="Arial"/>
-          <w:sz w:val="15"/>
-        </w:rPr>
-        <w:t xml:space="preserve">  </w:t>
+        <w:t>Ground)(</w:t>
       </w:r>
       <w:proofErr w:type="gramEnd"/>
       <w:r>
         <w:rPr>
           <w:rFonts w:ascii="Arial" w:eastAsia="Arial" w:hAnsi="Arial" w:cs="Arial"/>
-          <w:sz w:val="15"/>
-        </w:rPr>
-        <w:t xml:space="preserve">                              </w:t>
-      </w:r>
-      <w:r>
-        <w:rPr>
-          <w:rFonts w:ascii="Arial" w:eastAsia="Arial" w:hAnsi="Arial" w:cs="Arial"/>
-          <w:sz w:val="15"/>
-        </w:rPr>
-        <w:t xml:space="preserve">  </w:t>
-      </w:r>
-      <w:r>
-        <w:rPr>
-          <w:rFonts w:ascii="Arial" w:eastAsia="Arial" w:hAnsi="Arial" w:cs="Arial"/>
-          <w:sz w:val="15"/>
-        </w:rPr>
-        <w:t>N.A.</w:t>
-      </w:r>
-      <w:r>
-        <w:rPr>
-          <w:rFonts w:ascii="Arial" w:eastAsia="Arial" w:hAnsi="Arial" w:cs="Arial"/>
-          <w:sz w:val="15"/>
-        </w:rPr>
-        <w:t xml:space="preserve"> </w:t>
-      </w:r>
-    </w:p>
-    <w:p>
-      <w:pPr>
-        <w:numPr>
-          <w:ilvl w:val="0"/>
-          <w:numId w:val="1"/>
-        </w:numPr>
-        <w:spacing w:after="190" w:line="265" w:lineRule="auto"/>
-        <w:ind w:right="1607" w:hanging="360"/>
-      </w:pPr>
-      <w:r>
-        <w:rPr>
-          <w:rFonts w:ascii="Arial" w:eastAsia="Arial" w:hAnsi="Arial" w:cs="Arial"/>
-          <w:color w:val="545454"/>
-          <w:sz w:val="15"/>
-        </w:rPr>
-        <w:t xml:space="preserve">RE installed </w:t>
-      </w:r>
-      <w:proofErr w:type="gramStart"/>
-      <w:r>
-        <w:rPr>
-          <w:rFonts w:ascii="Arial" w:eastAsia="Arial" w:hAnsi="Arial" w:cs="Arial"/>
-          <w:color w:val="545454"/>
-          <w:sz w:val="15"/>
-        </w:rPr>
-        <w:t>Capacity(</w:t>
-      </w:r>
-      <w:proofErr w:type="gramEnd"/>
-      <w:r>
-        <w:rPr>
-          <w:rFonts w:ascii="Arial" w:eastAsia="Arial" w:hAnsi="Arial" w:cs="Arial"/>
-          <w:color w:val="545454"/>
-          <w:sz w:val="15"/>
-        </w:rPr>
-        <w:t>Ground)(</w:t>
-      </w:r>
-      <w:proofErr w:type="gramStart"/>
-      <w:r>
-        <w:rPr>
-          <w:rFonts w:ascii="Arial" w:eastAsia="Arial" w:hAnsi="Arial" w:cs="Arial"/>
           <w:color w:val="545454"/>
           <w:sz w:val="15"/>
         </w:rPr>
@@ -1178,36 +614,7 @@
           <w:rFonts w:ascii="Arial" w:eastAsia="Arial" w:hAnsi="Arial" w:cs="Arial"/>
           <w:sz w:val="15"/>
         </w:rPr>
-        <w:t xml:space="preserve">  </w:t>
-      </w:r>
-      <w:r>
-        <w:rPr>
-          <w:rFonts w:ascii="Arial" w:eastAsia="Arial" w:hAnsi="Arial" w:cs="Arial"/>
-          <w:sz w:val="15"/>
-        </w:rPr>
-        <w:t xml:space="preserve"> </w:t>
-      </w:r>
-      <w:proofErr w:type="gramEnd"/>
-      <w:r>
-        <w:rPr>
-          <w:rFonts w:ascii="Arial" w:eastAsia="Arial" w:hAnsi="Arial" w:cs="Arial"/>
-          <w:sz w:val="15"/>
-        </w:rPr>
-        <w:t xml:space="preserve">                                              </w:t>
-      </w:r>
-      <w:r>
-        <w:rPr>
-          <w:rFonts w:ascii="Arial" w:eastAsia="Arial" w:hAnsi="Arial" w:cs="Arial"/>
-          <w:sz w:val="15"/>
-        </w:rPr>
-        <w:t xml:space="preserve">    </w:t>
-      </w:r>
-      <w:r>
-        <w:rPr>
-          <w:rFonts w:ascii="Arial" w:eastAsia="Arial" w:hAnsi="Arial" w:cs="Arial"/>
-          <w:sz w:val="15"/>
-        </w:rPr>
-        <w:t>N.A.</w:t>
+        <w:t xml:space="preserve">       </w:t>
       </w:r>
     </w:p>
     <w:p>
@@ -1227,25 +634,16 @@
         </w:rPr>
         <w:t xml:space="preserve">Installation date </w:t>
       </w:r>
-      <w:r>
-        <w:rPr>
-          <w:rFonts w:ascii="Arial" w:eastAsia="Arial" w:hAnsi="Arial" w:cs="Arial"/>
-          <w:color w:val="545454"/>
-          <w:sz w:val="15"/>
-        </w:rPr>
-        <w:t xml:space="preserve">                                   </w:t>
-      </w:r>
-      <w:r>
-        <w:rPr>
-          <w:rFonts w:ascii="Arial" w:eastAsia="Arial" w:hAnsi="Arial" w:cs="Arial"/>
-          <w:sz w:val="15"/>
-        </w:rPr>
-        <w:t xml:space="preserve">                               </w:t>
-      </w:r>
-      <w:proofErr w:type="gramStart"/>
-      <w:r>
-        <w:rPr>
-          <w:rFonts w:ascii="Arial" w:eastAsia="Arial" w:hAnsi="Arial" w:cs="Arial"/>
+    </w:p>
+    <w:p>
+      <w:pPr>
+        <w:spacing w:after="37" w:line="265" w:lineRule="auto"/>
+        <w:ind w:left="688" w:right="1607"/>
+      </w:pPr>
+      <w:r>
+        <w:rPr>
+          <w:rFonts w:ascii="Arial" w:eastAsia="Arial" w:hAnsi="Arial" w:cs="Arial"/>
+          <w:color w:val="545454"/>
           <w:sz w:val="15"/>
         </w:rPr>
         <w:t xml:space="preserve"> </w:t>
@@ -1256,51 +654,22 @@
           <w:color w:val="545454"/>
           <w:sz w:val="15"/>
         </w:rPr>
+        <w:t xml:space="preserve">                                </w:t>
+      </w:r>
+      <w:r>
+        <w:rPr>
+          <w:rFonts w:ascii="Arial" w:eastAsia="Arial" w:hAnsi="Arial" w:cs="Arial"/>
+          <w:sz w:val="15"/>
+        </w:rPr>
+        <w:t xml:space="preserve">                                </w:t>
+      </w:r>
+      <w:r>
+        <w:rPr>
+          <w:rFonts w:ascii="Arial" w:eastAsia="Arial" w:hAnsi="Arial" w:cs="Arial"/>
+          <w:color w:val="545454"/>
+          <w:sz w:val="15"/>
+        </w:rPr>
         <w:t xml:space="preserve">  </w:t>
-      </w:r>
-      <w:r>
-        <w:rPr>
-          <w:rFonts w:ascii="Arial" w:eastAsia="Arial" w:hAnsi="Arial" w:cs="Arial"/>
-          <w:sz w:val="15"/>
-        </w:rPr>
-        <w:t>{</w:t>
-      </w:r>
-      <w:proofErr w:type="gramEnd"/>
-      <w:r>
-        <w:rPr>
-          <w:rFonts w:ascii="Arial" w:eastAsia="Arial" w:hAnsi="Arial" w:cs="Arial"/>
-          <w:sz w:val="15"/>
-        </w:rPr>
-        <w:t>{</w:t>
-      </w:r>
-      <w:proofErr w:type="spellStart"/>
-      <w:r>
-        <w:rPr>
-          <w:rFonts w:ascii="Arial" w:eastAsia="Arial" w:hAnsi="Arial" w:cs="Arial"/>
-          <w:sz w:val="15"/>
-        </w:rPr>
-        <w:t>installation_date</w:t>
-      </w:r>
-      <w:proofErr w:type="spellEnd"/>
-      <w:r>
-        <w:rPr>
-          <w:rFonts w:ascii="Arial" w:eastAsia="Arial" w:hAnsi="Arial" w:cs="Arial"/>
-          <w:sz w:val="15"/>
-        </w:rPr>
-        <w:t>}}</w:t>
-      </w:r>
-    </w:p>
-    <w:p>
-      <w:pPr>
-        <w:spacing w:after="0"/>
-        <w:ind w:left="115" w:right="1607"/>
-      </w:pPr>
-      <w:r>
-        <w:rPr>
-          <w:rFonts w:ascii="Times New Roman" w:eastAsia="Times New Roman" w:hAnsi="Times New Roman" w:cs="Times New Roman"/>
-          <w:sz w:val="15"/>
-        </w:rPr>
-        <w:t xml:space="preserve"> </w:t>
       </w:r>
     </w:p>
     <w:p>
@@ -1343,8 +712,8 @@
     </w:p>
     <w:p>
       <w:pPr>
-        <w:spacing w:after="5" w:line="265" w:lineRule="auto"/>
-        <w:ind w:left="658" w:right="1607" w:hanging="10"/>
+        <w:spacing w:after="197"/>
+        <w:ind w:left="688" w:right="1607"/>
       </w:pPr>
       <w:r>
         <w:rPr>
@@ -1369,367 +738,778 @@
           <w:color w:val="545454"/>
           <w:sz w:val="15"/>
         </w:rPr>
+        <w:t xml:space="preserve">   </w:t>
+      </w:r>
+      <w:proofErr w:type="gramEnd"/>
+      <w:r>
+        <w:rPr>
+          <w:rFonts w:ascii="Times New Roman" w:eastAsia="Times New Roman" w:hAnsi="Times New Roman" w:cs="Times New Roman"/>
+          <w:color w:val="545454"/>
+          <w:sz w:val="15"/>
+        </w:rPr>
+        <w:t xml:space="preserve">                                                            </w:t>
+      </w:r>
+      <w:r>
+        <w:rPr>
+          <w:rFonts w:ascii="Arial" w:eastAsia="Arial" w:hAnsi="Arial" w:cs="Arial"/>
+          <w:color w:val="545454"/>
+          <w:sz w:val="15"/>
+        </w:rPr>
+        <w:t xml:space="preserve">Inverter Make                              </w:t>
+      </w:r>
+      <w:r>
+        <w:rPr>
+          <w:rFonts w:ascii="Arial" w:eastAsia="Arial" w:hAnsi="Arial" w:cs="Arial"/>
+          <w:sz w:val="15"/>
+        </w:rPr>
+        <w:t xml:space="preserve">                                </w:t>
+      </w:r>
+      <w:proofErr w:type="gramStart"/>
+      <w:r>
+        <w:rPr>
+          <w:rFonts w:ascii="Arial" w:eastAsia="Arial" w:hAnsi="Arial" w:cs="Arial"/>
+          <w:color w:val="545454"/>
+          <w:sz w:val="15"/>
+        </w:rPr>
+        <w:t>No .of</w:t>
+      </w:r>
+      <w:proofErr w:type="gramEnd"/>
+      <w:r>
+        <w:rPr>
+          <w:rFonts w:ascii="Arial" w:eastAsia="Arial" w:hAnsi="Arial" w:cs="Arial"/>
+          <w:color w:val="545454"/>
+          <w:sz w:val="15"/>
+        </w:rPr>
+        <w:t xml:space="preserve"> PV Modules</w:t>
+      </w:r>
+      <w:r>
+        <w:rPr>
+          <w:rFonts w:ascii="Times New Roman" w:eastAsia="Times New Roman" w:hAnsi="Times New Roman" w:cs="Times New Roman"/>
+          <w:color w:val="545454"/>
+          <w:sz w:val="15"/>
+        </w:rPr>
+        <w:t xml:space="preserve">                                   </w:t>
+      </w:r>
+      <w:r>
+        <w:rPr>
+          <w:rFonts w:ascii="Arial" w:eastAsia="Arial" w:hAnsi="Arial" w:cs="Arial"/>
+          <w:sz w:val="15"/>
+        </w:rPr>
+        <w:t xml:space="preserve">                                </w:t>
+      </w:r>
+      <w:r>
+        <w:rPr>
+          <w:rFonts w:ascii="Times New Roman" w:eastAsia="Times New Roman" w:hAnsi="Times New Roman" w:cs="Times New Roman"/>
+          <w:color w:val="545454"/>
+          <w:sz w:val="15"/>
+        </w:rPr>
         <w:t xml:space="preserve"> </w:t>
       </w:r>
       <w:r>
         <w:rPr>
+          <w:rFonts w:ascii="Arial" w:eastAsia="Arial" w:hAnsi="Arial" w:cs="Arial"/>
+          <w:color w:val="545454"/>
+          <w:sz w:val="15"/>
+        </w:rPr>
+        <w:t>Module Capacity (KW)</w:t>
+      </w:r>
+      <w:r>
+        <w:rPr>
           <w:rFonts w:ascii="Times New Roman" w:eastAsia="Times New Roman" w:hAnsi="Times New Roman" w:cs="Times New Roman"/>
           <w:color w:val="545454"/>
           <w:sz w:val="15"/>
         </w:rPr>
-        <w:t xml:space="preserve">  </w:t>
-      </w:r>
-      <w:proofErr w:type="gramEnd"/>
-      <w:r>
+        <w:t xml:space="preserve">       </w:t>
+      </w:r>
+      <w:r>
+        <w:rPr>
+          <w:rFonts w:ascii="Arial" w:eastAsia="Arial" w:hAnsi="Arial" w:cs="Arial"/>
+          <w:sz w:val="15"/>
+        </w:rPr>
+        <w:t xml:space="preserve">                                              </w:t>
+      </w:r>
+    </w:p>
+    <w:p>
+      <w:pPr>
+        <w:spacing w:after="0"/>
+        <w:rPr>
+          <w:rFonts w:ascii="Arial" w:eastAsia="Arial" w:hAnsi="Arial" w:cs="Arial"/>
+          <w:sz w:val="15"/>
+        </w:rPr>
+      </w:pPr>
+      <w:r>
+        <w:rPr>
+          <w:rFonts w:ascii="Arial" w:eastAsia="Arial" w:hAnsi="Arial" w:cs="Arial"/>
+          <w:sz w:val="15"/>
+        </w:rPr>
+        <w:t>{{</w:t>
+      </w:r>
+      <w:proofErr w:type="spellStart"/>
+      <w:r>
+        <w:rPr>
+          <w:rFonts w:ascii="Arial" w:eastAsia="Arial" w:hAnsi="Arial" w:cs="Arial"/>
+          <w:sz w:val="15"/>
+        </w:rPr>
+        <w:t>consumer_name</w:t>
+      </w:r>
+      <w:proofErr w:type="spellEnd"/>
+      <w:r>
+        <w:rPr>
+          <w:rFonts w:ascii="Arial" w:eastAsia="Arial" w:hAnsi="Arial" w:cs="Arial"/>
+          <w:sz w:val="15"/>
+        </w:rPr>
+        <w:t>}}</w:t>
+      </w:r>
+    </w:p>
+    <w:p>
+      <w:pPr>
+        <w:spacing w:after="0"/>
+        <w:rPr>
+          <w:rFonts w:ascii="Arial" w:eastAsia="Arial" w:hAnsi="Arial" w:cs="Arial"/>
+          <w:sz w:val="15"/>
+        </w:rPr>
+      </w:pPr>
+    </w:p>
+    <w:p>
+      <w:pPr>
+        <w:spacing w:after="0"/>
+        <w:rPr>
+          <w:rFonts w:ascii="Arial" w:eastAsia="Arial" w:hAnsi="Arial" w:cs="Arial"/>
+          <w:color w:val="000000" w:themeColor="text1"/>
+          <w:sz w:val="15"/>
+        </w:rPr>
+      </w:pPr>
+      <w:r>
+        <w:rPr>
+          <w:rFonts w:ascii="Arial" w:eastAsia="Arial" w:hAnsi="Arial" w:cs="Arial"/>
+          <w:color w:val="000000" w:themeColor="text1"/>
+          <w:sz w:val="15"/>
+        </w:rPr>
+        <w:t>{{</w:t>
+      </w:r>
+      <w:proofErr w:type="spellStart"/>
+      <w:r>
+        <w:rPr>
+          <w:rFonts w:ascii="Arial" w:eastAsia="Arial" w:hAnsi="Arial" w:cs="Arial"/>
+          <w:color w:val="000000" w:themeColor="text1"/>
+          <w:sz w:val="15"/>
+        </w:rPr>
+        <w:t>consumer_number</w:t>
+      </w:r>
+      <w:proofErr w:type="spellEnd"/>
+      <w:r>
+        <w:rPr>
+          <w:rFonts w:ascii="Arial" w:eastAsia="Arial" w:hAnsi="Arial" w:cs="Arial"/>
+          <w:color w:val="000000" w:themeColor="text1"/>
+          <w:sz w:val="15"/>
+        </w:rPr>
+        <w:t>}}</w:t>
+      </w:r>
+    </w:p>
+    <w:p>
+      <w:pPr>
+        <w:spacing w:after="0"/>
+        <w:rPr>
+          <w:rFonts w:ascii="Arial" w:eastAsia="Arial" w:hAnsi="Arial" w:cs="Arial"/>
+          <w:color w:val="000000" w:themeColor="text1"/>
+          <w:sz w:val="15"/>
+        </w:rPr>
+      </w:pPr>
+    </w:p>
+    <w:p>
+      <w:pPr>
+        <w:spacing w:after="0"/>
+        <w:rPr>
+          <w:rFonts w:ascii="Arial" w:eastAsia="Arial" w:hAnsi="Arial" w:cs="Arial"/>
+          <w:sz w:val="15"/>
+        </w:rPr>
+      </w:pPr>
+      <w:r>
+        <w:rPr>
+          <w:rFonts w:ascii="Arial" w:eastAsia="Arial" w:hAnsi="Arial" w:cs="Arial"/>
+          <w:sz w:val="15"/>
+        </w:rPr>
+        <w:t>{{</w:t>
+      </w:r>
+      <w:proofErr w:type="spellStart"/>
+      <w:r>
+        <w:rPr>
+          <w:rFonts w:ascii="Arial" w:eastAsia="Arial" w:hAnsi="Arial" w:cs="Arial"/>
+          <w:sz w:val="15"/>
+        </w:rPr>
+        <w:t>mobile_number</w:t>
+      </w:r>
+      <w:proofErr w:type="spellEnd"/>
+      <w:r>
+        <w:rPr>
+          <w:rFonts w:ascii="Arial" w:eastAsia="Arial" w:hAnsi="Arial" w:cs="Arial"/>
+          <w:sz w:val="15"/>
+        </w:rPr>
+        <w:t>}}</w:t>
+      </w:r>
+    </w:p>
+    <w:p>
+      <w:pPr>
+        <w:spacing w:after="0"/>
+        <w:rPr>
+          <w:rFonts w:ascii="Arial" w:eastAsia="Arial" w:hAnsi="Arial" w:cs="Arial"/>
+          <w:sz w:val="15"/>
+        </w:rPr>
+      </w:pPr>
+    </w:p>
+    <w:p>
+      <w:pPr>
+        <w:spacing w:after="0"/>
+        <w:rPr>
+          <w:rFonts w:ascii="Arial" w:eastAsia="Arial" w:hAnsi="Arial" w:cs="Arial"/>
+          <w:sz w:val="15"/>
+        </w:rPr>
+      </w:pPr>
+      <w:r>
+        <w:rPr>
+          <w:rFonts w:ascii="Arial" w:eastAsia="Arial" w:hAnsi="Arial" w:cs="Arial"/>
+          <w:sz w:val="15"/>
+        </w:rPr>
+        <w:t>{{email}}</w:t>
+      </w:r>
+    </w:p>
+    <w:p>
+      <w:pPr>
+        <w:spacing w:after="0"/>
+        <w:rPr>
+          <w:rFonts w:ascii="Arial" w:eastAsia="Arial" w:hAnsi="Arial" w:cs="Arial"/>
+          <w:sz w:val="15"/>
+        </w:rPr>
+      </w:pPr>
+      <w:r>
+        <w:rPr>
+          <w:rFonts w:ascii="Arial" w:eastAsia="Arial" w:hAnsi="Arial" w:cs="Arial"/>
+          <w:sz w:val="15"/>
+        </w:rPr>
+        <w:t>{{address}}</w:t>
+      </w:r>
+    </w:p>
+    <w:p>
+      <w:pPr>
+        <w:spacing w:after="218" w:line="265" w:lineRule="auto"/>
+        <w:ind w:right="1607"/>
+      </w:pPr>
+    </w:p>
+    <w:p>
+      <w:pPr>
+        <w:spacing w:after="0"/>
+        <w:rPr>
+          <w:rFonts w:ascii="Arial" w:eastAsia="Arial" w:hAnsi="Arial" w:cs="Arial"/>
+          <w:sz w:val="15"/>
+        </w:rPr>
+      </w:pPr>
+      <w:r>
+        <w:rPr>
+          <w:rFonts w:ascii="Arial" w:eastAsia="Arial" w:hAnsi="Arial" w:cs="Arial"/>
+          <w:color w:val="545454"/>
+          <w:sz w:val="15"/>
+        </w:rPr>
+        <w:t>Net Metering Arrangement</w:t>
+      </w:r>
+    </w:p>
+    <w:p>
+      <w:pPr>
+        <w:spacing w:after="0"/>
+        <w:ind w:left="115" w:right="1607"/>
+      </w:pPr>
+    </w:p>
+    <w:p>
+      <w:pPr>
+        <w:spacing w:after="0"/>
+        <w:rPr>
+          <w:rFonts w:ascii="Arial" w:eastAsia="Arial" w:hAnsi="Arial" w:cs="Arial"/>
+          <w:sz w:val="15"/>
+        </w:rPr>
+      </w:pPr>
+      <w:r>
+        <w:rPr>
+          <w:rFonts w:ascii="Arial" w:eastAsia="Arial" w:hAnsi="Arial" w:cs="Arial"/>
+          <w:sz w:val="15"/>
+        </w:rPr>
+        <w:t>{{</w:t>
+      </w:r>
+      <w:proofErr w:type="spellStart"/>
+      <w:r>
+        <w:rPr>
+          <w:rFonts w:ascii="Arial" w:eastAsia="Arial" w:hAnsi="Arial" w:cs="Arial"/>
+          <w:sz w:val="15"/>
+        </w:rPr>
+        <w:t>re_source</w:t>
+      </w:r>
+      <w:proofErr w:type="spellEnd"/>
+      <w:r>
+        <w:rPr>
+          <w:rFonts w:ascii="Arial" w:eastAsia="Arial" w:hAnsi="Arial" w:cs="Arial"/>
+          <w:sz w:val="15"/>
+        </w:rPr>
+        <w:t>}}</w:t>
+      </w:r>
+    </w:p>
+    <w:p>
+      <w:pPr>
+        <w:spacing w:after="0"/>
+        <w:rPr>
+          <w:rFonts w:ascii="Arial" w:eastAsia="Arial" w:hAnsi="Arial" w:cs="Arial"/>
+          <w:sz w:val="15"/>
+        </w:rPr>
+      </w:pPr>
+    </w:p>
+    <w:p>
+      <w:pPr>
+        <w:spacing w:after="0"/>
+        <w:rPr>
+          <w:rFonts w:ascii="Arial" w:eastAsia="Arial" w:hAnsi="Arial" w:cs="Arial"/>
+          <w:sz w:val="15"/>
+        </w:rPr>
+      </w:pPr>
+      <w:r>
+        <w:rPr>
+          <w:rFonts w:ascii="Arial" w:eastAsia="Arial" w:hAnsi="Arial" w:cs="Arial"/>
+          <w:sz w:val="15"/>
+        </w:rPr>
+        <w:t>{{</w:t>
+      </w:r>
+      <w:proofErr w:type="spellStart"/>
+      <w:r>
+        <w:rPr>
+          <w:rFonts w:ascii="Arial" w:eastAsia="Arial" w:hAnsi="Arial" w:cs="Arial"/>
+          <w:sz w:val="15"/>
+        </w:rPr>
+        <w:t>sanctioned_capacity</w:t>
+      </w:r>
+      <w:proofErr w:type="spellEnd"/>
+      <w:r>
+        <w:rPr>
+          <w:rFonts w:ascii="Arial" w:eastAsia="Arial" w:hAnsi="Arial" w:cs="Arial"/>
+          <w:sz w:val="15"/>
+        </w:rPr>
+        <w:t>}}</w:t>
+      </w:r>
+    </w:p>
+    <w:p>
+      <w:pPr>
+        <w:spacing w:after="0"/>
+        <w:rPr>
+          <w:rFonts w:ascii="Arial" w:eastAsia="Arial" w:hAnsi="Arial" w:cs="Arial"/>
+          <w:sz w:val="15"/>
+        </w:rPr>
+      </w:pPr>
+    </w:p>
+    <w:p>
+      <w:pPr>
+        <w:spacing w:after="0"/>
+        <w:rPr>
+          <w:rFonts w:ascii="Arial" w:eastAsia="Arial" w:hAnsi="Arial" w:cs="Arial"/>
+          <w:sz w:val="15"/>
+        </w:rPr>
+      </w:pPr>
+      <w:r>
+        <w:rPr>
+          <w:rFonts w:ascii="Arial" w:eastAsia="Arial" w:hAnsi="Arial" w:cs="Arial"/>
+          <w:sz w:val="15"/>
+        </w:rPr>
+        <w:t>ROOFTOP</w:t>
+      </w:r>
+    </w:p>
+    <w:p>
+      <w:pPr>
+        <w:spacing w:after="0"/>
+        <w:rPr>
+          <w:rFonts w:ascii="Arial" w:eastAsia="Arial" w:hAnsi="Arial" w:cs="Arial"/>
+          <w:sz w:val="15"/>
+        </w:rPr>
+      </w:pPr>
+    </w:p>
+    <w:p>
+      <w:pPr>
+        <w:spacing w:after="0"/>
+        <w:rPr>
+          <w:rFonts w:ascii="Arial" w:eastAsia="Arial" w:hAnsi="Arial" w:cs="Arial"/>
+          <w:sz w:val="15"/>
+        </w:rPr>
+      </w:pPr>
+      <w:r>
+        <w:rPr>
+          <w:rFonts w:ascii="Arial" w:eastAsia="Arial" w:hAnsi="Arial" w:cs="Arial"/>
+          <w:sz w:val="15"/>
+        </w:rPr>
+        <w:t>{{</w:t>
+      </w:r>
+      <w:proofErr w:type="spellStart"/>
+      <w:r>
+        <w:rPr>
+          <w:rFonts w:ascii="Arial" w:eastAsia="Arial" w:hAnsi="Arial" w:cs="Arial"/>
+          <w:sz w:val="15"/>
+        </w:rPr>
+        <w:t>project_model</w:t>
+      </w:r>
+      <w:proofErr w:type="spellEnd"/>
+      <w:r>
+        <w:rPr>
+          <w:rFonts w:ascii="Arial" w:eastAsia="Arial" w:hAnsi="Arial" w:cs="Arial"/>
+          <w:sz w:val="15"/>
+        </w:rPr>
+        <w:t>}}</w:t>
+      </w:r>
+    </w:p>
+    <w:p>
+      <w:pPr>
+        <w:spacing w:after="0"/>
+        <w:rPr>
+          <w:rFonts w:ascii="Arial" w:eastAsia="Arial" w:hAnsi="Arial" w:cs="Arial"/>
+          <w:sz w:val="15"/>
+        </w:rPr>
+      </w:pPr>
+    </w:p>
+    <w:p>
+      <w:pPr>
+        <w:spacing w:after="0"/>
+        <w:rPr>
+          <w:rFonts w:ascii="Arial" w:eastAsia="Arial" w:hAnsi="Arial" w:cs="Arial"/>
+          <w:sz w:val="15"/>
+        </w:rPr>
+      </w:pPr>
+    </w:p>
+    <w:p>
+      <w:pPr>
+        <w:spacing w:after="0"/>
+        <w:rPr>
+          <w:rFonts w:ascii="Arial" w:eastAsia="Arial" w:hAnsi="Arial" w:cs="Arial"/>
+          <w:sz w:val="15"/>
+        </w:rPr>
+      </w:pPr>
+      <w:r>
+        <w:rPr>
+          <w:rFonts w:ascii="Arial" w:eastAsia="Arial" w:hAnsi="Arial" w:cs="Arial"/>
+          <w:sz w:val="15"/>
+        </w:rPr>
+        <w:t>{{capacity}}</w:t>
+      </w:r>
+    </w:p>
+    <w:p>
+      <w:pPr>
+        <w:spacing w:after="0"/>
+        <w:rPr>
+          <w:rFonts w:ascii="Arial" w:eastAsia="Arial" w:hAnsi="Arial" w:cs="Arial"/>
+          <w:sz w:val="15"/>
+        </w:rPr>
+      </w:pPr>
+    </w:p>
+    <w:p>
+      <w:pPr>
+        <w:spacing w:after="0"/>
+        <w:rPr>
+          <w:rFonts w:ascii="Arial" w:eastAsia="Arial" w:hAnsi="Arial" w:cs="Arial"/>
+          <w:sz w:val="15"/>
+        </w:rPr>
+      </w:pPr>
+    </w:p>
+    <w:p>
+      <w:pPr>
+        <w:spacing w:after="0"/>
+        <w:rPr>
+          <w:rFonts w:ascii="Arial" w:eastAsia="Arial" w:hAnsi="Arial" w:cs="Arial"/>
+          <w:sz w:val="15"/>
+        </w:rPr>
+      </w:pPr>
+    </w:p>
+    <w:p>
+      <w:pPr>
+        <w:spacing w:after="0"/>
+        <w:rPr>
+          <w:rFonts w:ascii="Arial" w:eastAsia="Arial" w:hAnsi="Arial" w:cs="Arial"/>
+          <w:sz w:val="15"/>
+        </w:rPr>
+      </w:pPr>
+      <w:r>
+        <w:rPr>
+          <w:rFonts w:ascii="Arial" w:eastAsia="Arial" w:hAnsi="Arial" w:cs="Arial"/>
+          <w:sz w:val="15"/>
+        </w:rPr>
+        <w:t>N.A.</w:t>
+      </w:r>
+    </w:p>
+    <w:p>
+      <w:pPr>
+        <w:spacing w:after="0"/>
+        <w:rPr>
+          <w:rFonts w:ascii="Arial" w:eastAsia="Arial" w:hAnsi="Arial" w:cs="Arial"/>
+          <w:sz w:val="15"/>
+        </w:rPr>
+      </w:pPr>
+    </w:p>
+    <w:p>
+      <w:pPr>
+        <w:spacing w:after="0"/>
+        <w:rPr>
+          <w:rFonts w:ascii="Arial" w:eastAsia="Arial" w:hAnsi="Arial" w:cs="Arial"/>
+          <w:sz w:val="15"/>
+        </w:rPr>
+      </w:pPr>
+    </w:p>
+    <w:p>
+      <w:pPr>
+        <w:spacing w:after="0"/>
+        <w:rPr>
+          <w:rFonts w:ascii="Arial" w:eastAsia="Arial" w:hAnsi="Arial" w:cs="Arial"/>
+          <w:sz w:val="15"/>
+        </w:rPr>
+      </w:pPr>
+      <w:r>
+        <w:rPr>
+          <w:rFonts w:ascii="Arial" w:eastAsia="Arial" w:hAnsi="Arial" w:cs="Arial"/>
+          <w:sz w:val="15"/>
+        </w:rPr>
+        <w:t>N.A.</w:t>
+      </w:r>
+    </w:p>
+    <w:p>
+      <w:pPr>
+        <w:spacing w:after="0"/>
+        <w:rPr>
+          <w:rFonts w:ascii="Arial" w:eastAsia="Arial" w:hAnsi="Arial" w:cs="Arial"/>
+          <w:sz w:val="15"/>
+        </w:rPr>
+      </w:pPr>
+    </w:p>
+    <w:p>
+      <w:pPr>
+        <w:spacing w:after="0"/>
+        <w:rPr>
+          <w:rFonts w:ascii="Arial" w:eastAsia="Arial" w:hAnsi="Arial" w:cs="Arial"/>
+          <w:sz w:val="15"/>
+        </w:rPr>
+      </w:pPr>
+    </w:p>
+    <w:p>
+      <w:pPr>
+        <w:spacing w:after="0"/>
+        <w:rPr>
+          <w:rFonts w:ascii="Arial" w:eastAsia="Arial" w:hAnsi="Arial" w:cs="Arial"/>
+          <w:sz w:val="15"/>
+        </w:rPr>
+      </w:pPr>
+      <w:r>
+        <w:rPr>
+          <w:rFonts w:ascii="Arial" w:eastAsia="Arial" w:hAnsi="Arial" w:cs="Arial"/>
+          <w:sz w:val="15"/>
+        </w:rPr>
+        <w:t>{{</w:t>
+      </w:r>
+      <w:proofErr w:type="spellStart"/>
+      <w:r>
+        <w:rPr>
+          <w:rFonts w:ascii="Arial" w:eastAsia="Arial" w:hAnsi="Arial" w:cs="Arial"/>
+          <w:sz w:val="15"/>
+        </w:rPr>
+        <w:t>installation_date</w:t>
+      </w:r>
+      <w:proofErr w:type="spellEnd"/>
+      <w:r>
+        <w:rPr>
+          <w:rFonts w:ascii="Arial" w:eastAsia="Arial" w:hAnsi="Arial" w:cs="Arial"/>
+          <w:sz w:val="15"/>
+        </w:rPr>
+        <w:t>}}</w:t>
+      </w:r>
+    </w:p>
+    <w:p>
+      <w:pPr>
+        <w:spacing w:after="0"/>
+        <w:rPr>
+          <w:rFonts w:ascii="Arial" w:eastAsia="Arial" w:hAnsi="Arial" w:cs="Arial"/>
+          <w:sz w:val="15"/>
+        </w:rPr>
+      </w:pPr>
+    </w:p>
+    <w:p>
+      <w:pPr>
+        <w:spacing w:after="0"/>
+        <w:rPr>
+          <w:rFonts w:ascii="Arial" w:eastAsia="Arial" w:hAnsi="Arial" w:cs="Arial"/>
+          <w:sz w:val="15"/>
+        </w:rPr>
+      </w:pPr>
+    </w:p>
+    <w:p>
+      <w:pPr>
+        <w:spacing w:after="0"/>
+        <w:rPr>
+          <w:rFonts w:ascii="Arial" w:eastAsia="Arial" w:hAnsi="Arial" w:cs="Arial"/>
+          <w:sz w:val="15"/>
+        </w:rPr>
+      </w:pPr>
+    </w:p>
+    <w:p>
+      <w:pPr>
+        <w:spacing w:after="0"/>
+        <w:rPr>
+          <w:rFonts w:ascii="Arial" w:eastAsia="Arial" w:hAnsi="Arial" w:cs="Arial"/>
+          <w:sz w:val="15"/>
+        </w:rPr>
+      </w:pPr>
+      <w:r>
+        <w:rPr>
+          <w:rFonts w:ascii="Arial" w:eastAsia="Arial" w:hAnsi="Arial" w:cs="Arial"/>
+          <w:sz w:val="15"/>
+        </w:rPr>
+        <w:t>{</w:t>
+      </w:r>
+      <w:proofErr w:type="spellStart"/>
+      <w:r>
+        <w:rPr>
+          <w:rFonts w:ascii="Arial" w:eastAsia="Arial" w:hAnsi="Arial" w:cs="Arial"/>
+          <w:sz w:val="15"/>
+        </w:rPr>
+        <w:t>capacity_of_inverter</w:t>
+      </w:r>
+      <w:proofErr w:type="spellEnd"/>
+      <w:r>
+        <w:rPr>
+          <w:rFonts w:ascii="Arial" w:eastAsia="Arial" w:hAnsi="Arial" w:cs="Arial"/>
+          <w:sz w:val="15"/>
+        </w:rPr>
+        <w:t>}</w:t>
+      </w:r>
+    </w:p>
+    <w:p>
+      <w:pPr>
+        <w:spacing w:after="0"/>
+        <w:rPr>
+          <w:rFonts w:ascii="Arial" w:eastAsia="Arial" w:hAnsi="Arial" w:cs="Arial"/>
+          <w:sz w:val="15"/>
+        </w:rPr>
+      </w:pPr>
+      <w:r>
+        <w:rPr>
+          <w:rFonts w:ascii="Arial" w:eastAsia="Arial" w:hAnsi="Arial" w:cs="Arial"/>
+          <w:sz w:val="15"/>
+        </w:rPr>
+        <w:t>{{</w:t>
+      </w:r>
+      <w:proofErr w:type="spellStart"/>
+      <w:r>
+        <w:rPr>
+          <w:rFonts w:ascii="Arial" w:eastAsia="Arial" w:hAnsi="Arial" w:cs="Arial"/>
+          <w:sz w:val="15"/>
+        </w:rPr>
+        <w:t>inverter_make</w:t>
+      </w:r>
+      <w:proofErr w:type="spellEnd"/>
+      <w:r>
+        <w:rPr>
+          <w:rFonts w:ascii="Arial" w:eastAsia="Arial" w:hAnsi="Arial" w:cs="Arial"/>
+          <w:sz w:val="15"/>
+        </w:rPr>
+        <w:t>}}</w:t>
+      </w:r>
+    </w:p>
+    <w:p>
+      <w:pPr>
+        <w:spacing w:after="0"/>
+        <w:rPr>
+          <w:rFonts w:ascii="Arial" w:eastAsia="Arial" w:hAnsi="Arial" w:cs="Arial"/>
+          <w:sz w:val="15"/>
+        </w:rPr>
+      </w:pPr>
+      <w:r>
+        <w:rPr>
+          <w:rFonts w:ascii="Arial" w:eastAsia="Arial" w:hAnsi="Arial" w:cs="Arial"/>
+          <w:sz w:val="15"/>
+        </w:rPr>
+        <w:t>{{</w:t>
+      </w:r>
+      <w:proofErr w:type="spellStart"/>
+      <w:r>
+        <w:rPr>
+          <w:rFonts w:ascii="Arial" w:eastAsia="Arial" w:hAnsi="Arial" w:cs="Arial"/>
+          <w:sz w:val="15"/>
+        </w:rPr>
+        <w:t>module_count</w:t>
+      </w:r>
+      <w:proofErr w:type="spellEnd"/>
+      <w:r>
+        <w:rPr>
+          <w:rFonts w:ascii="Arial" w:eastAsia="Arial" w:hAnsi="Arial" w:cs="Arial"/>
+          <w:sz w:val="15"/>
+        </w:rPr>
+        <w:t>}}</w:t>
+      </w:r>
+    </w:p>
+    <w:p>
+      <w:pPr>
+        <w:spacing w:after="0"/>
+        <w:rPr>
+          <w:rFonts w:ascii="Arial" w:eastAsia="Arial" w:hAnsi="Arial" w:cs="Arial"/>
+          <w:sz w:val="15"/>
+        </w:rPr>
+      </w:pPr>
+      <w:r>
+        <w:rPr>
+          <w:rFonts w:ascii="Arial" w:eastAsia="Arial" w:hAnsi="Arial" w:cs="Arial"/>
+          <w:sz w:val="15"/>
+        </w:rPr>
+        <w:t>{</w:t>
+      </w:r>
+      <w:proofErr w:type="spellStart"/>
+      <w:r>
+        <w:rPr>
+          <w:rFonts w:ascii="Arial" w:eastAsia="Arial" w:hAnsi="Arial" w:cs="Arial"/>
+          <w:sz w:val="15"/>
+        </w:rPr>
+        <w:t>module_capacity_kw</w:t>
+      </w:r>
+      <w:proofErr w:type="spellEnd"/>
+      <w:r>
+        <w:rPr>
+          <w:rFonts w:ascii="Arial" w:eastAsia="Arial" w:hAnsi="Arial" w:cs="Arial"/>
+          <w:sz w:val="15"/>
+        </w:rPr>
+        <w:t>}}</w:t>
+      </w:r>
+    </w:p>
+    <w:p>
+      <w:pPr>
+        <w:spacing w:after="454" w:line="265" w:lineRule="auto"/>
+        <w:ind w:right="1607"/>
         <w:rPr>
           <w:rFonts w:ascii="Times New Roman" w:eastAsia="Times New Roman" w:hAnsi="Times New Roman" w:cs="Times New Roman"/>
           <w:color w:val="545454"/>
           <w:sz w:val="15"/>
         </w:rPr>
-        <w:t xml:space="preserve">              </w:t>
-      </w:r>
-      <w:r>
-        <w:rPr>
-          <w:rFonts w:ascii="Times New Roman" w:eastAsia="Times New Roman" w:hAnsi="Times New Roman" w:cs="Times New Roman"/>
-          <w:color w:val="545454"/>
-          <w:sz w:val="15"/>
-        </w:rPr>
-        <w:t xml:space="preserve">                                            </w:t>
-      </w:r>
-      <w:proofErr w:type="gramStart"/>
-      <w:r>
-        <w:rPr>
-          <w:rFonts w:ascii="Times New Roman" w:eastAsia="Times New Roman" w:hAnsi="Times New Roman" w:cs="Times New Roman"/>
-          <w:color w:val="545454"/>
-          <w:sz w:val="15"/>
-        </w:rPr>
-        <w:t xml:space="preserve">   </w:t>
-      </w:r>
-      <w:r>
-        <w:rPr>
-          <w:rFonts w:ascii="Arial" w:eastAsia="Arial" w:hAnsi="Arial" w:cs="Arial"/>
-          <w:sz w:val="15"/>
-        </w:rPr>
-        <w:t>{</w:t>
-      </w:r>
-      <w:proofErr w:type="spellStart"/>
-      <w:proofErr w:type="gramEnd"/>
-      <w:r>
-        <w:rPr>
-          <w:rFonts w:ascii="Arial" w:eastAsia="Arial" w:hAnsi="Arial" w:cs="Arial"/>
-          <w:sz w:val="15"/>
-        </w:rPr>
-        <w:t>capacity_of_inverter</w:t>
-      </w:r>
-      <w:proofErr w:type="spellEnd"/>
-      <w:r>
-        <w:rPr>
-          <w:rFonts w:ascii="Arial" w:eastAsia="Arial" w:hAnsi="Arial" w:cs="Arial"/>
-          <w:sz w:val="15"/>
-        </w:rPr>
-        <w:t>}</w:t>
-      </w:r>
-    </w:p>
-    <w:p>
-      <w:pPr>
-        <w:spacing w:after="0"/>
-        <w:ind w:left="115" w:right="1607"/>
-      </w:pPr>
-      <w:r>
-        <w:rPr>
-          <w:rFonts w:ascii="Times New Roman" w:eastAsia="Times New Roman" w:hAnsi="Times New Roman" w:cs="Times New Roman"/>
-          <w:sz w:val="15"/>
-        </w:rPr>
-        <w:t xml:space="preserve"> </w:t>
-      </w:r>
-    </w:p>
-    <w:p>
-      <w:pPr>
-        <w:spacing w:after="218" w:line="265" w:lineRule="auto"/>
-        <w:ind w:left="658" w:right="1607" w:hanging="10"/>
-      </w:pPr>
-      <w:r>
-        <w:rPr>
-          <w:rFonts w:ascii="Arial" w:eastAsia="Arial" w:hAnsi="Arial" w:cs="Arial"/>
-          <w:color w:val="545454"/>
-          <w:sz w:val="15"/>
-        </w:rPr>
-        <w:t xml:space="preserve">Inverter Make </w:t>
-      </w:r>
-      <w:r>
-        <w:rPr>
-          <w:rFonts w:ascii="Arial" w:eastAsia="Arial" w:hAnsi="Arial" w:cs="Arial"/>
-          <w:color w:val="545454"/>
-          <w:sz w:val="15"/>
-        </w:rPr>
-        <w:t xml:space="preserve">                             </w:t>
-      </w:r>
-      <w:r>
-        <w:rPr>
-          <w:rFonts w:ascii="Arial" w:eastAsia="Arial" w:hAnsi="Arial" w:cs="Arial"/>
-          <w:sz w:val="15"/>
-        </w:rPr>
-        <w:t xml:space="preserve">                                </w:t>
-      </w:r>
-      <w:r>
-        <w:rPr>
-          <w:rFonts w:ascii="Arial" w:eastAsia="Arial" w:hAnsi="Arial" w:cs="Arial"/>
-          <w:color w:val="545454"/>
-          <w:sz w:val="15"/>
-        </w:rPr>
-        <w:t xml:space="preserve">        </w:t>
-      </w:r>
-      <w:proofErr w:type="gramStart"/>
-      <w:r>
-        <w:rPr>
-          <w:rFonts w:ascii="Arial" w:eastAsia="Arial" w:hAnsi="Arial" w:cs="Arial"/>
-          <w:color w:val="545454"/>
-          <w:sz w:val="15"/>
-        </w:rPr>
-        <w:t xml:space="preserve">   </w:t>
-      </w:r>
-      <w:r>
-        <w:rPr>
-          <w:rFonts w:ascii="Arial" w:eastAsia="Arial" w:hAnsi="Arial" w:cs="Arial"/>
-          <w:sz w:val="15"/>
-        </w:rPr>
-        <w:t>{</w:t>
-      </w:r>
-      <w:proofErr w:type="gramEnd"/>
-      <w:r>
-        <w:rPr>
-          <w:rFonts w:ascii="Arial" w:eastAsia="Arial" w:hAnsi="Arial" w:cs="Arial"/>
-          <w:sz w:val="15"/>
-        </w:rPr>
-        <w:t>{</w:t>
-      </w:r>
-      <w:proofErr w:type="spellStart"/>
-      <w:r>
-        <w:rPr>
-          <w:rFonts w:ascii="Arial" w:eastAsia="Arial" w:hAnsi="Arial" w:cs="Arial"/>
-          <w:sz w:val="15"/>
-        </w:rPr>
-        <w:t>inverter_make</w:t>
-      </w:r>
-      <w:proofErr w:type="spellEnd"/>
-      <w:r>
-        <w:rPr>
-          <w:rFonts w:ascii="Arial" w:eastAsia="Arial" w:hAnsi="Arial" w:cs="Arial"/>
-          <w:sz w:val="15"/>
-        </w:rPr>
-        <w:t>}}</w:t>
-      </w:r>
-    </w:p>
-    <w:p>
-      <w:pPr>
-        <w:spacing w:after="190" w:line="265" w:lineRule="auto"/>
-        <w:ind w:left="658" w:right="1607" w:hanging="10"/>
-      </w:pPr>
-      <w:proofErr w:type="gramStart"/>
-      <w:r>
-        <w:rPr>
-          <w:rFonts w:ascii="Arial" w:eastAsia="Arial" w:hAnsi="Arial" w:cs="Arial"/>
-          <w:color w:val="545454"/>
-          <w:sz w:val="15"/>
-        </w:rPr>
-        <w:t>No .of</w:t>
-      </w:r>
-      <w:proofErr w:type="gramEnd"/>
-      <w:r>
-        <w:rPr>
-          <w:rFonts w:ascii="Arial" w:eastAsia="Arial" w:hAnsi="Arial" w:cs="Arial"/>
-          <w:color w:val="545454"/>
-          <w:sz w:val="15"/>
-        </w:rPr>
-        <w:t xml:space="preserve"> PV Modules</w:t>
-      </w:r>
-      <w:r>
-        <w:rPr>
-          <w:rFonts w:ascii="Times New Roman" w:eastAsia="Times New Roman" w:hAnsi="Times New Roman" w:cs="Times New Roman"/>
-          <w:color w:val="545454"/>
-          <w:sz w:val="15"/>
-        </w:rPr>
-        <w:t xml:space="preserve"> </w:t>
-      </w:r>
-      <w:r>
-        <w:rPr>
-          <w:rFonts w:ascii="Times New Roman" w:eastAsia="Times New Roman" w:hAnsi="Times New Roman" w:cs="Times New Roman"/>
-          <w:color w:val="545454"/>
-          <w:sz w:val="15"/>
-        </w:rPr>
-        <w:t xml:space="preserve">                                  </w:t>
-      </w:r>
-      <w:r>
-        <w:rPr>
-          <w:rFonts w:ascii="Arial" w:eastAsia="Arial" w:hAnsi="Arial" w:cs="Arial"/>
-          <w:sz w:val="15"/>
-        </w:rPr>
-        <w:t xml:space="preserve">                              </w:t>
-      </w:r>
-      <w:proofErr w:type="gramStart"/>
-      <w:r>
-        <w:rPr>
-          <w:rFonts w:ascii="Arial" w:eastAsia="Arial" w:hAnsi="Arial" w:cs="Arial"/>
-          <w:sz w:val="15"/>
-        </w:rPr>
-        <w:t xml:space="preserve">  </w:t>
-      </w:r>
-      <w:r>
-        <w:rPr>
-          <w:rFonts w:ascii="Times New Roman" w:eastAsia="Times New Roman" w:hAnsi="Times New Roman" w:cs="Times New Roman"/>
-          <w:color w:val="545454"/>
-          <w:sz w:val="15"/>
-        </w:rPr>
-        <w:t xml:space="preserve"> </w:t>
-      </w:r>
-      <w:r>
-        <w:rPr>
-          <w:rFonts w:ascii="Arial" w:eastAsia="Arial" w:hAnsi="Arial" w:cs="Arial"/>
-          <w:sz w:val="15"/>
-        </w:rPr>
-        <w:t>{</w:t>
-      </w:r>
-      <w:proofErr w:type="gramEnd"/>
-      <w:r>
-        <w:rPr>
-          <w:rFonts w:ascii="Arial" w:eastAsia="Arial" w:hAnsi="Arial" w:cs="Arial"/>
-          <w:sz w:val="15"/>
-        </w:rPr>
-        <w:t>{</w:t>
-      </w:r>
-      <w:proofErr w:type="spellStart"/>
-      <w:r>
-        <w:rPr>
-          <w:rFonts w:ascii="Arial" w:eastAsia="Arial" w:hAnsi="Arial" w:cs="Arial"/>
-          <w:sz w:val="15"/>
-        </w:rPr>
-        <w:t>module_count</w:t>
-      </w:r>
-      <w:proofErr w:type="spellEnd"/>
-      <w:r>
-        <w:rPr>
-          <w:rFonts w:ascii="Arial" w:eastAsia="Arial" w:hAnsi="Arial" w:cs="Arial"/>
-          <w:sz w:val="15"/>
-        </w:rPr>
-        <w:t>}}</w:t>
-      </w:r>
-    </w:p>
-    <w:p>
-      <w:pPr>
-        <w:spacing w:after="454" w:line="265" w:lineRule="auto"/>
-        <w:ind w:left="658" w:right="1607" w:hanging="10"/>
-      </w:pPr>
-      <w:r>
-        <w:rPr>
-          <w:rFonts w:ascii="Arial" w:eastAsia="Arial" w:hAnsi="Arial" w:cs="Arial"/>
-          <w:color w:val="545454"/>
-          <w:sz w:val="15"/>
-        </w:rPr>
-        <w:t>Module Capacity (</w:t>
-      </w:r>
-      <w:proofErr w:type="gramStart"/>
-      <w:r>
-        <w:rPr>
-          <w:rFonts w:ascii="Arial" w:eastAsia="Arial" w:hAnsi="Arial" w:cs="Arial"/>
-          <w:color w:val="545454"/>
-          <w:sz w:val="15"/>
-        </w:rPr>
-        <w:t>KW)</w:t>
-      </w:r>
-      <w:r>
-        <w:rPr>
-          <w:rFonts w:ascii="Times New Roman" w:eastAsia="Times New Roman" w:hAnsi="Times New Roman" w:cs="Times New Roman"/>
-          <w:color w:val="545454"/>
-          <w:sz w:val="15"/>
-        </w:rPr>
-        <w:t xml:space="preserve"> </w:t>
-      </w:r>
-      <w:r>
-        <w:rPr>
-          <w:rFonts w:ascii="Times New Roman" w:eastAsia="Times New Roman" w:hAnsi="Times New Roman" w:cs="Times New Roman"/>
-          <w:color w:val="545454"/>
-          <w:sz w:val="15"/>
-        </w:rPr>
-        <w:t xml:space="preserve">  </w:t>
-      </w:r>
-      <w:proofErr w:type="gramEnd"/>
-      <w:r>
-        <w:rPr>
-          <w:rFonts w:ascii="Times New Roman" w:eastAsia="Times New Roman" w:hAnsi="Times New Roman" w:cs="Times New Roman"/>
-          <w:color w:val="545454"/>
-          <w:sz w:val="15"/>
-        </w:rPr>
-        <w:t xml:space="preserve">                     </w:t>
-      </w:r>
-      <w:r>
-        <w:rPr>
-          <w:rFonts w:ascii="Arial" w:eastAsia="Arial" w:hAnsi="Arial" w:cs="Arial"/>
-          <w:sz w:val="15"/>
-        </w:rPr>
-        <w:t xml:space="preserve">                                </w:t>
-      </w:r>
-      <w:r>
-        <w:rPr>
-          <w:rFonts w:ascii="Times New Roman" w:eastAsia="Times New Roman" w:hAnsi="Times New Roman" w:cs="Times New Roman"/>
-          <w:color w:val="545454"/>
-          <w:sz w:val="15"/>
-        </w:rPr>
-        <w:t xml:space="preserve">   </w:t>
-      </w:r>
-      <w:proofErr w:type="gramStart"/>
-      <w:r>
-        <w:rPr>
-          <w:rFonts w:ascii="Times New Roman" w:eastAsia="Times New Roman" w:hAnsi="Times New Roman" w:cs="Times New Roman"/>
-          <w:color w:val="545454"/>
-          <w:sz w:val="15"/>
-        </w:rPr>
-        <w:t xml:space="preserve">   </w:t>
-      </w:r>
-      <w:r>
-        <w:rPr>
-          <w:rFonts w:ascii="Arial" w:eastAsia="Arial" w:hAnsi="Arial" w:cs="Arial"/>
-          <w:sz w:val="15"/>
-        </w:rPr>
-        <w:t>{</w:t>
-      </w:r>
-      <w:proofErr w:type="spellStart"/>
-      <w:proofErr w:type="gramEnd"/>
-      <w:r>
-        <w:rPr>
-          <w:rFonts w:ascii="Arial" w:eastAsia="Arial" w:hAnsi="Arial" w:cs="Arial"/>
-          <w:sz w:val="15"/>
-        </w:rPr>
-        <w:t>module_capacity_kw</w:t>
-      </w:r>
-      <w:proofErr w:type="spellEnd"/>
-      <w:r>
-        <w:rPr>
-          <w:rFonts w:ascii="Arial" w:eastAsia="Arial" w:hAnsi="Arial" w:cs="Arial"/>
-          <w:sz w:val="15"/>
-        </w:rPr>
-        <w:t>}</w:t>
-      </w:r>
-      <w:r>
-        <w:rPr>
-          <w:rFonts w:ascii="Arial" w:eastAsia="Arial" w:hAnsi="Arial" w:cs="Arial"/>
-          <w:sz w:val="15"/>
-        </w:rPr>
-        <w:t>}</w:t>
-      </w:r>
+        <w:sectPr>
+          <w:type w:val="continuous"/>
+          <w:pgSz w:w="11921" w:h="16860"/>
+          <w:pgMar w:top="567" w:right="1179" w:bottom="391" w:left="1179" w:header="720" w:footer="720" w:gutter="0"/>
+          <w:cols w:num="2" w:space="720"/>
+        </w:sectPr>
+      </w:pPr>
     </w:p>
     <w:p>
       <w:pPr>
         <w:pStyle w:val="Heading1"/>
-        <w:ind w:right="28"/>
+        <w:ind w:left="0" w:right="28" w:firstLine="0"/>
+        <w:jc w:val="left"/>
+        <w:sectPr>
+          <w:type w:val="continuous"/>
+          <w:pgSz w:w="11921" w:h="16860"/>
+          <w:pgMar w:top="567" w:right="1179" w:bottom="391" w:left="1179" w:header="720" w:footer="720" w:gutter="0"/>
+          <w:cols w:space="720"/>
+        </w:sectPr>
+      </w:pPr>
+    </w:p>
+    <w:p>
+      <w:pPr>
+        <w:pStyle w:val="Heading1"/>
+        <w:ind w:left="0" w:right="28" w:firstLine="0"/>
       </w:pPr>
       <w:r>
         <w:t>Proforma-A</w:t>
-      </w:r>
-      <w:r>
-        <w:rPr>
-          <w:color w:val="000000"/>
-        </w:rPr>
-        <w:t xml:space="preserve"> </w:t>
       </w:r>
     </w:p>
     <w:p>
@@ -2124,12 +1904,16 @@
     <w:p>
       <w:pPr>
         <w:spacing w:after="0"/>
-      </w:pPr>
-      <w:r>
         <w:rPr>
           <w:rFonts w:ascii="Arial" w:eastAsia="Arial" w:hAnsi="Arial" w:cs="Arial"/>
           <w:sz w:val="18"/>
         </w:rPr>
+      </w:pPr>
+      <w:r>
+        <w:rPr>
+          <w:rFonts w:ascii="Arial" w:eastAsia="Arial" w:hAnsi="Arial" w:cs="Arial"/>
+          <w:sz w:val="18"/>
+        </w:rPr>
         <w:t xml:space="preserve"> </w:t>
       </w:r>
       <w:r>
@@ -2147,7 +1931,62 @@
         <w:t>30.08.2025</w:t>
       </w:r>
     </w:p>
+    <w:p>
+      <w:pPr>
+        <w:spacing w:after="0"/>
+        <w:rPr>
+          <w:rFonts w:ascii="Arial" w:eastAsia="Arial" w:hAnsi="Arial" w:cs="Arial"/>
+          <w:sz w:val="18"/>
+        </w:rPr>
+      </w:pPr>
+    </w:p>
+    <w:p>
+      <w:pPr>
+        <w:spacing w:after="0"/>
+        <w:rPr>
+          <w:rFonts w:ascii="Arial" w:eastAsia="Arial" w:hAnsi="Arial" w:cs="Arial"/>
+          <w:sz w:val="18"/>
+        </w:rPr>
+      </w:pPr>
+    </w:p>
+    <w:p>
+      <w:pPr>
+        <w:spacing w:after="0"/>
+        <w:rPr>
+          <w:rFonts w:ascii="Arial" w:eastAsia="Arial" w:hAnsi="Arial" w:cs="Arial"/>
+          <w:sz w:val="18"/>
+        </w:rPr>
+      </w:pPr>
+    </w:p>
+    <w:p>
+      <w:pPr>
+        <w:spacing w:after="0"/>
+        <w:rPr>
+          <w:rFonts w:ascii="Arial" w:eastAsia="Arial" w:hAnsi="Arial" w:cs="Arial"/>
+          <w:sz w:val="18"/>
+        </w:rPr>
+      </w:pPr>
+    </w:p>
+    <w:p>
+      <w:pPr>
+        <w:spacing w:after="0"/>
+        <w:rPr>
+          <w:rFonts w:ascii="Arial" w:eastAsia="Arial" w:hAnsi="Arial" w:cs="Arial"/>
+          <w:sz w:val="18"/>
+        </w:rPr>
+      </w:pPr>
+    </w:p>
+    <w:p>
+      <w:pPr>
+        <w:spacing w:line="278" w:lineRule="auto"/>
+        <w:rPr>
+          <w:rFonts w:ascii="Arial" w:eastAsia="Arial" w:hAnsi="Arial" w:cs="Arial"/>
+          <w:sz w:val="15"/>
+        </w:rPr>
+      </w:pPr>
+    </w:p>
     <w:sectPr>
+      <w:type w:val="continuous"/>
       <w:pgSz w:w="11921" w:h="16860"/>
       <w:pgMar w:top="567" w:right="1179" w:bottom="391" w:left="1179" w:header="720" w:footer="720" w:gutter="0"/>
       <w:cols w:space="720"/>
@@ -2961,6 +2800,7 @@
   <w:style w:type="character" w:default="1" w:styleId="DefaultParagraphFont">
     <w:name w:val="Default Paragraph Font"/>
     <w:uiPriority w:val="1"/>
+    <w:semiHidden/>
     <w:unhideWhenUsed/>
   </w:style>
   <w:style w:type="table" w:default="1" w:styleId="TableNormal">

</xml_diff>

<commit_message>
Implement strict JavaScript text sanitizer to strip non-English characters from GPS addresses
</commit_message>
<xml_diff>
--- a/src/templates/2. Annexure- I_Proforma-A.docx
+++ b/src/templates/2. Annexure- I_Proforma-A.docx
@@ -159,17 +159,96 @@
         </w:numPr>
         <w:spacing w:after="218" w:line="265" w:lineRule="auto"/>
         <w:ind w:right="1607" w:hanging="360"/>
-        <w:rPr>
-          <w:rFonts w:ascii="Arial" w:eastAsia="Arial" w:hAnsi="Arial" w:cs="Arial"/>
-          <w:color w:val="545454"/>
-          <w:sz w:val="15"/>
-        </w:rPr>
-        <w:sectPr>
-          <w:pgSz w:w="11921" w:h="16860"/>
-          <w:pgMar w:top="567" w:right="1179" w:bottom="391" w:left="1179" w:header="720" w:footer="720" w:gutter="0"/>
-          <w:cols w:space="720"/>
-        </w:sectPr>
-      </w:pPr>
+      </w:pPr>
+      <w:r>
+        <w:rPr>
+          <w:rFonts w:ascii="Arial" w:eastAsia="Arial" w:hAnsi="Arial" w:cs="Arial"/>
+          <w:color w:val="545454"/>
+          <w:sz w:val="15"/>
+        </w:rPr>
+        <w:t>Name of the Consumer</w:t>
+      </w:r>
+      <w:r>
+        <w:rPr>
+          <w:rFonts w:ascii="Arial" w:eastAsia="Arial" w:hAnsi="Arial" w:cs="Arial"/>
+          <w:sz w:val="15"/>
+        </w:rPr>
+        <w:t xml:space="preserve"> </w:t>
+      </w:r>
+      <w:r>
+        <w:rPr>
+          <w:rFonts w:ascii="Arial" w:eastAsia="Arial" w:hAnsi="Arial" w:cs="Arial"/>
+          <w:sz w:val="15"/>
+        </w:rPr>
+        <w:t xml:space="preserve">            </w:t>
+      </w:r>
+      <w:r>
+        <w:rPr>
+          <w:rFonts w:ascii="Arial" w:eastAsia="Arial" w:hAnsi="Arial" w:cs="Arial"/>
+          <w:sz w:val="15"/>
+        </w:rPr>
+        <w:t xml:space="preserve">                                                       </w:t>
+      </w:r>
+      <w:r>
+        <w:rPr>
+          <w:rFonts w:ascii="Arial" w:eastAsia="Arial" w:hAnsi="Arial" w:cs="Arial"/>
+          <w:sz w:val="15"/>
+        </w:rPr>
+        <w:t xml:space="preserve">   </w:t>
+      </w:r>
+      <w:r>
+        <w:rPr>
+          <w:rFonts w:ascii="Arial" w:eastAsia="Arial" w:hAnsi="Arial" w:cs="Arial"/>
+          <w:sz w:val="15"/>
+        </w:rPr>
+        <w:t xml:space="preserve">            </w:t>
+      </w:r>
+      <w:proofErr w:type="gramStart"/>
+      <w:r>
+        <w:rPr>
+          <w:rFonts w:ascii="Arial" w:eastAsia="Arial" w:hAnsi="Arial" w:cs="Arial"/>
+          <w:sz w:val="15"/>
+        </w:rPr>
+        <w:t xml:space="preserve">   </w:t>
+      </w:r>
+      <w:r>
+        <w:rPr>
+          <w:rFonts w:ascii="Arial" w:eastAsia="Arial" w:hAnsi="Arial" w:cs="Arial"/>
+          <w:sz w:val="15"/>
+        </w:rPr>
+        <w:t>{</w:t>
+      </w:r>
+      <w:proofErr w:type="gramEnd"/>
+      <w:r>
+        <w:rPr>
+          <w:rFonts w:ascii="Arial" w:eastAsia="Arial" w:hAnsi="Arial" w:cs="Arial"/>
+          <w:sz w:val="15"/>
+        </w:rPr>
+        <w:t>{</w:t>
+      </w:r>
+      <w:proofErr w:type="spellStart"/>
+      <w:r>
+        <w:rPr>
+          <w:rFonts w:ascii="Arial" w:eastAsia="Arial" w:hAnsi="Arial" w:cs="Arial"/>
+          <w:sz w:val="15"/>
+        </w:rPr>
+        <w:t>consumer_name</w:t>
+      </w:r>
+      <w:proofErr w:type="spellEnd"/>
+      <w:r>
+        <w:rPr>
+          <w:rFonts w:ascii="Arial" w:eastAsia="Arial" w:hAnsi="Arial" w:cs="Arial"/>
+          <w:sz w:val="15"/>
+        </w:rPr>
+        <w:t>}}</w:t>
+      </w:r>
+      <w:r>
+        <w:rPr>
+          <w:rFonts w:ascii="Arial" w:eastAsia="Arial" w:hAnsi="Arial" w:cs="Arial"/>
+          <w:sz w:val="15"/>
+        </w:rPr>
+        <w:tab/>
+      </w:r>
     </w:p>
     <w:p>
       <w:pPr>
@@ -183,10 +262,93 @@
       <w:r>
         <w:rPr>
           <w:rFonts w:ascii="Arial" w:eastAsia="Arial" w:hAnsi="Arial" w:cs="Arial"/>
-          <w:color w:val="545454"/>
-          <w:sz w:val="15"/>
-        </w:rPr>
-        <w:t>Name of the Consumer</w:t>
+          <w:sz w:val="15"/>
+        </w:rPr>
+        <w:t xml:space="preserve"> </w:t>
+      </w:r>
+      <w:r>
+        <w:rPr>
+          <w:rFonts w:ascii="Arial" w:eastAsia="Arial" w:hAnsi="Arial" w:cs="Arial"/>
+          <w:color w:val="545454"/>
+          <w:sz w:val="15"/>
+        </w:rPr>
+        <w:t>Consumer Number</w:t>
+      </w:r>
+      <w:r>
+        <w:rPr>
+          <w:rFonts w:ascii="Arial" w:eastAsia="Arial" w:hAnsi="Arial" w:cs="Arial"/>
+          <w:color w:val="545454"/>
+          <w:sz w:val="15"/>
+        </w:rPr>
+        <w:t xml:space="preserve">                 </w:t>
+      </w:r>
+      <w:r>
+        <w:rPr>
+          <w:rFonts w:ascii="Arial" w:eastAsia="Arial" w:hAnsi="Arial" w:cs="Arial"/>
+          <w:color w:val="545454"/>
+          <w:sz w:val="15"/>
+        </w:rPr>
+        <w:t xml:space="preserve">                                                    </w:t>
+      </w:r>
+      <w:r>
+        <w:rPr>
+          <w:rFonts w:ascii="Arial" w:eastAsia="Arial" w:hAnsi="Arial" w:cs="Arial"/>
+          <w:color w:val="545454"/>
+          <w:sz w:val="15"/>
+        </w:rPr>
+        <w:t xml:space="preserve">       </w:t>
+      </w:r>
+      <w:r>
+        <w:rPr>
+          <w:rFonts w:ascii="Arial" w:eastAsia="Arial" w:hAnsi="Arial" w:cs="Arial"/>
+          <w:color w:val="545454"/>
+          <w:sz w:val="15"/>
+        </w:rPr>
+        <w:t xml:space="preserve">             </w:t>
+      </w:r>
+      <w:proofErr w:type="gramStart"/>
+      <w:r>
+        <w:rPr>
+          <w:rFonts w:ascii="Arial" w:eastAsia="Arial" w:hAnsi="Arial" w:cs="Arial"/>
+          <w:color w:val="545454"/>
+          <w:sz w:val="15"/>
+        </w:rPr>
+        <w:t xml:space="preserve">   </w:t>
+      </w:r>
+      <w:r>
+        <w:rPr>
+          <w:rFonts w:ascii="Arial" w:eastAsia="Arial" w:hAnsi="Arial" w:cs="Arial"/>
+          <w:color w:val="000000" w:themeColor="text1"/>
+          <w:sz w:val="15"/>
+        </w:rPr>
+        <w:t>{</w:t>
+      </w:r>
+      <w:proofErr w:type="gramEnd"/>
+      <w:r>
+        <w:rPr>
+          <w:rFonts w:ascii="Arial" w:eastAsia="Arial" w:hAnsi="Arial" w:cs="Arial"/>
+          <w:color w:val="000000" w:themeColor="text1"/>
+          <w:sz w:val="15"/>
+        </w:rPr>
+        <w:t>{</w:t>
+      </w:r>
+      <w:proofErr w:type="spellStart"/>
+      <w:r>
+        <w:rPr>
+          <w:rFonts w:ascii="Arial" w:eastAsia="Arial" w:hAnsi="Arial" w:cs="Arial"/>
+          <w:color w:val="000000" w:themeColor="text1"/>
+          <w:sz w:val="15"/>
+        </w:rPr>
+        <w:t>consumer_number</w:t>
+      </w:r>
+      <w:proofErr w:type="spellEnd"/>
+      <w:r>
+        <w:rPr>
+          <w:rFonts w:ascii="Arial" w:eastAsia="Arial" w:hAnsi="Arial" w:cs="Arial"/>
+          <w:color w:val="000000" w:themeColor="text1"/>
+          <w:sz w:val="15"/>
+        </w:rPr>
+        <w:t>}}</w:t>
       </w:r>
     </w:p>
     <w:p>
@@ -201,26 +363,254 @@
       <w:r>
         <w:rPr>
           <w:rFonts w:ascii="Arial" w:eastAsia="Arial" w:hAnsi="Arial" w:cs="Arial"/>
-          <w:sz w:val="15"/>
-        </w:rPr>
-        <w:t xml:space="preserve"> </w:t>
-      </w:r>
-      <w:r>
-        <w:rPr>
-          <w:rFonts w:ascii="Arial" w:eastAsia="Arial" w:hAnsi="Arial" w:cs="Arial"/>
-          <w:color w:val="545454"/>
-          <w:sz w:val="15"/>
-        </w:rPr>
-        <w:t>Consumer Number</w:t>
-      </w:r>
-      <w:r>
-        <w:rPr>
-          <w:rFonts w:ascii="Arial" w:eastAsia="Arial" w:hAnsi="Arial" w:cs="Arial"/>
-          <w:color w:val="545454"/>
-          <w:sz w:val="15"/>
-        </w:rPr>
-        <w:t xml:space="preserve">    </w:t>
-      </w:r>
+          <w:color w:val="545454"/>
+          <w:sz w:val="15"/>
+        </w:rPr>
+        <w:t>Mobile Number</w:t>
+      </w:r>
+      <w:r>
+        <w:rPr>
+          <w:rFonts w:ascii="Arial" w:eastAsia="Arial" w:hAnsi="Arial" w:cs="Arial"/>
+          <w:sz w:val="15"/>
+        </w:rPr>
+        <w:t xml:space="preserve"> </w:t>
+      </w:r>
+      <w:r>
+        <w:rPr>
+          <w:rFonts w:ascii="Arial" w:eastAsia="Arial" w:hAnsi="Arial" w:cs="Arial"/>
+          <w:sz w:val="15"/>
+        </w:rPr>
+        <w:tab/>
+        <w:t xml:space="preserve"> </w:t>
+      </w:r>
+      <w:r>
+        <w:rPr>
+          <w:rFonts w:ascii="Arial" w:eastAsia="Arial" w:hAnsi="Arial" w:cs="Arial"/>
+          <w:sz w:val="15"/>
+        </w:rPr>
+        <w:t xml:space="preserve">               </w:t>
+      </w:r>
+      <w:r>
+        <w:rPr>
+          <w:rFonts w:ascii="Arial" w:eastAsia="Arial" w:hAnsi="Arial" w:cs="Arial"/>
+          <w:sz w:val="15"/>
+        </w:rPr>
+        <w:t xml:space="preserve">                                                      </w:t>
+      </w:r>
+      <w:r>
+        <w:rPr>
+          <w:rFonts w:ascii="Arial" w:eastAsia="Arial" w:hAnsi="Arial" w:cs="Arial"/>
+          <w:sz w:val="15"/>
+        </w:rPr>
+        <w:t xml:space="preserve">  </w:t>
+      </w:r>
+      <w:r>
+        <w:rPr>
+          <w:rFonts w:ascii="Arial" w:eastAsia="Arial" w:hAnsi="Arial" w:cs="Arial"/>
+          <w:sz w:val="15"/>
+        </w:rPr>
+        <w:t xml:space="preserve">             </w:t>
+      </w:r>
+      <w:proofErr w:type="gramStart"/>
+      <w:r>
+        <w:rPr>
+          <w:rFonts w:ascii="Arial" w:eastAsia="Arial" w:hAnsi="Arial" w:cs="Arial"/>
+          <w:sz w:val="15"/>
+        </w:rPr>
+        <w:t xml:space="preserve">   </w:t>
+      </w:r>
+      <w:r>
+        <w:rPr>
+          <w:rFonts w:ascii="Arial" w:eastAsia="Arial" w:hAnsi="Arial" w:cs="Arial"/>
+          <w:sz w:val="15"/>
+        </w:rPr>
+        <w:t>{</w:t>
+      </w:r>
+      <w:proofErr w:type="gramEnd"/>
+      <w:r>
+        <w:rPr>
+          <w:rFonts w:ascii="Arial" w:eastAsia="Arial" w:hAnsi="Arial" w:cs="Arial"/>
+          <w:sz w:val="15"/>
+        </w:rPr>
+        <w:t>{</w:t>
+      </w:r>
+      <w:proofErr w:type="spellStart"/>
+      <w:r>
+        <w:rPr>
+          <w:rFonts w:ascii="Arial" w:eastAsia="Arial" w:hAnsi="Arial" w:cs="Arial"/>
+          <w:sz w:val="15"/>
+        </w:rPr>
+        <w:t>mobile_number</w:t>
+      </w:r>
+      <w:proofErr w:type="spellEnd"/>
+      <w:r>
+        <w:rPr>
+          <w:rFonts w:ascii="Arial" w:eastAsia="Arial" w:hAnsi="Arial" w:cs="Arial"/>
+          <w:sz w:val="15"/>
+        </w:rPr>
+        <w:t>}}</w:t>
+      </w:r>
+    </w:p>
+    <w:p>
+      <w:pPr>
+        <w:numPr>
+          <w:ilvl w:val="0"/>
+          <w:numId w:val="1"/>
+        </w:numPr>
+        <w:spacing w:after="77" w:line="265" w:lineRule="auto"/>
+        <w:ind w:right="1607" w:hanging="360"/>
+      </w:pPr>
+      <w:r>
+        <w:rPr>
+          <w:rFonts w:ascii="Arial" w:eastAsia="Arial" w:hAnsi="Arial" w:cs="Arial"/>
+          <w:color w:val="545454"/>
+          <w:sz w:val="15"/>
+        </w:rPr>
+        <w:t>E-mail</w:t>
+      </w:r>
+      <w:r>
+        <w:rPr>
+          <w:rFonts w:ascii="Arial" w:eastAsia="Arial" w:hAnsi="Arial" w:cs="Arial"/>
+          <w:sz w:val="15"/>
+        </w:rPr>
+        <w:t xml:space="preserve"> </w:t>
+      </w:r>
+      <w:r>
+        <w:rPr>
+          <w:rFonts w:ascii="Arial" w:eastAsia="Arial" w:hAnsi="Arial" w:cs="Arial"/>
+          <w:sz w:val="15"/>
+        </w:rPr>
+        <w:tab/>
+        <w:t xml:space="preserve"> </w:t>
+      </w:r>
+      <w:r>
+        <w:rPr>
+          <w:rFonts w:ascii="Arial" w:eastAsia="Arial" w:hAnsi="Arial" w:cs="Arial"/>
+          <w:sz w:val="15"/>
+        </w:rPr>
+        <w:t xml:space="preserve">                               </w:t>
+      </w:r>
+      <w:r>
+        <w:rPr>
+          <w:rFonts w:ascii="Arial" w:eastAsia="Arial" w:hAnsi="Arial" w:cs="Arial"/>
+          <w:sz w:val="15"/>
+        </w:rPr>
+        <w:t xml:space="preserve">                                                       </w:t>
+      </w:r>
+      <w:r>
+        <w:rPr>
+          <w:rFonts w:ascii="Arial" w:eastAsia="Arial" w:hAnsi="Arial" w:cs="Arial"/>
+          <w:sz w:val="15"/>
+        </w:rPr>
+        <w:t xml:space="preserve">  </w:t>
+      </w:r>
+      <w:r>
+        <w:rPr>
+          <w:rFonts w:ascii="Arial" w:eastAsia="Arial" w:hAnsi="Arial" w:cs="Arial"/>
+          <w:sz w:val="15"/>
+        </w:rPr>
+        <w:t xml:space="preserve">             </w:t>
+      </w:r>
+      <w:proofErr w:type="gramStart"/>
+      <w:r>
+        <w:rPr>
+          <w:rFonts w:ascii="Arial" w:eastAsia="Arial" w:hAnsi="Arial" w:cs="Arial"/>
+          <w:sz w:val="15"/>
+        </w:rPr>
+        <w:t xml:space="preserve">   </w:t>
+      </w:r>
+      <w:r>
+        <w:rPr>
+          <w:rFonts w:ascii="Arial" w:eastAsia="Arial" w:hAnsi="Arial" w:cs="Arial"/>
+          <w:sz w:val="15"/>
+        </w:rPr>
+        <w:t>{</w:t>
+      </w:r>
+      <w:proofErr w:type="gramEnd"/>
+      <w:r>
+        <w:rPr>
+          <w:rFonts w:ascii="Arial" w:eastAsia="Arial" w:hAnsi="Arial" w:cs="Arial"/>
+          <w:sz w:val="15"/>
+        </w:rPr>
+        <w:t>{email}}</w:t>
+      </w:r>
+    </w:p>
+    <w:p>
+      <w:pPr>
+        <w:numPr>
+          <w:ilvl w:val="0"/>
+          <w:numId w:val="1"/>
+        </w:numPr>
+        <w:spacing w:after="75" w:line="265" w:lineRule="auto"/>
+        <w:ind w:right="1607" w:hanging="360"/>
+        <w:rPr>
+          <w:rFonts w:ascii="Arial" w:eastAsia="Arial" w:hAnsi="Arial" w:cs="Arial"/>
+          <w:color w:val="545454"/>
+          <w:sz w:val="15"/>
+        </w:rPr>
+        <w:sectPr>
+          <w:pgSz w:w="11921" w:h="16860"/>
+          <w:pgMar w:top="567" w:right="1179" w:bottom="391" w:left="1179" w:header="720" w:footer="720" w:gutter="0"/>
+          <w:cols w:space="720"/>
+        </w:sectPr>
+      </w:pPr>
+    </w:p>
+    <w:p>
+      <w:pPr>
+        <w:numPr>
+          <w:ilvl w:val="0"/>
+          <w:numId w:val="1"/>
+        </w:numPr>
+        <w:spacing w:after="75" w:line="265" w:lineRule="auto"/>
+        <w:ind w:right="1607" w:hanging="360"/>
+      </w:pPr>
+      <w:r>
+        <w:rPr>
+          <w:rFonts w:ascii="Arial" w:eastAsia="Arial" w:hAnsi="Arial" w:cs="Arial"/>
+          <w:color w:val="545454"/>
+          <w:sz w:val="15"/>
+        </w:rPr>
+        <w:t>Address of Installation</w:t>
+      </w:r>
+      <w:r>
+        <w:rPr>
+          <w:rFonts w:ascii="Arial" w:eastAsia="Arial" w:hAnsi="Arial" w:cs="Arial"/>
+          <w:color w:val="545454"/>
+          <w:sz w:val="15"/>
+        </w:rPr>
+        <w:t xml:space="preserve"> </w:t>
+      </w:r>
+    </w:p>
+    <w:p>
+      <w:pPr>
+        <w:spacing w:after="75" w:line="265" w:lineRule="auto"/>
+        <w:ind w:left="688" w:right="1607"/>
+      </w:pPr>
+      <w:r>
+        <w:rPr>
+          <w:rFonts w:ascii="Arial" w:eastAsia="Arial" w:hAnsi="Arial" w:cs="Arial"/>
+          <w:sz w:val="15"/>
+        </w:rPr>
+        <w:t>{{address}}</w:t>
+      </w:r>
+    </w:p>
+    <w:p>
+      <w:pPr>
+        <w:spacing w:after="75" w:line="265" w:lineRule="auto"/>
+        <w:ind w:left="688" w:right="1607"/>
+        <w:sectPr>
+          <w:type w:val="continuous"/>
+          <w:pgSz w:w="11921" w:h="16860"/>
+          <w:pgMar w:top="567" w:right="1179" w:bottom="391" w:left="1179" w:header="720" w:footer="720" w:gutter="0"/>
+          <w:cols w:num="2" w:space="720"/>
+        </w:sectPr>
+      </w:pPr>
+    </w:p>
+    <w:p>
+      <w:pPr>
+        <w:spacing w:after="75" w:line="265" w:lineRule="auto"/>
+        <w:ind w:left="688" w:right="1607"/>
+      </w:pPr>
     </w:p>
     <w:p>
       <w:pPr>
@@ -237,79 +627,43 @@
           <w:color w:val="545454"/>
           <w:sz w:val="15"/>
         </w:rPr>
-        <w:t>Mobile Number</w:t>
-      </w:r>
-    </w:p>
-    <w:p>
-      <w:pPr>
-        <w:numPr>
-          <w:ilvl w:val="0"/>
-          <w:numId w:val="1"/>
-        </w:numPr>
-        <w:spacing w:after="77" w:line="265" w:lineRule="auto"/>
-        <w:ind w:right="1607" w:hanging="360"/>
-      </w:pPr>
-      <w:r>
-        <w:rPr>
-          <w:rFonts w:ascii="Arial" w:eastAsia="Arial" w:hAnsi="Arial" w:cs="Arial"/>
-          <w:color w:val="545454"/>
-          <w:sz w:val="15"/>
-        </w:rPr>
-        <w:t>E-mai</w:t>
-      </w:r>
-      <w:r>
-        <w:rPr>
-          <w:rFonts w:ascii="Arial" w:eastAsia="Arial" w:hAnsi="Arial" w:cs="Arial"/>
-          <w:color w:val="545454"/>
-          <w:sz w:val="15"/>
-        </w:rPr>
-        <w:t>l</w:t>
-      </w:r>
-    </w:p>
-    <w:p>
-      <w:pPr>
-        <w:numPr>
-          <w:ilvl w:val="0"/>
-          <w:numId w:val="1"/>
-        </w:numPr>
-        <w:spacing w:after="75" w:line="265" w:lineRule="auto"/>
-        <w:ind w:right="1607" w:hanging="360"/>
-      </w:pPr>
-      <w:r>
-        <w:rPr>
-          <w:rFonts w:ascii="Arial" w:eastAsia="Arial" w:hAnsi="Arial" w:cs="Arial"/>
-          <w:color w:val="545454"/>
-          <w:sz w:val="15"/>
-        </w:rPr>
-        <w:t>Address of Installatio</w:t>
-      </w:r>
-      <w:r>
-        <w:rPr>
-          <w:rFonts w:ascii="Arial" w:eastAsia="Arial" w:hAnsi="Arial" w:cs="Arial"/>
-          <w:color w:val="545454"/>
-          <w:sz w:val="15"/>
-        </w:rPr>
-        <w:t>n</w:t>
-      </w:r>
-    </w:p>
-    <w:p>
-      <w:pPr>
-        <w:spacing w:after="75" w:line="265" w:lineRule="auto"/>
-        <w:ind w:left="688" w:right="1607"/>
-      </w:pPr>
-      <w:r>
-        <w:rPr>
-          <w:rFonts w:ascii="Arial" w:eastAsia="Arial" w:hAnsi="Arial" w:cs="Arial"/>
-          <w:sz w:val="15"/>
-        </w:rPr>
-        <w:t xml:space="preserve">          </w:t>
-      </w:r>
-      <w:r>
-        <w:rPr>
-          <w:rFonts w:ascii="Arial" w:eastAsia="Arial" w:hAnsi="Arial" w:cs="Arial"/>
-          <w:sz w:val="15"/>
-        </w:rPr>
-        <w:t xml:space="preserve">                                                       </w:t>
+        <w:t>RE Arrangement Type</w:t>
+      </w:r>
+      <w:r>
+        <w:rPr>
+          <w:rFonts w:ascii="Arial" w:eastAsia="Arial" w:hAnsi="Arial" w:cs="Arial"/>
+          <w:sz w:val="15"/>
+        </w:rPr>
+        <w:t xml:space="preserve"> </w:t>
+      </w:r>
+      <w:r>
+        <w:rPr>
+          <w:rFonts w:ascii="Arial" w:eastAsia="Arial" w:hAnsi="Arial" w:cs="Arial"/>
+          <w:sz w:val="15"/>
+        </w:rPr>
+        <w:tab/>
+      </w:r>
+      <w:r>
+        <w:rPr>
+          <w:rFonts w:ascii="Arial" w:eastAsia="Arial" w:hAnsi="Arial" w:cs="Arial"/>
+          <w:sz w:val="15"/>
+        </w:rPr>
+        <w:t xml:space="preserve">                                                                      </w:t>
+      </w:r>
+      <w:r>
+        <w:rPr>
+          <w:rFonts w:ascii="Arial" w:eastAsia="Arial" w:hAnsi="Arial" w:cs="Arial"/>
+          <w:color w:val="545454"/>
+          <w:sz w:val="15"/>
+        </w:rPr>
+        <w:t>Net Metering Arrangement</w:t>
+      </w:r>
+      <w:r>
+        <w:rPr>
+          <w:rFonts w:ascii="Arial" w:eastAsia="Arial" w:hAnsi="Arial" w:cs="Arial"/>
+          <w:sz w:val="15"/>
+        </w:rPr>
+        <w:t xml:space="preserve"> </w:t>
       </w:r>
     </w:p>
     <w:p>
@@ -327,22 +681,82 @@
           <w:color w:val="545454"/>
           <w:sz w:val="15"/>
         </w:rPr>
-        <w:t>RE Arrangement Typ</w:t>
-      </w:r>
-      <w:r>
-        <w:rPr>
-          <w:rFonts w:ascii="Arial" w:eastAsia="Arial" w:hAnsi="Arial" w:cs="Arial"/>
-          <w:color w:val="545454"/>
-          <w:sz w:val="15"/>
-        </w:rPr>
-        <w:t>e</w:t>
-      </w:r>
-      <w:r>
-        <w:rPr>
-          <w:rFonts w:ascii="Arial" w:eastAsia="Arial" w:hAnsi="Arial" w:cs="Arial"/>
-          <w:sz w:val="15"/>
-        </w:rPr>
-        <w:t xml:space="preserve"> </w:t>
+        <w:t>RE Source</w:t>
+      </w:r>
+      <w:r>
+        <w:rPr>
+          <w:rFonts w:ascii="Arial" w:eastAsia="Arial" w:hAnsi="Arial" w:cs="Arial"/>
+          <w:sz w:val="15"/>
+        </w:rPr>
+        <w:t xml:space="preserve"> </w:t>
+      </w:r>
+      <w:r>
+        <w:rPr>
+          <w:rFonts w:ascii="Arial" w:eastAsia="Arial" w:hAnsi="Arial" w:cs="Arial"/>
+          <w:sz w:val="15"/>
+        </w:rPr>
+        <w:tab/>
+        <w:t xml:space="preserve"> </w:t>
+      </w:r>
+      <w:r>
+        <w:rPr>
+          <w:rFonts w:ascii="Arial" w:eastAsia="Arial" w:hAnsi="Arial" w:cs="Arial"/>
+          <w:sz w:val="15"/>
+        </w:rPr>
+        <w:t xml:space="preserve">                 </w:t>
+      </w:r>
+      <w:r>
+        <w:rPr>
+          <w:rFonts w:ascii="Arial" w:eastAsia="Arial" w:hAnsi="Arial" w:cs="Arial"/>
+          <w:sz w:val="15"/>
+        </w:rPr>
+        <w:t xml:space="preserve">                                                    </w:t>
+      </w:r>
+      <w:r>
+        <w:rPr>
+          <w:rFonts w:ascii="Arial" w:eastAsia="Arial" w:hAnsi="Arial" w:cs="Arial"/>
+          <w:sz w:val="15"/>
+        </w:rPr>
+        <w:t xml:space="preserve">              </w:t>
+      </w:r>
+      <w:proofErr w:type="gramStart"/>
+      <w:r>
+        <w:rPr>
+          <w:rFonts w:ascii="Arial" w:eastAsia="Arial" w:hAnsi="Arial" w:cs="Arial"/>
+          <w:sz w:val="15"/>
+        </w:rPr>
+        <w:t xml:space="preserve">   </w:t>
+      </w:r>
+      <w:r>
+        <w:rPr>
+          <w:rFonts w:ascii="Arial" w:eastAsia="Arial" w:hAnsi="Arial" w:cs="Arial"/>
+          <w:sz w:val="15"/>
+        </w:rPr>
+        <w:t>{</w:t>
+      </w:r>
+      <w:proofErr w:type="gramEnd"/>
+      <w:r>
+        <w:rPr>
+          <w:rFonts w:ascii="Arial" w:eastAsia="Arial" w:hAnsi="Arial" w:cs="Arial"/>
+          <w:sz w:val="15"/>
+        </w:rPr>
+        <w:t>{</w:t>
+      </w:r>
+      <w:proofErr w:type="spellStart"/>
+      <w:r>
+        <w:rPr>
+          <w:rFonts w:ascii="Arial" w:eastAsia="Arial" w:hAnsi="Arial" w:cs="Arial"/>
+          <w:sz w:val="15"/>
+        </w:rPr>
+        <w:t>re_source</w:t>
+      </w:r>
+      <w:proofErr w:type="spellEnd"/>
+      <w:r>
+        <w:rPr>
+          <w:rFonts w:ascii="Arial" w:eastAsia="Arial" w:hAnsi="Arial" w:cs="Arial"/>
+          <w:sz w:val="15"/>
+        </w:rPr>
+        <w:t>}}</w:t>
       </w:r>
     </w:p>
     <w:p>
@@ -360,7 +774,99 @@
           <w:color w:val="545454"/>
           <w:sz w:val="15"/>
         </w:rPr>
-        <w:t>RE Source</w:t>
+        <w:t xml:space="preserve">Sanctioned </w:t>
+      </w:r>
+      <w:proofErr w:type="gramStart"/>
+      <w:r>
+        <w:rPr>
+          <w:rFonts w:ascii="Arial" w:eastAsia="Arial" w:hAnsi="Arial" w:cs="Arial"/>
+          <w:color w:val="545454"/>
+          <w:sz w:val="15"/>
+        </w:rPr>
+        <w:t>Capacity(</w:t>
+      </w:r>
+      <w:proofErr w:type="gramEnd"/>
+      <w:r>
+        <w:rPr>
+          <w:rFonts w:ascii="Arial" w:eastAsia="Arial" w:hAnsi="Arial" w:cs="Arial"/>
+          <w:color w:val="545454"/>
+          <w:sz w:val="15"/>
+        </w:rPr>
+        <w:t>KW)</w:t>
+      </w:r>
+      <w:r>
+        <w:rPr>
+          <w:rFonts w:ascii="Arial" w:eastAsia="Arial" w:hAnsi="Arial" w:cs="Arial"/>
+          <w:sz w:val="15"/>
+        </w:rPr>
+        <w:t xml:space="preserve"> </w:t>
+      </w:r>
+      <w:r>
+        <w:rPr>
+          <w:rFonts w:ascii="Arial" w:eastAsia="Arial" w:hAnsi="Arial" w:cs="Arial"/>
+          <w:sz w:val="15"/>
+        </w:rPr>
+        <w:tab/>
+      </w:r>
+      <w:r>
+        <w:rPr>
+          <w:rFonts w:ascii="Arial" w:eastAsia="Arial" w:hAnsi="Arial" w:cs="Arial"/>
+          <w:sz w:val="15"/>
+        </w:rPr>
+        <w:t xml:space="preserve">                                                    </w:t>
+      </w:r>
+      <w:r>
+        <w:rPr>
+          <w:rFonts w:ascii="Arial" w:eastAsia="Arial" w:hAnsi="Arial" w:cs="Arial"/>
+          <w:sz w:val="15"/>
+        </w:rPr>
+        <w:t xml:space="preserve"> </w:t>
+      </w:r>
+      <w:r>
+        <w:rPr>
+          <w:rFonts w:ascii="Arial" w:eastAsia="Arial" w:hAnsi="Arial" w:cs="Arial"/>
+          <w:sz w:val="15"/>
+        </w:rPr>
+        <w:t xml:space="preserve">              </w:t>
+      </w:r>
+      <w:proofErr w:type="gramStart"/>
+      <w:r>
+        <w:rPr>
+          <w:rFonts w:ascii="Arial" w:eastAsia="Arial" w:hAnsi="Arial" w:cs="Arial"/>
+          <w:sz w:val="15"/>
+        </w:rPr>
+        <w:t xml:space="preserve">   </w:t>
+      </w:r>
+      <w:r>
+        <w:rPr>
+          <w:rFonts w:ascii="Arial" w:eastAsia="Arial" w:hAnsi="Arial" w:cs="Arial"/>
+          <w:sz w:val="15"/>
+        </w:rPr>
+        <w:t>{</w:t>
+      </w:r>
+      <w:proofErr w:type="gramEnd"/>
+      <w:r>
+        <w:rPr>
+          <w:rFonts w:ascii="Arial" w:eastAsia="Arial" w:hAnsi="Arial" w:cs="Arial"/>
+          <w:sz w:val="15"/>
+        </w:rPr>
+        <w:t>{</w:t>
+      </w:r>
+      <w:proofErr w:type="spellStart"/>
+      <w:r>
+        <w:rPr>
+          <w:rFonts w:ascii="Arial" w:eastAsia="Arial" w:hAnsi="Arial" w:cs="Arial"/>
+          <w:sz w:val="15"/>
+        </w:rPr>
+        <w:t>sanctioned_capacity</w:t>
+      </w:r>
+      <w:proofErr w:type="spellEnd"/>
+      <w:r>
+        <w:rPr>
+          <w:rFonts w:ascii="Arial" w:eastAsia="Arial" w:hAnsi="Arial" w:cs="Arial"/>
+          <w:sz w:val="15"/>
+        </w:rPr>
+        <w:t>}}</w:t>
       </w:r>
     </w:p>
     <w:p>
@@ -378,39 +884,42 @@
           <w:color w:val="545454"/>
           <w:sz w:val="15"/>
         </w:rPr>
-        <w:t xml:space="preserve">Sanctioned </w:t>
-      </w:r>
-      <w:proofErr w:type="gramStart"/>
-      <w:r>
-        <w:rPr>
-          <w:rFonts w:ascii="Arial" w:eastAsia="Arial" w:hAnsi="Arial" w:cs="Arial"/>
-          <w:color w:val="545454"/>
-          <w:sz w:val="15"/>
-        </w:rPr>
-        <w:t>Capacity(</w:t>
-      </w:r>
-      <w:proofErr w:type="gramEnd"/>
-      <w:r>
-        <w:rPr>
-          <w:rFonts w:ascii="Arial" w:eastAsia="Arial" w:hAnsi="Arial" w:cs="Arial"/>
-          <w:color w:val="545454"/>
-          <w:sz w:val="15"/>
-        </w:rPr>
-        <w:t>KW)</w:t>
-      </w:r>
-      <w:r>
-        <w:rPr>
-          <w:rFonts w:ascii="Arial" w:eastAsia="Arial" w:hAnsi="Arial" w:cs="Arial"/>
-          <w:sz w:val="15"/>
-        </w:rPr>
-        <w:t xml:space="preserve">                                         </w:t>
-      </w:r>
-      <w:r>
-        <w:rPr>
-          <w:rFonts w:ascii="Arial" w:eastAsia="Arial" w:hAnsi="Arial" w:cs="Arial"/>
-          <w:sz w:val="15"/>
-        </w:rPr>
-        <w:t xml:space="preserve"> </w:t>
+        <w:t>Capacity Type</w:t>
+      </w:r>
+      <w:r>
+        <w:rPr>
+          <w:rFonts w:ascii="Arial" w:eastAsia="Arial" w:hAnsi="Arial" w:cs="Arial"/>
+          <w:sz w:val="15"/>
+        </w:rPr>
+        <w:t xml:space="preserve"> </w:t>
+      </w:r>
+      <w:r>
+        <w:rPr>
+          <w:rFonts w:ascii="Arial" w:eastAsia="Arial" w:hAnsi="Arial" w:cs="Arial"/>
+          <w:sz w:val="15"/>
+        </w:rPr>
+        <w:tab/>
+      </w:r>
+      <w:r>
+        <w:rPr>
+          <w:rFonts w:ascii="Arial" w:eastAsia="Arial" w:hAnsi="Arial" w:cs="Arial"/>
+          <w:sz w:val="15"/>
+        </w:rPr>
+        <w:t xml:space="preserve">                                                                                </w:t>
+      </w:r>
+      <w:r>
+        <w:rPr>
+          <w:rFonts w:ascii="Arial" w:eastAsia="Arial" w:hAnsi="Arial" w:cs="Arial"/>
+          <w:sz w:val="15"/>
+        </w:rPr>
+        <w:t xml:space="preserve">       </w:t>
+      </w:r>
+      <w:r>
+        <w:rPr>
+          <w:rFonts w:ascii="Arial" w:eastAsia="Arial" w:hAnsi="Arial" w:cs="Arial"/>
+          <w:sz w:val="15"/>
+        </w:rPr>
+        <w:t>ROOFTOP</w:t>
       </w:r>
     </w:p>
     <w:p>
@@ -428,7 +937,7 @@
           <w:color w:val="545454"/>
           <w:sz w:val="15"/>
         </w:rPr>
-        <w:t>Capacity Type</w:t>
+        <w:t>Project Model</w:t>
       </w:r>
       <w:r>
         <w:rPr>
@@ -443,13 +952,74 @@
           <w:sz w:val="15"/>
         </w:rPr>
         <w:tab/>
-      </w:r>
-      <w:r>
-        <w:rPr>
-          <w:rFonts w:ascii="Arial" w:eastAsia="Arial" w:hAnsi="Arial" w:cs="Arial"/>
-          <w:sz w:val="15"/>
-        </w:rPr>
-        <w:t xml:space="preserve">                                                                                </w:t>
+        <w:t xml:space="preserve"> </w:t>
+      </w:r>
+      <w:r>
+        <w:rPr>
+          <w:rFonts w:ascii="Arial" w:eastAsia="Arial" w:hAnsi="Arial" w:cs="Arial"/>
+          <w:sz w:val="15"/>
+        </w:rPr>
+        <w:t xml:space="preserve">  </w:t>
+      </w:r>
+      <w:r>
+        <w:rPr>
+          <w:rFonts w:ascii="Arial" w:eastAsia="Arial" w:hAnsi="Arial" w:cs="Arial"/>
+          <w:sz w:val="15"/>
+        </w:rPr>
+        <w:t xml:space="preserve">                                                </w:t>
+      </w:r>
+      <w:r>
+        <w:rPr>
+          <w:rFonts w:ascii="Arial" w:eastAsia="Arial" w:hAnsi="Arial" w:cs="Arial"/>
+          <w:sz w:val="15"/>
+        </w:rPr>
+        <w:t xml:space="preserve">               </w:t>
+      </w:r>
+      <w:r>
+        <w:rPr>
+          <w:rFonts w:ascii="Arial" w:eastAsia="Arial" w:hAnsi="Arial" w:cs="Arial"/>
+          <w:sz w:val="15"/>
+        </w:rPr>
+        <w:t xml:space="preserve">                  </w:t>
+      </w:r>
+      <w:proofErr w:type="gramStart"/>
+      <w:r>
+        <w:rPr>
+          <w:rFonts w:ascii="Arial" w:eastAsia="Arial" w:hAnsi="Arial" w:cs="Arial"/>
+          <w:sz w:val="15"/>
+        </w:rPr>
+        <w:t xml:space="preserve">   </w:t>
+      </w:r>
+      <w:r>
+        <w:rPr>
+          <w:rFonts w:ascii="Arial" w:eastAsia="Arial" w:hAnsi="Arial" w:cs="Arial"/>
+          <w:sz w:val="15"/>
+        </w:rPr>
+        <w:t>{</w:t>
+      </w:r>
+      <w:proofErr w:type="gramEnd"/>
+      <w:r>
+        <w:rPr>
+          <w:rFonts w:ascii="Arial" w:eastAsia="Arial" w:hAnsi="Arial" w:cs="Arial"/>
+          <w:sz w:val="15"/>
+        </w:rPr>
+        <w:t>{</w:t>
+      </w:r>
+      <w:proofErr w:type="spellStart"/>
+      <w:r>
+        <w:rPr>
+          <w:rFonts w:ascii="Arial" w:eastAsia="Arial" w:hAnsi="Arial" w:cs="Arial"/>
+          <w:sz w:val="15"/>
+        </w:rPr>
+        <w:t>project_model</w:t>
+      </w:r>
+      <w:proofErr w:type="spellEnd"/>
+      <w:r>
+        <w:rPr>
+          <w:rFonts w:ascii="Arial" w:eastAsia="Arial" w:hAnsi="Arial" w:cs="Arial"/>
+          <w:sz w:val="15"/>
+        </w:rPr>
+        <w:t>}}</w:t>
       </w:r>
     </w:p>
     <w:p>
@@ -467,13 +1037,100 @@
           <w:color w:val="545454"/>
           <w:sz w:val="15"/>
         </w:rPr>
-        <w:t>Project Model</w:t>
-      </w:r>
-      <w:r>
-        <w:rPr>
-          <w:rFonts w:ascii="Arial" w:eastAsia="Arial" w:hAnsi="Arial" w:cs="Arial"/>
-          <w:sz w:val="15"/>
-        </w:rPr>
+        <w:t xml:space="preserve">RE installed </w:t>
+      </w:r>
+      <w:proofErr w:type="gramStart"/>
+      <w:r>
+        <w:rPr>
+          <w:rFonts w:ascii="Arial" w:eastAsia="Arial" w:hAnsi="Arial" w:cs="Arial"/>
+          <w:color w:val="545454"/>
+          <w:sz w:val="15"/>
+        </w:rPr>
+        <w:t>Capacity(</w:t>
+      </w:r>
+      <w:proofErr w:type="gramEnd"/>
+      <w:r>
+        <w:rPr>
+          <w:rFonts w:ascii="Arial" w:eastAsia="Arial" w:hAnsi="Arial" w:cs="Arial"/>
+          <w:color w:val="545454"/>
+          <w:sz w:val="15"/>
+        </w:rPr>
+        <w:t>Rooftop)(</w:t>
+      </w:r>
+      <w:proofErr w:type="gramStart"/>
+      <w:r>
+        <w:rPr>
+          <w:rFonts w:ascii="Arial" w:eastAsia="Arial" w:hAnsi="Arial" w:cs="Arial"/>
+          <w:color w:val="545454"/>
+          <w:sz w:val="15"/>
+        </w:rPr>
+        <w:t>KW)</w:t>
+      </w:r>
+      <w:r>
+        <w:rPr>
+          <w:rFonts w:ascii="Arial" w:eastAsia="Arial" w:hAnsi="Arial" w:cs="Arial"/>
+          <w:sz w:val="15"/>
+        </w:rPr>
+        <w:t xml:space="preserve"> </w:t>
+      </w:r>
+      <w:r>
+        <w:rPr>
+          <w:rFonts w:ascii="Arial" w:eastAsia="Arial" w:hAnsi="Arial" w:cs="Arial"/>
+          <w:sz w:val="15"/>
+        </w:rPr>
+        <w:t xml:space="preserve">  </w:t>
+      </w:r>
+      <w:proofErr w:type="gramEnd"/>
+      <w:r>
+        <w:rPr>
+          <w:rFonts w:ascii="Arial" w:eastAsia="Arial" w:hAnsi="Arial" w:cs="Arial"/>
+          <w:sz w:val="15"/>
+        </w:rPr>
+        <w:t xml:space="preserve">                                           </w:t>
+      </w:r>
+      <w:r>
+        <w:rPr>
+          <w:rFonts w:ascii="Arial" w:eastAsia="Arial" w:hAnsi="Arial" w:cs="Arial"/>
+          <w:sz w:val="15"/>
+        </w:rPr>
+        <w:t xml:space="preserve"> </w:t>
+      </w:r>
+      <w:r>
+        <w:rPr>
+          <w:rFonts w:ascii="Arial" w:eastAsia="Arial" w:hAnsi="Arial" w:cs="Arial"/>
+          <w:sz w:val="15"/>
+        </w:rPr>
+        <w:t xml:space="preserve">               </w:t>
+      </w:r>
+      <w:proofErr w:type="gramStart"/>
+      <w:r>
+        <w:rPr>
+          <w:rFonts w:ascii="Arial" w:eastAsia="Arial" w:hAnsi="Arial" w:cs="Arial"/>
+          <w:sz w:val="15"/>
+        </w:rPr>
+        <w:t xml:space="preserve">   </w:t>
+      </w:r>
+      <w:r>
+        <w:rPr>
+          <w:rFonts w:ascii="Arial" w:eastAsia="Arial" w:hAnsi="Arial" w:cs="Arial"/>
+          <w:sz w:val="15"/>
+        </w:rPr>
+        <w:t>{</w:t>
+      </w:r>
+      <w:proofErr w:type="gramEnd"/>
+      <w:r>
+        <w:rPr>
+          <w:rFonts w:ascii="Arial" w:eastAsia="Arial" w:hAnsi="Arial" w:cs="Arial"/>
+          <w:sz w:val="15"/>
+        </w:rPr>
+        <w:t>{capacity}}</w:t>
+      </w:r>
+      <w:r>
+        <w:rPr>
+          <w:rFonts w:ascii="Arial" w:eastAsia="Arial" w:hAnsi="Arial" w:cs="Arial"/>
+          <w:sz w:val="15"/>
+        </w:rPr>
+        <w:tab/>
         <w:t xml:space="preserve"> </w:t>
       </w:r>
     </w:p>
@@ -510,7 +1167,66 @@
           <w:color w:val="545454"/>
           <w:sz w:val="15"/>
         </w:rPr>
-        <w:t>Rooftop)(KW)</w:t>
+        <w:t xml:space="preserve">Rooftop + </w:t>
+      </w:r>
+      <w:proofErr w:type="gramStart"/>
+      <w:r>
+        <w:rPr>
+          <w:rFonts w:ascii="Arial" w:eastAsia="Arial" w:hAnsi="Arial" w:cs="Arial"/>
+          <w:color w:val="545454"/>
+          <w:sz w:val="15"/>
+        </w:rPr>
+        <w:t>Ground)(KW)</w:t>
+      </w:r>
+      <w:r>
+        <w:rPr>
+          <w:rFonts w:ascii="Arial" w:eastAsia="Arial" w:hAnsi="Arial" w:cs="Arial"/>
+          <w:sz w:val="15"/>
+        </w:rPr>
+        <w:t xml:space="preserve"> </w:t>
+      </w:r>
+      <w:r>
+        <w:rPr>
+          <w:rFonts w:ascii="Arial" w:eastAsia="Arial" w:hAnsi="Arial" w:cs="Arial"/>
+          <w:sz w:val="15"/>
+        </w:rPr>
+        <w:t xml:space="preserve">  </w:t>
+      </w:r>
+      <w:proofErr w:type="gramEnd"/>
+      <w:r>
+        <w:rPr>
+          <w:rFonts w:ascii="Arial" w:eastAsia="Arial" w:hAnsi="Arial" w:cs="Arial"/>
+          <w:sz w:val="15"/>
+        </w:rPr>
+        <w:t xml:space="preserve">                              </w:t>
+      </w:r>
+      <w:r>
+        <w:rPr>
+          <w:rFonts w:ascii="Arial" w:eastAsia="Arial" w:hAnsi="Arial" w:cs="Arial"/>
+          <w:sz w:val="15"/>
+        </w:rPr>
+        <w:t xml:space="preserve">  </w:t>
+      </w:r>
+      <w:r>
+        <w:rPr>
+          <w:rFonts w:ascii="Arial" w:eastAsia="Arial" w:hAnsi="Arial" w:cs="Arial"/>
+          <w:sz w:val="15"/>
+        </w:rPr>
+        <w:t xml:space="preserve">              </w:t>
+      </w:r>
+      <w:r>
+        <w:rPr>
+          <w:rFonts w:ascii="Arial" w:eastAsia="Arial" w:hAnsi="Arial" w:cs="Arial"/>
+          <w:sz w:val="15"/>
+        </w:rPr>
+        <w:t>N.A.</w:t>
+      </w:r>
+      <w:r>
+        <w:rPr>
+          <w:rFonts w:ascii="Arial" w:eastAsia="Arial" w:hAnsi="Arial" w:cs="Arial"/>
+          <w:sz w:val="15"/>
+        </w:rPr>
+        <w:t xml:space="preserve"> </w:t>
       </w:r>
     </w:p>
     <w:p>
@@ -546,32 +1262,7 @@
           <w:color w:val="545454"/>
           <w:sz w:val="15"/>
         </w:rPr>
-        <w:t>Ground)(KW)</w:t>
-      </w:r>
-      <w:r>
-        <w:rPr>
-          <w:rFonts w:ascii="Arial" w:eastAsia="Arial" w:hAnsi="Arial" w:cs="Arial"/>
-          <w:sz w:val="15"/>
-        </w:rPr>
-        <w:t xml:space="preserve">          </w:t>
-      </w:r>
-    </w:p>
-    <w:p>
-      <w:pPr>
-        <w:numPr>
-          <w:ilvl w:val="0"/>
-          <w:numId w:val="1"/>
-        </w:numPr>
-        <w:spacing w:after="218" w:line="265" w:lineRule="auto"/>
-        <w:ind w:right="1607" w:hanging="360"/>
-      </w:pPr>
-      <w:r>
-        <w:rPr>
-          <w:rFonts w:ascii="Arial" w:eastAsia="Arial" w:hAnsi="Arial" w:cs="Arial"/>
-          <w:color w:val="545454"/>
-          <w:sz w:val="15"/>
-        </w:rPr>
-        <w:t xml:space="preserve">RE installed </w:t>
+        <w:t>Ground)(</w:t>
       </w:r>
       <w:proofErr w:type="gramStart"/>
       <w:r>
@@ -580,41 +1271,50 @@
           <w:color w:val="545454"/>
           <w:sz w:val="15"/>
         </w:rPr>
-        <w:t>Capacity(</w:t>
+        <w:t>KW)</w:t>
+      </w:r>
+      <w:r>
+        <w:rPr>
+          <w:rFonts w:ascii="Arial" w:eastAsia="Arial" w:hAnsi="Arial" w:cs="Arial"/>
+          <w:sz w:val="15"/>
+        </w:rPr>
+        <w:t xml:space="preserve">  </w:t>
+      </w:r>
+      <w:r>
+        <w:rPr>
+          <w:rFonts w:ascii="Arial" w:eastAsia="Arial" w:hAnsi="Arial" w:cs="Arial"/>
+          <w:sz w:val="15"/>
+        </w:rPr>
+        <w:t xml:space="preserve"> </w:t>
       </w:r>
       <w:proofErr w:type="gramEnd"/>
       <w:r>
         <w:rPr>
           <w:rFonts w:ascii="Arial" w:eastAsia="Arial" w:hAnsi="Arial" w:cs="Arial"/>
-          <w:color w:val="545454"/>
-          <w:sz w:val="15"/>
-        </w:rPr>
-        <w:t xml:space="preserve">Rooftop + </w:t>
-      </w:r>
-      <w:proofErr w:type="gramStart"/>
-      <w:r>
-        <w:rPr>
-          <w:rFonts w:ascii="Arial" w:eastAsia="Arial" w:hAnsi="Arial" w:cs="Arial"/>
-          <w:color w:val="545454"/>
-          <w:sz w:val="15"/>
-        </w:rPr>
-        <w:t>Ground)(</w:t>
-      </w:r>
-      <w:proofErr w:type="gramEnd"/>
-      <w:r>
-        <w:rPr>
-          <w:rFonts w:ascii="Arial" w:eastAsia="Arial" w:hAnsi="Arial" w:cs="Arial"/>
-          <w:color w:val="545454"/>
-          <w:sz w:val="15"/>
-        </w:rPr>
-        <w:t>KW)</w:t>
-      </w:r>
-      <w:r>
-        <w:rPr>
-          <w:rFonts w:ascii="Arial" w:eastAsia="Arial" w:hAnsi="Arial" w:cs="Arial"/>
-          <w:sz w:val="15"/>
-        </w:rPr>
-        <w:t xml:space="preserve">       </w:t>
+          <w:sz w:val="15"/>
+        </w:rPr>
+        <w:t xml:space="preserve">                                              </w:t>
+      </w:r>
+      <w:r>
+        <w:rPr>
+          <w:rFonts w:ascii="Arial" w:eastAsia="Arial" w:hAnsi="Arial" w:cs="Arial"/>
+          <w:sz w:val="15"/>
+        </w:rPr>
+        <w:t xml:space="preserve">    </w:t>
+      </w:r>
+      <w:r>
+        <w:rPr>
+          <w:rFonts w:ascii="Arial" w:eastAsia="Arial" w:hAnsi="Arial" w:cs="Arial"/>
+          <w:sz w:val="15"/>
+        </w:rPr>
+        <w:t xml:space="preserve">             </w:t>
+      </w:r>
+      <w:r>
+        <w:rPr>
+          <w:rFonts w:ascii="Arial" w:eastAsia="Arial" w:hAnsi="Arial" w:cs="Arial"/>
+          <w:sz w:val="15"/>
+        </w:rPr>
+        <w:t>N.A.</w:t>
       </w:r>
     </w:p>
     <w:p>
@@ -634,24 +1334,17 @@
         </w:rPr>
         <w:t xml:space="preserve">Installation date </w:t>
       </w:r>
-    </w:p>
-    <w:p>
-      <w:pPr>
-        <w:spacing w:after="37" w:line="265" w:lineRule="auto"/>
-        <w:ind w:left="688" w:right="1607"/>
-      </w:pPr>
-      <w:r>
-        <w:rPr>
-          <w:rFonts w:ascii="Arial" w:eastAsia="Arial" w:hAnsi="Arial" w:cs="Arial"/>
-          <w:color w:val="545454"/>
-          <w:sz w:val="15"/>
-        </w:rPr>
-        <w:t xml:space="preserve"> </w:t>
-      </w:r>
-      <w:r>
-        <w:rPr>
-          <w:rFonts w:ascii="Arial" w:eastAsia="Arial" w:hAnsi="Arial" w:cs="Arial"/>
-          <w:color w:val="545454"/>
+      <w:r>
+        <w:rPr>
+          <w:rFonts w:ascii="Arial" w:eastAsia="Arial" w:hAnsi="Arial" w:cs="Arial"/>
+          <w:color w:val="545454"/>
+          <w:sz w:val="15"/>
+        </w:rPr>
+        <w:t xml:space="preserve">                                   </w:t>
+      </w:r>
+      <w:r>
+        <w:rPr>
+          <w:rFonts w:ascii="Arial" w:eastAsia="Arial" w:hAnsi="Arial" w:cs="Arial"/>
           <w:sz w:val="15"/>
         </w:rPr>
         <w:t xml:space="preserve">                                </w:t>
@@ -659,17 +1352,71 @@
       <w:r>
         <w:rPr>
           <w:rFonts w:ascii="Arial" w:eastAsia="Arial" w:hAnsi="Arial" w:cs="Arial"/>
-          <w:sz w:val="15"/>
-        </w:rPr>
-        <w:t xml:space="preserve">                                </w:t>
-      </w:r>
-      <w:r>
-        <w:rPr>
-          <w:rFonts w:ascii="Arial" w:eastAsia="Arial" w:hAnsi="Arial" w:cs="Arial"/>
           <w:color w:val="545454"/>
           <w:sz w:val="15"/>
         </w:rPr>
         <w:t xml:space="preserve">  </w:t>
+      </w:r>
+      <w:r>
+        <w:rPr>
+          <w:rFonts w:ascii="Arial" w:eastAsia="Arial" w:hAnsi="Arial" w:cs="Arial"/>
+          <w:color w:val="545454"/>
+          <w:sz w:val="15"/>
+        </w:rPr>
+        <w:t xml:space="preserve">                         </w:t>
+      </w:r>
+      <w:proofErr w:type="gramStart"/>
+      <w:r>
+        <w:rPr>
+          <w:rFonts w:ascii="Arial" w:eastAsia="Arial" w:hAnsi="Arial" w:cs="Arial"/>
+          <w:color w:val="545454"/>
+          <w:sz w:val="15"/>
+        </w:rPr>
+        <w:t xml:space="preserve">   </w:t>
+      </w:r>
+      <w:r>
+        <w:rPr>
+          <w:rFonts w:ascii="Arial" w:eastAsia="Arial" w:hAnsi="Arial" w:cs="Arial"/>
+          <w:sz w:val="15"/>
+        </w:rPr>
+        <w:t>{</w:t>
+      </w:r>
+      <w:proofErr w:type="gramEnd"/>
+      <w:r>
+        <w:rPr>
+          <w:rFonts w:ascii="Arial" w:eastAsia="Arial" w:hAnsi="Arial" w:cs="Arial"/>
+          <w:sz w:val="15"/>
+        </w:rPr>
+        <w:t>{</w:t>
+      </w:r>
+      <w:proofErr w:type="spellStart"/>
+      <w:r>
+        <w:rPr>
+          <w:rFonts w:ascii="Arial" w:eastAsia="Arial" w:hAnsi="Arial" w:cs="Arial"/>
+          <w:sz w:val="15"/>
+        </w:rPr>
+        <w:t>installation_date</w:t>
+      </w:r>
+      <w:proofErr w:type="spellEnd"/>
+      <w:r>
+        <w:rPr>
+          <w:rFonts w:ascii="Arial" w:eastAsia="Arial" w:hAnsi="Arial" w:cs="Arial"/>
+          <w:sz w:val="15"/>
+        </w:rPr>
+        <w:t>}}</w:t>
+      </w:r>
+    </w:p>
+    <w:p>
+      <w:pPr>
+        <w:spacing w:after="0"/>
+        <w:ind w:left="115" w:right="1607"/>
+      </w:pPr>
+      <w:r>
+        <w:rPr>
+          <w:rFonts w:ascii="Times New Roman" w:eastAsia="Times New Roman" w:hAnsi="Times New Roman" w:cs="Times New Roman"/>
+          <w:sz w:val="15"/>
+        </w:rPr>
+        <w:t xml:space="preserve"> </w:t>
       </w:r>
     </w:p>
     <w:p>
@@ -712,8 +1459,8 @@
     </w:p>
     <w:p>
       <w:pPr>
-        <w:spacing w:after="197"/>
-        <w:ind w:left="688" w:right="1607"/>
+        <w:spacing w:after="5" w:line="265" w:lineRule="auto"/>
+        <w:ind w:left="658" w:right="1607" w:hanging="10"/>
       </w:pPr>
       <w:r>
         <w:rPr>
@@ -738,24 +1485,329 @@
           <w:color w:val="545454"/>
           <w:sz w:val="15"/>
         </w:rPr>
+        <w:t xml:space="preserve"> </w:t>
+      </w:r>
+      <w:r>
+        <w:rPr>
+          <w:rFonts w:ascii="Times New Roman" w:eastAsia="Times New Roman" w:hAnsi="Times New Roman" w:cs="Times New Roman"/>
+          <w:color w:val="545454"/>
+          <w:sz w:val="15"/>
+        </w:rPr>
+        <w:t xml:space="preserve">  </w:t>
+      </w:r>
+      <w:proofErr w:type="gramEnd"/>
+      <w:r>
+        <w:rPr>
+          <w:rFonts w:ascii="Times New Roman" w:eastAsia="Times New Roman" w:hAnsi="Times New Roman" w:cs="Times New Roman"/>
+          <w:color w:val="545454"/>
+          <w:sz w:val="15"/>
+        </w:rPr>
+        <w:t xml:space="preserve">              </w:t>
+      </w:r>
+      <w:r>
+        <w:rPr>
+          <w:rFonts w:ascii="Times New Roman" w:eastAsia="Times New Roman" w:hAnsi="Times New Roman" w:cs="Times New Roman"/>
+          <w:color w:val="545454"/>
+          <w:sz w:val="15"/>
+        </w:rPr>
+        <w:t xml:space="preserve">                                               </w:t>
+      </w:r>
+      <w:r>
+        <w:rPr>
+          <w:rFonts w:ascii="Times New Roman" w:eastAsia="Times New Roman" w:hAnsi="Times New Roman" w:cs="Times New Roman"/>
+          <w:color w:val="545454"/>
+          <w:sz w:val="15"/>
+        </w:rPr>
+        <w:t xml:space="preserve">                                </w:t>
+      </w:r>
+      <w:proofErr w:type="gramStart"/>
+      <w:r>
+        <w:rPr>
+          <w:rFonts w:ascii="Times New Roman" w:eastAsia="Times New Roman" w:hAnsi="Times New Roman" w:cs="Times New Roman"/>
+          <w:color w:val="545454"/>
+          <w:sz w:val="15"/>
+        </w:rPr>
         <w:t xml:space="preserve">   </w:t>
       </w:r>
+      <w:r>
+        <w:rPr>
+          <w:rFonts w:ascii="Arial" w:eastAsia="Arial" w:hAnsi="Arial" w:cs="Arial"/>
+          <w:sz w:val="15"/>
+        </w:rPr>
+        <w:t>{</w:t>
+      </w:r>
+      <w:proofErr w:type="spellStart"/>
       <w:proofErr w:type="gramEnd"/>
       <w:r>
         <w:rPr>
+          <w:rFonts w:ascii="Arial" w:eastAsia="Arial" w:hAnsi="Arial" w:cs="Arial"/>
+          <w:sz w:val="15"/>
+        </w:rPr>
+        <w:t>capacity_of_inverter</w:t>
+      </w:r>
+      <w:proofErr w:type="spellEnd"/>
+      <w:r>
+        <w:rPr>
+          <w:rFonts w:ascii="Arial" w:eastAsia="Arial" w:hAnsi="Arial" w:cs="Arial"/>
+          <w:sz w:val="15"/>
+        </w:rPr>
+        <w:t>}</w:t>
+      </w:r>
+    </w:p>
+    <w:p>
+      <w:pPr>
+        <w:spacing w:after="0"/>
+        <w:ind w:right="1607"/>
+      </w:pPr>
+    </w:p>
+    <w:p>
+      <w:pPr>
+        <w:spacing w:after="218" w:line="265" w:lineRule="auto"/>
+        <w:ind w:left="658" w:right="1607" w:hanging="10"/>
+      </w:pPr>
+      <w:r>
+        <w:rPr>
+          <w:rFonts w:ascii="Arial" w:eastAsia="Arial" w:hAnsi="Arial" w:cs="Arial"/>
+          <w:color w:val="545454"/>
+          <w:sz w:val="15"/>
+        </w:rPr>
+        <w:t xml:space="preserve">Inverter Make </w:t>
+      </w:r>
+      <w:r>
+        <w:rPr>
+          <w:rFonts w:ascii="Arial" w:eastAsia="Arial" w:hAnsi="Arial" w:cs="Arial"/>
+          <w:color w:val="545454"/>
+          <w:sz w:val="15"/>
+        </w:rPr>
+        <w:t xml:space="preserve">                             </w:t>
+      </w:r>
+      <w:r>
+        <w:rPr>
+          <w:rFonts w:ascii="Arial" w:eastAsia="Arial" w:hAnsi="Arial" w:cs="Arial"/>
+          <w:sz w:val="15"/>
+        </w:rPr>
+        <w:t xml:space="preserve">                                </w:t>
+      </w:r>
+      <w:r>
+        <w:rPr>
+          <w:rFonts w:ascii="Arial" w:eastAsia="Arial" w:hAnsi="Arial" w:cs="Arial"/>
+          <w:color w:val="545454"/>
+          <w:sz w:val="15"/>
+        </w:rPr>
+        <w:t xml:space="preserve">           </w:t>
+      </w:r>
+      <w:r>
+        <w:rPr>
+          <w:rFonts w:ascii="Arial" w:eastAsia="Arial" w:hAnsi="Arial" w:cs="Arial"/>
+          <w:color w:val="545454"/>
+          <w:sz w:val="15"/>
+        </w:rPr>
+        <w:t xml:space="preserve">                           </w:t>
+      </w:r>
+      <w:proofErr w:type="gramStart"/>
+      <w:r>
+        <w:rPr>
+          <w:rFonts w:ascii="Arial" w:eastAsia="Arial" w:hAnsi="Arial" w:cs="Arial"/>
+          <w:color w:val="545454"/>
+          <w:sz w:val="15"/>
+        </w:rPr>
+        <w:t xml:space="preserve">   </w:t>
+      </w:r>
+      <w:r>
+        <w:rPr>
+          <w:rFonts w:ascii="Arial" w:eastAsia="Arial" w:hAnsi="Arial" w:cs="Arial"/>
+          <w:sz w:val="15"/>
+        </w:rPr>
+        <w:t>{</w:t>
+      </w:r>
+      <w:proofErr w:type="gramEnd"/>
+      <w:r>
+        <w:rPr>
+          <w:rFonts w:ascii="Arial" w:eastAsia="Arial" w:hAnsi="Arial" w:cs="Arial"/>
+          <w:sz w:val="15"/>
+        </w:rPr>
+        <w:t>{</w:t>
+      </w:r>
+      <w:proofErr w:type="spellStart"/>
+      <w:r>
+        <w:rPr>
+          <w:rFonts w:ascii="Arial" w:eastAsia="Arial" w:hAnsi="Arial" w:cs="Arial"/>
+          <w:sz w:val="15"/>
+        </w:rPr>
+        <w:t>inverter_make</w:t>
+      </w:r>
+      <w:proofErr w:type="spellEnd"/>
+      <w:r>
+        <w:rPr>
+          <w:rFonts w:ascii="Arial" w:eastAsia="Arial" w:hAnsi="Arial" w:cs="Arial"/>
+          <w:sz w:val="15"/>
+        </w:rPr>
+        <w:t>}}</w:t>
+      </w:r>
+    </w:p>
+    <w:p>
+      <w:pPr>
+        <w:spacing w:after="190" w:line="265" w:lineRule="auto"/>
+        <w:ind w:left="658" w:right="1607" w:hanging="10"/>
+      </w:pPr>
+      <w:proofErr w:type="gramStart"/>
+      <w:r>
+        <w:rPr>
+          <w:rFonts w:ascii="Arial" w:eastAsia="Arial" w:hAnsi="Arial" w:cs="Arial"/>
+          <w:color w:val="545454"/>
+          <w:sz w:val="15"/>
+        </w:rPr>
+        <w:t>No .of</w:t>
+      </w:r>
+      <w:proofErr w:type="gramEnd"/>
+      <w:r>
+        <w:rPr>
+          <w:rFonts w:ascii="Arial" w:eastAsia="Arial" w:hAnsi="Arial" w:cs="Arial"/>
+          <w:color w:val="545454"/>
+          <w:sz w:val="15"/>
+        </w:rPr>
+        <w:t xml:space="preserve"> PV Modules</w:t>
+      </w:r>
+      <w:r>
+        <w:rPr>
           <w:rFonts w:ascii="Times New Roman" w:eastAsia="Times New Roman" w:hAnsi="Times New Roman" w:cs="Times New Roman"/>
           <w:color w:val="545454"/>
           <w:sz w:val="15"/>
         </w:rPr>
-        <w:t xml:space="preserve">                                                            </w:t>
-      </w:r>
-      <w:r>
-        <w:rPr>
-          <w:rFonts w:ascii="Arial" w:eastAsia="Arial" w:hAnsi="Arial" w:cs="Arial"/>
-          <w:color w:val="545454"/>
-          <w:sz w:val="15"/>
-        </w:rPr>
-        <w:t xml:space="preserve">Inverter Make                              </w:t>
+        <w:t xml:space="preserve"> </w:t>
+      </w:r>
+      <w:r>
+        <w:rPr>
+          <w:rFonts w:ascii="Times New Roman" w:eastAsia="Times New Roman" w:hAnsi="Times New Roman" w:cs="Times New Roman"/>
+          <w:color w:val="545454"/>
+          <w:sz w:val="15"/>
+        </w:rPr>
+        <w:t xml:space="preserve">                                  </w:t>
+      </w:r>
+      <w:r>
+        <w:rPr>
+          <w:rFonts w:ascii="Arial" w:eastAsia="Arial" w:hAnsi="Arial" w:cs="Arial"/>
+          <w:sz w:val="15"/>
+        </w:rPr>
+        <w:t xml:space="preserve">                               </w:t>
+      </w:r>
+      <w:r>
+        <w:rPr>
+          <w:rFonts w:ascii="Arial" w:eastAsia="Arial" w:hAnsi="Arial" w:cs="Arial"/>
+          <w:sz w:val="15"/>
+        </w:rPr>
+        <w:t xml:space="preserve">              </w:t>
+      </w:r>
+      <w:r>
+        <w:rPr>
+          <w:rFonts w:ascii="Arial" w:eastAsia="Arial" w:hAnsi="Arial" w:cs="Arial"/>
+          <w:sz w:val="15"/>
+        </w:rPr>
+        <w:t xml:space="preserve"> </w:t>
+      </w:r>
+      <w:r>
+        <w:rPr>
+          <w:rFonts w:ascii="Times New Roman" w:eastAsia="Times New Roman" w:hAnsi="Times New Roman" w:cs="Times New Roman"/>
+          <w:color w:val="545454"/>
+          <w:sz w:val="15"/>
+        </w:rPr>
+        <w:t xml:space="preserve"> </w:t>
+      </w:r>
+      <w:r>
+        <w:rPr>
+          <w:rFonts w:ascii="Times New Roman" w:eastAsia="Times New Roman" w:hAnsi="Times New Roman" w:cs="Times New Roman"/>
+          <w:color w:val="545454"/>
+          <w:sz w:val="15"/>
+        </w:rPr>
+        <w:t xml:space="preserve">               </w:t>
+      </w:r>
+      <w:proofErr w:type="gramStart"/>
+      <w:r>
+        <w:rPr>
+          <w:rFonts w:ascii="Times New Roman" w:eastAsia="Times New Roman" w:hAnsi="Times New Roman" w:cs="Times New Roman"/>
+          <w:color w:val="545454"/>
+          <w:sz w:val="15"/>
+        </w:rPr>
+        <w:t xml:space="preserve">   </w:t>
+      </w:r>
+      <w:r>
+        <w:rPr>
+          <w:rFonts w:ascii="Arial" w:eastAsia="Arial" w:hAnsi="Arial" w:cs="Arial"/>
+          <w:sz w:val="15"/>
+        </w:rPr>
+        <w:t>{</w:t>
+      </w:r>
+      <w:proofErr w:type="gramEnd"/>
+      <w:r>
+        <w:rPr>
+          <w:rFonts w:ascii="Arial" w:eastAsia="Arial" w:hAnsi="Arial" w:cs="Arial"/>
+          <w:sz w:val="15"/>
+        </w:rPr>
+        <w:t>{</w:t>
+      </w:r>
+      <w:proofErr w:type="spellStart"/>
+      <w:r>
+        <w:rPr>
+          <w:rFonts w:ascii="Arial" w:eastAsia="Arial" w:hAnsi="Arial" w:cs="Arial"/>
+          <w:sz w:val="15"/>
+        </w:rPr>
+        <w:t>module_count</w:t>
+      </w:r>
+      <w:proofErr w:type="spellEnd"/>
+      <w:r>
+        <w:rPr>
+          <w:rFonts w:ascii="Arial" w:eastAsia="Arial" w:hAnsi="Arial" w:cs="Arial"/>
+          <w:sz w:val="15"/>
+        </w:rPr>
+        <w:t>}}</w:t>
+      </w:r>
+    </w:p>
+    <w:p>
+      <w:pPr>
+        <w:spacing w:after="454" w:line="265" w:lineRule="auto"/>
+        <w:ind w:left="658" w:right="1607" w:hanging="10"/>
+      </w:pPr>
+      <w:r>
+        <w:rPr>
+          <w:rFonts w:ascii="Arial" w:eastAsia="Arial" w:hAnsi="Arial" w:cs="Arial"/>
+          <w:color w:val="545454"/>
+          <w:sz w:val="15"/>
+        </w:rPr>
+        <w:t>Module Capacity (</w:t>
+      </w:r>
+      <w:proofErr w:type="gramStart"/>
+      <w:r>
+        <w:rPr>
+          <w:rFonts w:ascii="Arial" w:eastAsia="Arial" w:hAnsi="Arial" w:cs="Arial"/>
+          <w:color w:val="545454"/>
+          <w:sz w:val="15"/>
+        </w:rPr>
+        <w:t>KW)</w:t>
+      </w:r>
+      <w:r>
+        <w:rPr>
+          <w:rFonts w:ascii="Times New Roman" w:eastAsia="Times New Roman" w:hAnsi="Times New Roman" w:cs="Times New Roman"/>
+          <w:color w:val="545454"/>
+          <w:sz w:val="15"/>
+        </w:rPr>
+        <w:t xml:space="preserve"> </w:t>
+      </w:r>
+      <w:r>
+        <w:rPr>
+          <w:rFonts w:ascii="Times New Roman" w:eastAsia="Times New Roman" w:hAnsi="Times New Roman" w:cs="Times New Roman"/>
+          <w:color w:val="545454"/>
+          <w:sz w:val="15"/>
+        </w:rPr>
+        <w:t xml:space="preserve">  </w:t>
+      </w:r>
+      <w:proofErr w:type="gramEnd"/>
+      <w:r>
+        <w:rPr>
+          <w:rFonts w:ascii="Times New Roman" w:eastAsia="Times New Roman" w:hAnsi="Times New Roman" w:cs="Times New Roman"/>
+          <w:color w:val="545454"/>
+          <w:sz w:val="15"/>
+        </w:rPr>
+        <w:t xml:space="preserve">                     </w:t>
       </w:r>
       <w:r>
         <w:rPr>
@@ -764,93 +1816,46 @@
         </w:rPr>
         <w:t xml:space="preserve">                                </w:t>
       </w:r>
+      <w:r>
+        <w:rPr>
+          <w:rFonts w:ascii="Times New Roman" w:eastAsia="Times New Roman" w:hAnsi="Times New Roman" w:cs="Times New Roman"/>
+          <w:color w:val="545454"/>
+          <w:sz w:val="15"/>
+        </w:rPr>
+        <w:t xml:space="preserve">      </w:t>
+      </w:r>
+      <w:r>
+        <w:rPr>
+          <w:rFonts w:ascii="Times New Roman" w:eastAsia="Times New Roman" w:hAnsi="Times New Roman" w:cs="Times New Roman"/>
+          <w:color w:val="545454"/>
+          <w:sz w:val="15"/>
+        </w:rPr>
+        <w:t xml:space="preserve">                              </w:t>
+      </w:r>
       <w:proofErr w:type="gramStart"/>
       <w:r>
         <w:rPr>
-          <w:rFonts w:ascii="Arial" w:eastAsia="Arial" w:hAnsi="Arial" w:cs="Arial"/>
-          <w:color w:val="545454"/>
-          <w:sz w:val="15"/>
-        </w:rPr>
-        <w:t>No .of</w:t>
-      </w:r>
+          <w:rFonts w:ascii="Times New Roman" w:eastAsia="Times New Roman" w:hAnsi="Times New Roman" w:cs="Times New Roman"/>
+          <w:color w:val="545454"/>
+          <w:sz w:val="15"/>
+        </w:rPr>
+        <w:t xml:space="preserve">   </w:t>
+      </w:r>
+      <w:r>
+        <w:rPr>
+          <w:rFonts w:ascii="Arial" w:eastAsia="Arial" w:hAnsi="Arial" w:cs="Arial"/>
+          <w:sz w:val="15"/>
+        </w:rPr>
+        <w:t>{</w:t>
+      </w:r>
+      <w:proofErr w:type="spellStart"/>
       <w:proofErr w:type="gramEnd"/>
       <w:r>
         <w:rPr>
           <w:rFonts w:ascii="Arial" w:eastAsia="Arial" w:hAnsi="Arial" w:cs="Arial"/>
-          <w:color w:val="545454"/>
-          <w:sz w:val="15"/>
-        </w:rPr>
-        <w:t xml:space="preserve"> PV Modules</w:t>
-      </w:r>
-      <w:r>
-        <w:rPr>
-          <w:rFonts w:ascii="Times New Roman" w:eastAsia="Times New Roman" w:hAnsi="Times New Roman" w:cs="Times New Roman"/>
-          <w:color w:val="545454"/>
-          <w:sz w:val="15"/>
-        </w:rPr>
-        <w:t xml:space="preserve">                                   </w:t>
-      </w:r>
-      <w:r>
-        <w:rPr>
-          <w:rFonts w:ascii="Arial" w:eastAsia="Arial" w:hAnsi="Arial" w:cs="Arial"/>
-          <w:sz w:val="15"/>
-        </w:rPr>
-        <w:t xml:space="preserve">                                </w:t>
-      </w:r>
-      <w:r>
-        <w:rPr>
-          <w:rFonts w:ascii="Times New Roman" w:eastAsia="Times New Roman" w:hAnsi="Times New Roman" w:cs="Times New Roman"/>
-          <w:color w:val="545454"/>
-          <w:sz w:val="15"/>
-        </w:rPr>
-        <w:t xml:space="preserve"> </w:t>
-      </w:r>
-      <w:r>
-        <w:rPr>
-          <w:rFonts w:ascii="Arial" w:eastAsia="Arial" w:hAnsi="Arial" w:cs="Arial"/>
-          <w:color w:val="545454"/>
-          <w:sz w:val="15"/>
-        </w:rPr>
-        <w:t>Module Capacity (KW)</w:t>
-      </w:r>
-      <w:r>
-        <w:rPr>
-          <w:rFonts w:ascii="Times New Roman" w:eastAsia="Times New Roman" w:hAnsi="Times New Roman" w:cs="Times New Roman"/>
-          <w:color w:val="545454"/>
-          <w:sz w:val="15"/>
-        </w:rPr>
-        <w:t xml:space="preserve">       </w:t>
-      </w:r>
-      <w:r>
-        <w:rPr>
-          <w:rFonts w:ascii="Arial" w:eastAsia="Arial" w:hAnsi="Arial" w:cs="Arial"/>
-          <w:sz w:val="15"/>
-        </w:rPr>
-        <w:t xml:space="preserve">                                              </w:t>
-      </w:r>
-    </w:p>
-    <w:p>
-      <w:pPr>
-        <w:spacing w:after="0"/>
-        <w:rPr>
-          <w:rFonts w:ascii="Arial" w:eastAsia="Arial" w:hAnsi="Arial" w:cs="Arial"/>
-          <w:sz w:val="15"/>
-        </w:rPr>
-      </w:pPr>
-      <w:r>
-        <w:rPr>
-          <w:rFonts w:ascii="Arial" w:eastAsia="Arial" w:hAnsi="Arial" w:cs="Arial"/>
-          <w:sz w:val="15"/>
-        </w:rPr>
-        <w:t>{{</w:t>
-      </w:r>
-      <w:proofErr w:type="spellStart"/>
-      <w:r>
-        <w:rPr>
-          <w:rFonts w:ascii="Arial" w:eastAsia="Arial" w:hAnsi="Arial" w:cs="Arial"/>
-          <w:sz w:val="15"/>
-        </w:rPr>
-        <w:t>consumer_name</w:t>
+          <w:sz w:val="15"/>
+        </w:rPr>
+        <w:t>module_capacity_kw</w:t>
       </w:r>
       <w:proofErr w:type="spellEnd"/>
       <w:r>
@@ -858,658 +1863,29 @@
           <w:rFonts w:ascii="Arial" w:eastAsia="Arial" w:hAnsi="Arial" w:cs="Arial"/>
           <w:sz w:val="15"/>
         </w:rPr>
-        <w:t>}}</w:t>
-      </w:r>
-    </w:p>
-    <w:p>
-      <w:pPr>
-        <w:spacing w:after="0"/>
-        <w:rPr>
-          <w:rFonts w:ascii="Arial" w:eastAsia="Arial" w:hAnsi="Arial" w:cs="Arial"/>
-          <w:sz w:val="15"/>
-        </w:rPr>
-      </w:pPr>
-    </w:p>
-    <w:p>
-      <w:pPr>
-        <w:spacing w:after="0"/>
-        <w:rPr>
-          <w:rFonts w:ascii="Arial" w:eastAsia="Arial" w:hAnsi="Arial" w:cs="Arial"/>
-          <w:color w:val="000000" w:themeColor="text1"/>
-          <w:sz w:val="15"/>
-        </w:rPr>
-      </w:pPr>
-      <w:r>
-        <w:rPr>
-          <w:rFonts w:ascii="Arial" w:eastAsia="Arial" w:hAnsi="Arial" w:cs="Arial"/>
-          <w:color w:val="000000" w:themeColor="text1"/>
-          <w:sz w:val="15"/>
-        </w:rPr>
-        <w:t>{{</w:t>
-      </w:r>
-      <w:proofErr w:type="spellStart"/>
-      <w:r>
-        <w:rPr>
-          <w:rFonts w:ascii="Arial" w:eastAsia="Arial" w:hAnsi="Arial" w:cs="Arial"/>
-          <w:color w:val="000000" w:themeColor="text1"/>
-          <w:sz w:val="15"/>
-        </w:rPr>
-        <w:t>consumer_number</w:t>
-      </w:r>
-      <w:proofErr w:type="spellEnd"/>
-      <w:r>
-        <w:rPr>
-          <w:rFonts w:ascii="Arial" w:eastAsia="Arial" w:hAnsi="Arial" w:cs="Arial"/>
-          <w:color w:val="000000" w:themeColor="text1"/>
-          <w:sz w:val="15"/>
-        </w:rPr>
-        <w:t>}}</w:t>
-      </w:r>
-    </w:p>
-    <w:p>
-      <w:pPr>
-        <w:spacing w:after="0"/>
-        <w:rPr>
-          <w:rFonts w:ascii="Arial" w:eastAsia="Arial" w:hAnsi="Arial" w:cs="Arial"/>
-          <w:color w:val="000000" w:themeColor="text1"/>
-          <w:sz w:val="15"/>
-        </w:rPr>
-      </w:pPr>
-    </w:p>
-    <w:p>
-      <w:pPr>
-        <w:spacing w:after="0"/>
-        <w:rPr>
-          <w:rFonts w:ascii="Arial" w:eastAsia="Arial" w:hAnsi="Arial" w:cs="Arial"/>
-          <w:sz w:val="15"/>
-        </w:rPr>
-      </w:pPr>
-      <w:r>
-        <w:rPr>
-          <w:rFonts w:ascii="Arial" w:eastAsia="Arial" w:hAnsi="Arial" w:cs="Arial"/>
-          <w:sz w:val="15"/>
-        </w:rPr>
-        <w:t>{{</w:t>
-      </w:r>
-      <w:proofErr w:type="spellStart"/>
-      <w:r>
-        <w:rPr>
-          <w:rFonts w:ascii="Arial" w:eastAsia="Arial" w:hAnsi="Arial" w:cs="Arial"/>
-          <w:sz w:val="15"/>
-        </w:rPr>
-        <w:t>mobile_number</w:t>
-      </w:r>
-      <w:proofErr w:type="spellEnd"/>
-      <w:r>
-        <w:rPr>
-          <w:rFonts w:ascii="Arial" w:eastAsia="Arial" w:hAnsi="Arial" w:cs="Arial"/>
-          <w:sz w:val="15"/>
-        </w:rPr>
-        <w:t>}}</w:t>
-      </w:r>
-    </w:p>
-    <w:p>
-      <w:pPr>
-        <w:spacing w:after="0"/>
-        <w:rPr>
-          <w:rFonts w:ascii="Arial" w:eastAsia="Arial" w:hAnsi="Arial" w:cs="Arial"/>
-          <w:sz w:val="15"/>
-        </w:rPr>
-      </w:pPr>
-    </w:p>
-    <w:p>
-      <w:pPr>
-        <w:spacing w:after="0"/>
-        <w:rPr>
-          <w:rFonts w:ascii="Arial" w:eastAsia="Arial" w:hAnsi="Arial" w:cs="Arial"/>
-          <w:sz w:val="15"/>
-        </w:rPr>
-      </w:pPr>
-      <w:r>
-        <w:rPr>
-          <w:rFonts w:ascii="Arial" w:eastAsia="Arial" w:hAnsi="Arial" w:cs="Arial"/>
-          <w:sz w:val="15"/>
-        </w:rPr>
-        <w:t>{{email}}</w:t>
-      </w:r>
-    </w:p>
-    <w:p>
-      <w:pPr>
-        <w:spacing w:after="0"/>
-        <w:rPr>
-          <w:rFonts w:ascii="Arial" w:eastAsia="Arial" w:hAnsi="Arial" w:cs="Arial"/>
-          <w:sz w:val="15"/>
-        </w:rPr>
-      </w:pPr>
-      <w:r>
-        <w:rPr>
-          <w:rFonts w:ascii="Arial" w:eastAsia="Arial" w:hAnsi="Arial" w:cs="Arial"/>
-          <w:sz w:val="15"/>
-        </w:rPr>
-        <w:t>{{address}}</w:t>
-      </w:r>
-    </w:p>
-    <w:p>
-      <w:pPr>
-        <w:spacing w:after="218" w:line="265" w:lineRule="auto"/>
-        <w:ind w:right="1607"/>
-      </w:pPr>
-    </w:p>
-    <w:p>
-      <w:pPr>
-        <w:spacing w:after="0"/>
-        <w:rPr>
-          <w:rFonts w:ascii="Arial" w:eastAsia="Arial" w:hAnsi="Arial" w:cs="Arial"/>
-          <w:sz w:val="15"/>
-        </w:rPr>
-      </w:pPr>
-      <w:r>
-        <w:rPr>
-          <w:rFonts w:ascii="Arial" w:eastAsia="Arial" w:hAnsi="Arial" w:cs="Arial"/>
-          <w:color w:val="545454"/>
-          <w:sz w:val="15"/>
-        </w:rPr>
-        <w:t>Net Metering Arrangement</w:t>
-      </w:r>
-    </w:p>
-    <w:p>
-      <w:pPr>
-        <w:spacing w:after="0"/>
-        <w:ind w:left="115" w:right="1607"/>
-      </w:pPr>
-    </w:p>
-    <w:p>
-      <w:pPr>
-        <w:spacing w:after="0"/>
-        <w:rPr>
-          <w:rFonts w:ascii="Arial" w:eastAsia="Arial" w:hAnsi="Arial" w:cs="Arial"/>
-          <w:sz w:val="15"/>
-        </w:rPr>
-      </w:pPr>
-      <w:r>
-        <w:rPr>
-          <w:rFonts w:ascii="Arial" w:eastAsia="Arial" w:hAnsi="Arial" w:cs="Arial"/>
-          <w:sz w:val="15"/>
-        </w:rPr>
-        <w:t>{{</w:t>
-      </w:r>
-      <w:proofErr w:type="spellStart"/>
-      <w:r>
-        <w:rPr>
-          <w:rFonts w:ascii="Arial" w:eastAsia="Arial" w:hAnsi="Arial" w:cs="Arial"/>
-          <w:sz w:val="15"/>
-        </w:rPr>
-        <w:t>re_source</w:t>
-      </w:r>
-      <w:proofErr w:type="spellEnd"/>
-      <w:r>
-        <w:rPr>
-          <w:rFonts w:ascii="Arial" w:eastAsia="Arial" w:hAnsi="Arial" w:cs="Arial"/>
-          <w:sz w:val="15"/>
-        </w:rPr>
-        <w:t>}}</w:t>
-      </w:r>
-    </w:p>
-    <w:p>
-      <w:pPr>
-        <w:spacing w:after="0"/>
-        <w:rPr>
-          <w:rFonts w:ascii="Arial" w:eastAsia="Arial" w:hAnsi="Arial" w:cs="Arial"/>
-          <w:sz w:val="15"/>
-        </w:rPr>
-      </w:pPr>
-    </w:p>
-    <w:p>
-      <w:pPr>
-        <w:spacing w:after="0"/>
-        <w:rPr>
-          <w:rFonts w:ascii="Arial" w:eastAsia="Arial" w:hAnsi="Arial" w:cs="Arial"/>
-          <w:sz w:val="15"/>
-        </w:rPr>
-      </w:pPr>
-      <w:r>
-        <w:rPr>
-          <w:rFonts w:ascii="Arial" w:eastAsia="Arial" w:hAnsi="Arial" w:cs="Arial"/>
-          <w:sz w:val="15"/>
-        </w:rPr>
-        <w:t>{{</w:t>
-      </w:r>
-      <w:proofErr w:type="spellStart"/>
-      <w:r>
-        <w:rPr>
-          <w:rFonts w:ascii="Arial" w:eastAsia="Arial" w:hAnsi="Arial" w:cs="Arial"/>
-          <w:sz w:val="15"/>
-        </w:rPr>
-        <w:t>sanctioned_capacity</w:t>
-      </w:r>
-      <w:proofErr w:type="spellEnd"/>
-      <w:r>
-        <w:rPr>
-          <w:rFonts w:ascii="Arial" w:eastAsia="Arial" w:hAnsi="Arial" w:cs="Arial"/>
-          <w:sz w:val="15"/>
-        </w:rPr>
-        <w:t>}}</w:t>
-      </w:r>
-    </w:p>
-    <w:p>
-      <w:pPr>
-        <w:spacing w:after="0"/>
-        <w:rPr>
-          <w:rFonts w:ascii="Arial" w:eastAsia="Arial" w:hAnsi="Arial" w:cs="Arial"/>
-          <w:sz w:val="15"/>
-        </w:rPr>
-      </w:pPr>
-    </w:p>
-    <w:p>
-      <w:pPr>
-        <w:spacing w:after="0"/>
-        <w:rPr>
-          <w:rFonts w:ascii="Arial" w:eastAsia="Arial" w:hAnsi="Arial" w:cs="Arial"/>
-          <w:sz w:val="15"/>
-        </w:rPr>
-      </w:pPr>
-      <w:r>
-        <w:rPr>
-          <w:rFonts w:ascii="Arial" w:eastAsia="Arial" w:hAnsi="Arial" w:cs="Arial"/>
-          <w:sz w:val="15"/>
-        </w:rPr>
-        <w:t>ROOFTOP</w:t>
-      </w:r>
-    </w:p>
-    <w:p>
-      <w:pPr>
-        <w:spacing w:after="0"/>
-        <w:rPr>
-          <w:rFonts w:ascii="Arial" w:eastAsia="Arial" w:hAnsi="Arial" w:cs="Arial"/>
-          <w:sz w:val="15"/>
-        </w:rPr>
-      </w:pPr>
-    </w:p>
-    <w:p>
-      <w:pPr>
-        <w:spacing w:after="0"/>
-        <w:rPr>
-          <w:rFonts w:ascii="Arial" w:eastAsia="Arial" w:hAnsi="Arial" w:cs="Arial"/>
-          <w:sz w:val="15"/>
-        </w:rPr>
-      </w:pPr>
-      <w:r>
-        <w:rPr>
-          <w:rFonts w:ascii="Arial" w:eastAsia="Arial" w:hAnsi="Arial" w:cs="Arial"/>
-          <w:sz w:val="15"/>
-        </w:rPr>
-        <w:t>{{</w:t>
-      </w:r>
-      <w:proofErr w:type="spellStart"/>
-      <w:r>
-        <w:rPr>
-          <w:rFonts w:ascii="Arial" w:eastAsia="Arial" w:hAnsi="Arial" w:cs="Arial"/>
-          <w:sz w:val="15"/>
-        </w:rPr>
-        <w:t>project_model</w:t>
-      </w:r>
-      <w:proofErr w:type="spellEnd"/>
-      <w:r>
-        <w:rPr>
-          <w:rFonts w:ascii="Arial" w:eastAsia="Arial" w:hAnsi="Arial" w:cs="Arial"/>
-          <w:sz w:val="15"/>
-        </w:rPr>
-        <w:t>}}</w:t>
-      </w:r>
-    </w:p>
-    <w:p>
-      <w:pPr>
-        <w:spacing w:after="0"/>
-        <w:rPr>
-          <w:rFonts w:ascii="Arial" w:eastAsia="Arial" w:hAnsi="Arial" w:cs="Arial"/>
-          <w:sz w:val="15"/>
-        </w:rPr>
-      </w:pPr>
-    </w:p>
-    <w:p>
-      <w:pPr>
-        <w:spacing w:after="0"/>
-        <w:rPr>
-          <w:rFonts w:ascii="Arial" w:eastAsia="Arial" w:hAnsi="Arial" w:cs="Arial"/>
-          <w:sz w:val="15"/>
-        </w:rPr>
-      </w:pPr>
-    </w:p>
-    <w:p>
-      <w:pPr>
-        <w:spacing w:after="0"/>
-        <w:rPr>
-          <w:rFonts w:ascii="Arial" w:eastAsia="Arial" w:hAnsi="Arial" w:cs="Arial"/>
-          <w:sz w:val="15"/>
-        </w:rPr>
-      </w:pPr>
-      <w:r>
-        <w:rPr>
-          <w:rFonts w:ascii="Arial" w:eastAsia="Arial" w:hAnsi="Arial" w:cs="Arial"/>
-          <w:sz w:val="15"/>
-        </w:rPr>
-        <w:t>{{capacity}}</w:t>
-      </w:r>
-    </w:p>
-    <w:p>
-      <w:pPr>
-        <w:spacing w:after="0"/>
-        <w:rPr>
-          <w:rFonts w:ascii="Arial" w:eastAsia="Arial" w:hAnsi="Arial" w:cs="Arial"/>
-          <w:sz w:val="15"/>
-        </w:rPr>
-      </w:pPr>
-    </w:p>
-    <w:p>
-      <w:pPr>
-        <w:spacing w:after="0"/>
-        <w:rPr>
-          <w:rFonts w:ascii="Arial" w:eastAsia="Arial" w:hAnsi="Arial" w:cs="Arial"/>
-          <w:sz w:val="15"/>
-        </w:rPr>
-      </w:pPr>
-    </w:p>
-    <w:p>
-      <w:pPr>
-        <w:spacing w:after="0"/>
-        <w:rPr>
-          <w:rFonts w:ascii="Arial" w:eastAsia="Arial" w:hAnsi="Arial" w:cs="Arial"/>
-          <w:sz w:val="15"/>
-        </w:rPr>
-      </w:pPr>
-    </w:p>
-    <w:p>
-      <w:pPr>
-        <w:spacing w:after="0"/>
-        <w:rPr>
-          <w:rFonts w:ascii="Arial" w:eastAsia="Arial" w:hAnsi="Arial" w:cs="Arial"/>
-          <w:sz w:val="15"/>
-        </w:rPr>
-      </w:pPr>
-      <w:r>
-        <w:rPr>
-          <w:rFonts w:ascii="Arial" w:eastAsia="Arial" w:hAnsi="Arial" w:cs="Arial"/>
-          <w:sz w:val="15"/>
-        </w:rPr>
-        <w:t>N.A.</w:t>
-      </w:r>
-    </w:p>
-    <w:p>
-      <w:pPr>
-        <w:spacing w:after="0"/>
-        <w:rPr>
-          <w:rFonts w:ascii="Arial" w:eastAsia="Arial" w:hAnsi="Arial" w:cs="Arial"/>
-          <w:sz w:val="15"/>
-        </w:rPr>
-      </w:pPr>
-    </w:p>
-    <w:p>
-      <w:pPr>
-        <w:spacing w:after="0"/>
-        <w:rPr>
-          <w:rFonts w:ascii="Arial" w:eastAsia="Arial" w:hAnsi="Arial" w:cs="Arial"/>
-          <w:sz w:val="15"/>
-        </w:rPr>
-      </w:pPr>
-    </w:p>
-    <w:p>
-      <w:pPr>
-        <w:spacing w:after="0"/>
-        <w:rPr>
-          <w:rFonts w:ascii="Arial" w:eastAsia="Arial" w:hAnsi="Arial" w:cs="Arial"/>
-          <w:sz w:val="15"/>
-        </w:rPr>
-      </w:pPr>
-      <w:r>
-        <w:rPr>
-          <w:rFonts w:ascii="Arial" w:eastAsia="Arial" w:hAnsi="Arial" w:cs="Arial"/>
-          <w:sz w:val="15"/>
-        </w:rPr>
-        <w:t>N.A.</w:t>
-      </w:r>
-    </w:p>
-    <w:p>
-      <w:pPr>
-        <w:spacing w:after="0"/>
-        <w:rPr>
-          <w:rFonts w:ascii="Arial" w:eastAsia="Arial" w:hAnsi="Arial" w:cs="Arial"/>
-          <w:sz w:val="15"/>
-        </w:rPr>
-      </w:pPr>
-    </w:p>
-    <w:p>
-      <w:pPr>
-        <w:spacing w:after="0"/>
-        <w:rPr>
-          <w:rFonts w:ascii="Arial" w:eastAsia="Arial" w:hAnsi="Arial" w:cs="Arial"/>
-          <w:sz w:val="15"/>
-        </w:rPr>
-      </w:pPr>
-    </w:p>
-    <w:p>
-      <w:pPr>
-        <w:spacing w:after="0"/>
-        <w:rPr>
-          <w:rFonts w:ascii="Arial" w:eastAsia="Arial" w:hAnsi="Arial" w:cs="Arial"/>
-          <w:sz w:val="15"/>
-        </w:rPr>
-      </w:pPr>
-      <w:r>
-        <w:rPr>
-          <w:rFonts w:ascii="Arial" w:eastAsia="Arial" w:hAnsi="Arial" w:cs="Arial"/>
-          <w:sz w:val="15"/>
-        </w:rPr>
-        <w:t>{{</w:t>
-      </w:r>
-      <w:proofErr w:type="spellStart"/>
-      <w:r>
-        <w:rPr>
-          <w:rFonts w:ascii="Arial" w:eastAsia="Arial" w:hAnsi="Arial" w:cs="Arial"/>
-          <w:sz w:val="15"/>
-        </w:rPr>
-        <w:t>installation_date</w:t>
-      </w:r>
-      <w:proofErr w:type="spellEnd"/>
-      <w:r>
-        <w:rPr>
-          <w:rFonts w:ascii="Arial" w:eastAsia="Arial" w:hAnsi="Arial" w:cs="Arial"/>
-          <w:sz w:val="15"/>
-        </w:rPr>
-        <w:t>}}</w:t>
-      </w:r>
-    </w:p>
-    <w:p>
-      <w:pPr>
-        <w:spacing w:after="0"/>
-        <w:rPr>
-          <w:rFonts w:ascii="Arial" w:eastAsia="Arial" w:hAnsi="Arial" w:cs="Arial"/>
-          <w:sz w:val="15"/>
-        </w:rPr>
-      </w:pPr>
-    </w:p>
-    <w:p>
-      <w:pPr>
-        <w:spacing w:after="0"/>
-        <w:rPr>
-          <w:rFonts w:ascii="Arial" w:eastAsia="Arial" w:hAnsi="Arial" w:cs="Arial"/>
-          <w:sz w:val="15"/>
-        </w:rPr>
-      </w:pPr>
-    </w:p>
-    <w:p>
-      <w:pPr>
-        <w:spacing w:after="0"/>
-        <w:rPr>
-          <w:rFonts w:ascii="Arial" w:eastAsia="Arial" w:hAnsi="Arial" w:cs="Arial"/>
-          <w:sz w:val="15"/>
-        </w:rPr>
-      </w:pPr>
-    </w:p>
-    <w:p>
-      <w:pPr>
-        <w:spacing w:after="0"/>
-        <w:rPr>
-          <w:rFonts w:ascii="Arial" w:eastAsia="Arial" w:hAnsi="Arial" w:cs="Arial"/>
-          <w:sz w:val="15"/>
-        </w:rPr>
-      </w:pPr>
-      <w:r>
-        <w:rPr>
-          <w:rFonts w:ascii="Arial" w:eastAsia="Arial" w:hAnsi="Arial" w:cs="Arial"/>
-          <w:sz w:val="15"/>
-        </w:rPr>
-        <w:t>{</w:t>
-      </w:r>
-      <w:proofErr w:type="spellStart"/>
-      <w:r>
-        <w:rPr>
-          <w:rFonts w:ascii="Arial" w:eastAsia="Arial" w:hAnsi="Arial" w:cs="Arial"/>
-          <w:sz w:val="15"/>
-        </w:rPr>
-        <w:t>capacity_of_inverter</w:t>
-      </w:r>
-      <w:proofErr w:type="spellEnd"/>
-      <w:r>
-        <w:rPr>
-          <w:rFonts w:ascii="Arial" w:eastAsia="Arial" w:hAnsi="Arial" w:cs="Arial"/>
-          <w:sz w:val="15"/>
-        </w:rPr>
         <w:t>}</w:t>
       </w:r>
-    </w:p>
-    <w:p>
-      <w:pPr>
-        <w:spacing w:after="0"/>
-        <w:rPr>
-          <w:rFonts w:ascii="Arial" w:eastAsia="Arial" w:hAnsi="Arial" w:cs="Arial"/>
-          <w:sz w:val="15"/>
-        </w:rPr>
-      </w:pPr>
-      <w:r>
-        <w:rPr>
-          <w:rFonts w:ascii="Arial" w:eastAsia="Arial" w:hAnsi="Arial" w:cs="Arial"/>
-          <w:sz w:val="15"/>
-        </w:rPr>
-        <w:t>{{</w:t>
-      </w:r>
-      <w:proofErr w:type="spellStart"/>
-      <w:r>
-        <w:rPr>
-          <w:rFonts w:ascii="Arial" w:eastAsia="Arial" w:hAnsi="Arial" w:cs="Arial"/>
-          <w:sz w:val="15"/>
-        </w:rPr>
-        <w:t>inverter_make</w:t>
-      </w:r>
-      <w:proofErr w:type="spellEnd"/>
-      <w:r>
-        <w:rPr>
-          <w:rFonts w:ascii="Arial" w:eastAsia="Arial" w:hAnsi="Arial" w:cs="Arial"/>
-          <w:sz w:val="15"/>
-        </w:rPr>
-        <w:t>}}</w:t>
-      </w:r>
-    </w:p>
-    <w:p>
-      <w:pPr>
-        <w:spacing w:after="0"/>
-        <w:rPr>
-          <w:rFonts w:ascii="Arial" w:eastAsia="Arial" w:hAnsi="Arial" w:cs="Arial"/>
-          <w:sz w:val="15"/>
-        </w:rPr>
-      </w:pPr>
-      <w:r>
-        <w:rPr>
-          <w:rFonts w:ascii="Arial" w:eastAsia="Arial" w:hAnsi="Arial" w:cs="Arial"/>
-          <w:sz w:val="15"/>
-        </w:rPr>
-        <w:t>{{</w:t>
-      </w:r>
-      <w:proofErr w:type="spellStart"/>
-      <w:r>
-        <w:rPr>
-          <w:rFonts w:ascii="Arial" w:eastAsia="Arial" w:hAnsi="Arial" w:cs="Arial"/>
-          <w:sz w:val="15"/>
-        </w:rPr>
-        <w:t>module_count</w:t>
-      </w:r>
-      <w:proofErr w:type="spellEnd"/>
-      <w:r>
-        <w:rPr>
-          <w:rFonts w:ascii="Arial" w:eastAsia="Arial" w:hAnsi="Arial" w:cs="Arial"/>
-          <w:sz w:val="15"/>
-        </w:rPr>
-        <w:t>}}</w:t>
-      </w:r>
-    </w:p>
-    <w:p>
-      <w:pPr>
-        <w:spacing w:after="0"/>
-        <w:rPr>
-          <w:rFonts w:ascii="Arial" w:eastAsia="Arial" w:hAnsi="Arial" w:cs="Arial"/>
-          <w:sz w:val="15"/>
-        </w:rPr>
-      </w:pPr>
-      <w:r>
-        <w:rPr>
-          <w:rFonts w:ascii="Arial" w:eastAsia="Arial" w:hAnsi="Arial" w:cs="Arial"/>
-          <w:sz w:val="15"/>
-        </w:rPr>
-        <w:t>{</w:t>
-      </w:r>
-      <w:proofErr w:type="spellStart"/>
-      <w:r>
-        <w:rPr>
-          <w:rFonts w:ascii="Arial" w:eastAsia="Arial" w:hAnsi="Arial" w:cs="Arial"/>
-          <w:sz w:val="15"/>
-        </w:rPr>
-        <w:t>module_capacity_kw</w:t>
-      </w:r>
-      <w:proofErr w:type="spellEnd"/>
-      <w:r>
-        <w:rPr>
-          <w:rFonts w:ascii="Arial" w:eastAsia="Arial" w:hAnsi="Arial" w:cs="Arial"/>
-          <w:sz w:val="15"/>
-        </w:rPr>
-        <w:t>}}</w:t>
-      </w:r>
-    </w:p>
-    <w:p>
-      <w:pPr>
-        <w:spacing w:after="454" w:line="265" w:lineRule="auto"/>
-        <w:ind w:right="1607"/>
-        <w:rPr>
-          <w:rFonts w:ascii="Times New Roman" w:eastAsia="Times New Roman" w:hAnsi="Times New Roman" w:cs="Times New Roman"/>
-          <w:color w:val="545454"/>
-          <w:sz w:val="15"/>
-        </w:rPr>
-        <w:sectPr>
-          <w:type w:val="continuous"/>
-          <w:pgSz w:w="11921" w:h="16860"/>
-          <w:pgMar w:top="567" w:right="1179" w:bottom="391" w:left="1179" w:header="720" w:footer="720" w:gutter="0"/>
-          <w:cols w:num="2" w:space="720"/>
-        </w:sectPr>
-      </w:pPr>
+      <w:r>
+        <w:rPr>
+          <w:rFonts w:ascii="Arial" w:eastAsia="Arial" w:hAnsi="Arial" w:cs="Arial"/>
+          <w:sz w:val="15"/>
+        </w:rPr>
+        <w:t>}</w:t>
+      </w:r>
     </w:p>
     <w:p>
       <w:pPr>
         <w:pStyle w:val="Heading1"/>
-        <w:ind w:left="0" w:right="28" w:firstLine="0"/>
-        <w:jc w:val="left"/>
-        <w:sectPr>
-          <w:type w:val="continuous"/>
-          <w:pgSz w:w="11921" w:h="16860"/>
-          <w:pgMar w:top="567" w:right="1179" w:bottom="391" w:left="1179" w:header="720" w:footer="720" w:gutter="0"/>
-          <w:cols w:space="720"/>
-        </w:sectPr>
-      </w:pPr>
-    </w:p>
-    <w:p>
-      <w:pPr>
-        <w:pStyle w:val="Heading1"/>
-        <w:ind w:left="0" w:right="28" w:firstLine="0"/>
+        <w:ind w:right="28"/>
       </w:pPr>
       <w:r>
         <w:t>Proforma-A</w:t>
+      </w:r>
+      <w:r>
+        <w:rPr>
+          <w:color w:val="000000"/>
+        </w:rPr>
+        <w:t xml:space="preserve"> </w:t>
       </w:r>
     </w:p>
     <w:p>
@@ -1904,86 +2280,28 @@
     <w:p>
       <w:pPr>
         <w:spacing w:after="0"/>
+      </w:pPr>
+      <w:r>
         <w:rPr>
           <w:rFonts w:ascii="Arial" w:eastAsia="Arial" w:hAnsi="Arial" w:cs="Arial"/>
           <w:sz w:val="18"/>
         </w:rPr>
-      </w:pPr>
+        <w:t xml:space="preserve"> </w:t>
+      </w:r>
       <w:r>
         <w:rPr>
           <w:rFonts w:ascii="Arial" w:eastAsia="Arial" w:hAnsi="Arial" w:cs="Arial"/>
           <w:sz w:val="18"/>
         </w:rPr>
-        <w:t xml:space="preserve"> </w:t>
+        <w:t xml:space="preserve">                                                                                                                  </w:t>
       </w:r>
       <w:r>
         <w:rPr>
           <w:rFonts w:ascii="Arial" w:eastAsia="Arial" w:hAnsi="Arial" w:cs="Arial"/>
           <w:sz w:val="18"/>
         </w:rPr>
-        <w:t xml:space="preserve">                                                                                                                  </w:t>
-      </w:r>
-      <w:r>
-        <w:rPr>
-          <w:rFonts w:ascii="Arial" w:eastAsia="Arial" w:hAnsi="Arial" w:cs="Arial"/>
-          <w:sz w:val="18"/>
-        </w:rPr>
         <w:t>30.08.2025</w:t>
       </w:r>
-    </w:p>
-    <w:p>
-      <w:pPr>
-        <w:spacing w:after="0"/>
-        <w:rPr>
-          <w:rFonts w:ascii="Arial" w:eastAsia="Arial" w:hAnsi="Arial" w:cs="Arial"/>
-          <w:sz w:val="18"/>
-        </w:rPr>
-      </w:pPr>
-    </w:p>
-    <w:p>
-      <w:pPr>
-        <w:spacing w:after="0"/>
-        <w:rPr>
-          <w:rFonts w:ascii="Arial" w:eastAsia="Arial" w:hAnsi="Arial" w:cs="Arial"/>
-          <w:sz w:val="18"/>
-        </w:rPr>
-      </w:pPr>
-    </w:p>
-    <w:p>
-      <w:pPr>
-        <w:spacing w:after="0"/>
-        <w:rPr>
-          <w:rFonts w:ascii="Arial" w:eastAsia="Arial" w:hAnsi="Arial" w:cs="Arial"/>
-          <w:sz w:val="18"/>
-        </w:rPr>
-      </w:pPr>
-    </w:p>
-    <w:p>
-      <w:pPr>
-        <w:spacing w:after="0"/>
-        <w:rPr>
-          <w:rFonts w:ascii="Arial" w:eastAsia="Arial" w:hAnsi="Arial" w:cs="Arial"/>
-          <w:sz w:val="18"/>
-        </w:rPr>
-      </w:pPr>
-    </w:p>
-    <w:p>
-      <w:pPr>
-        <w:spacing w:after="0"/>
-        <w:rPr>
-          <w:rFonts w:ascii="Arial" w:eastAsia="Arial" w:hAnsi="Arial" w:cs="Arial"/>
-          <w:sz w:val="18"/>
-        </w:rPr>
-      </w:pPr>
-    </w:p>
-    <w:p>
-      <w:pPr>
-        <w:spacing w:line="278" w:lineRule="auto"/>
-        <w:rPr>
-          <w:rFonts w:ascii="Arial" w:eastAsia="Arial" w:hAnsi="Arial" w:cs="Arial"/>
-          <w:sz w:val="15"/>
-        </w:rPr>
-      </w:pPr>
     </w:p>
     <w:sectPr>
       <w:type w:val="continuous"/>

</xml_diff>